<commit_message>
Manuscript: replace abstract; reduce intro repetition; soften clean-room language; add lead sentences in 8.2.4 and 8.3
</commit_message>
<xml_diff>
--- a/reports/manuscript_outcome_blind_dq.docx
+++ b/reports/manuscript_outcome_blind_dq.docx
@@ -66,49 +66,67 @@
         <w:pStyle w:val="FirstParagraph"/>
       </w:pPr>
       <w:r>
-        <w:t xml:space="preserve">Real-world evidence studies must justify both the causal analysis</w:t>
-      </w:r>
-      <w:r>
-        <w:t xml:space="preserve"> </w:t>
-      </w:r>
-      <w:r>
-        <w:t xml:space="preserve">strategy and the fitness of the underlying data source for the</w:t>
-      </w:r>
-      <w:r>
-        <w:t xml:space="preserve"> </w:t>
-      </w:r>
-      <w:r>
-        <w:t xml:space="preserve">research question. In current practice these two arguments are</w:t>
-      </w:r>
-      <w:r>
-        <w:t xml:space="preserve"> </w:t>
-      </w:r>
-      <w:r>
-        <w:t xml:space="preserve">usually developed in parallel but reported separately: estimator</w:t>
-      </w:r>
-      <w:r>
-        <w:t xml:space="preserve"> </w:t>
-      </w:r>
-      <w:r>
-        <w:t xml:space="preserve">specification is supported with outcome-blind simulation, whereas</w:t>
-      </w:r>
-      <w:r>
-        <w:t xml:space="preserve"> </w:t>
-      </w:r>
-      <w:r>
-        <w:t xml:space="preserve">data fitness is documented qualitatively through target-trial</w:t>
-      </w:r>
-      <w:r>
-        <w:t xml:space="preserve"> </w:t>
-      </w:r>
-      <w:r>
-        <w:t xml:space="preserve">articulation, reporting templates such as TARGET and START-RWE,</w:t>
-      </w:r>
-      <w:r>
-        <w:t xml:space="preserve"> </w:t>
-      </w:r>
-      <w:r>
-        <w:t xml:space="preserve">and fit-for-purpose checklists such as SPIFD2 and HARPER.</w:t>
+        <w:t xml:space="preserve">Real-world evidence studies often require many analytic decisions</w:t>
+      </w:r>
+      <w:r>
+        <w:t xml:space="preserve"> </w:t>
+      </w:r>
+      <w:r>
+        <w:t xml:space="preserve">before an effect estimate is produced: how to define the study</w:t>
+      </w:r>
+      <w:r>
+        <w:t xml:space="preserve"> </w:t>
+      </w:r>
+      <w:r>
+        <w:t xml:space="preserve">population, how to handle limited overlap, which estimator to use,</w:t>
+      </w:r>
+      <w:r>
+        <w:t xml:space="preserve"> </w:t>
+      </w:r>
+      <w:r>
+        <w:t xml:space="preserve">and how to assess whether the data are reliable enough for the</w:t>
+      </w:r>
+      <w:r>
+        <w:t xml:space="preserve"> </w:t>
+      </w:r>
+      <w:r>
+        <w:t xml:space="preserve">question. In practice, these decisions are commonly documented in</w:t>
+      </w:r>
+      <w:r>
+        <w:t xml:space="preserve"> </w:t>
+      </w:r>
+      <w:r>
+        <w:t xml:space="preserve">separate places. The causal question and target-trial design may</w:t>
+      </w:r>
+      <w:r>
+        <w:t xml:space="preserve"> </w:t>
+      </w:r>
+      <w:r>
+        <w:t xml:space="preserve">be described in a protocol, data fitness may be assessed in a</w:t>
+      </w:r>
+      <w:r>
+        <w:t xml:space="preserve"> </w:t>
+      </w:r>
+      <w:r>
+        <w:t xml:space="preserve">checklist, and estimator choice may be justified in a statistical</w:t>
+      </w:r>
+      <w:r>
+        <w:t xml:space="preserve"> </w:t>
+      </w:r>
+      <w:r>
+        <w:t xml:space="preserve">analysis plan. This separation makes it difficult for reviewers to</w:t>
+      </w:r>
+      <w:r>
+        <w:t xml:space="preserve"> </w:t>
+      </w:r>
+      <w:r>
+        <w:t xml:space="preserve">see how design assumptions, data limitations, and estimation</w:t>
+      </w:r>
+      <w:r>
+        <w:t xml:space="preserve"> </w:t>
+      </w:r>
+      <w:r>
+        <w:t xml:space="preserve">choices are connected.</w:t>
       </w:r>
     </w:p>
     <w:p>
@@ -116,158 +134,79 @@
         <w:pStyle w:val="BodyText"/>
       </w:pPr>
       <w:r>
-        <w:t xml:space="preserve">We present</w:t>
-      </w:r>
-      <w:r>
-        <w:t xml:space="preserve"> </w:t>
-      </w:r>
-      <w:r>
-        <w:rPr>
-          <w:b/>
-          <w:bCs/>
-        </w:rPr>
-        <w:t xml:space="preserve">cleanTMLE</w:t>
-      </w:r>
-      <w:r>
-        <w:t xml:space="preserve">, an R package that provides a</w:t>
-      </w:r>
-      <w:r>
-        <w:t xml:space="preserve"> </w:t>
-      </w:r>
-      <w:r>
-        <w:t xml:space="preserve">prespecified quantitative stress test of estimator performance</w:t>
-      </w:r>
-      <w:r>
-        <w:t xml:space="preserve"> </w:t>
-      </w:r>
-      <w:r>
-        <w:t xml:space="preserve">under data-quality degradation scenarios derived from a prior</w:t>
-      </w:r>
-      <w:r>
-        <w:t xml:space="preserve"> </w:t>
-      </w:r>
-      <w:r>
-        <w:t xml:space="preserve">fit-for-purpose assessment, situated inside the causal roadmap.</w:t>
-      </w:r>
-      <w:r>
-        <w:t xml:space="preserve"> </w:t>
-      </w:r>
-      <w:r>
-        <w:t xml:space="preserve">The package does not itself determine whether a data source is</w:t>
-      </w:r>
-      <w:r>
-        <w:t xml:space="preserve"> </w:t>
-      </w:r>
-      <w:r>
-        <w:t xml:space="preserve">fit for purpose; that judgement remains a study-level activity</w:t>
-      </w:r>
-      <w:r>
-        <w:t xml:space="preserve"> </w:t>
-      </w:r>
-      <w:r>
-        <w:t xml:space="preserve">supported by target-trial protocols, validation studies, and</w:t>
-      </w:r>
-      <w:r>
-        <w:t xml:space="preserve"> </w:t>
-      </w:r>
-      <w:r>
-        <w:t xml:space="preserve">source-data review. Once investigators have specified plausible</w:t>
-      </w:r>
-      <w:r>
-        <w:t xml:space="preserve"> </w:t>
-      </w:r>
-      <w:r>
-        <w:t xml:space="preserve">data-quality threats and severity ranges from external evidence,</w:t>
-      </w:r>
-      <w:r>
-        <w:t xml:space="preserve"> </w:t>
-      </w:r>
-      <w:r>
-        <w:t xml:space="preserve">cleanTMLE records the prespecified analytic choices and audit</w:t>
-      </w:r>
-      <w:r>
-        <w:t xml:space="preserve"> </w:t>
-      </w:r>
-      <w:r>
-        <w:t xml:space="preserve">trail and extends the standard outcome-blind plasmode</w:t>
-      </w:r>
-      <w:r>
-        <w:t xml:space="preserve"> </w:t>
-      </w:r>
-      <w:r>
-        <w:t xml:space="preserve">estimator-selection loop with a pre-outcome stress test that</w:t>
-      </w:r>
-      <w:r>
-        <w:t xml:space="preserve"> </w:t>
-      </w:r>
-      <w:r>
-        <w:t xml:space="preserve">evaluates candidate estimators under those user-specified threats</w:t>
-      </w:r>
-      <w:r>
-        <w:t xml:space="preserve"> </w:t>
-      </w:r>
-      <w:r>
-        <w:t xml:space="preserve">(covariate missingness, exposure misclassification, outcome</w:t>
-      </w:r>
-      <w:r>
-        <w:t xml:space="preserve"> </w:t>
-      </w:r>
-      <w:r>
-        <w:t xml:space="preserve">misclassification, and unmeasured confounding). We illustrate the</w:t>
-      </w:r>
-      <w:r>
-        <w:t xml:space="preserve"> </w:t>
-      </w:r>
-      <w:r>
-        <w:t xml:space="preserve">workflow in a Monte Carlo simulation and in a trauma-registry case</w:t>
-      </w:r>
-      <w:r>
-        <w:t xml:space="preserve"> </w:t>
-      </w:r>
-      <w:r>
-        <w:t xml:space="preserve">study (n = 1,693 ambulance patients, 24.6 % outcome missingness)</w:t>
-      </w:r>
-      <w:r>
-        <w:t xml:space="preserve"> </w:t>
-      </w:r>
-      <w:r>
-        <w:t xml:space="preserve">where six estimators implemented in cleanTMLE following the</w:t>
-      </w:r>
-      <w:r>
-        <w:t xml:space="preserve"> </w:t>
-      </w:r>
-      <w:r>
-        <w:t xml:space="preserve">staged-analysis vignette agree on direction (risk difference 0.026</w:t>
-      </w:r>
-      <w:r>
-        <w:t xml:space="preserve"> </w:t>
-      </w:r>
-      <w:r>
-        <w:t xml:space="preserve">to 0.037 in favour of Rescue.Co transport, with the prespecified</w:t>
-      </w:r>
-      <w:r>
-        <w:t xml:space="preserve"> </w:t>
-      </w:r>
-      <w:r>
-        <w:t xml:space="preserve">primary full-cohort TMLE interval just crossing zero). The case</w:t>
-      </w:r>
-      <w:r>
-        <w:t xml:space="preserve"> </w:t>
-      </w:r>
-      <w:r>
-        <w:t xml:space="preserve">study is presented as a workflow demonstration on a real registry</w:t>
-      </w:r>
-      <w:r>
-        <w:t xml:space="preserve"> </w:t>
-      </w:r>
-      <w:r>
-        <w:t xml:space="preserve">rather than as evidence that the framework establishes causal</w:t>
-      </w:r>
-      <w:r>
-        <w:t xml:space="preserve"> </w:t>
-      </w:r>
-      <w:r>
-        <w:t xml:space="preserve">validity.</w:t>
+        <w:t xml:space="preserve">We present cleanTMLE, an R package that operationalises a staged,</w:t>
+      </w:r>
+      <w:r>
+        <w:t xml:space="preserve"> </w:t>
+      </w:r>
+      <w:r>
+        <w:t xml:space="preserve">outcome-blind targeted-learning workflow for binary point-treatment</w:t>
+      </w:r>
+      <w:r>
+        <w:t xml:space="preserve"> </w:t>
+      </w:r>
+      <w:r>
+        <w:t xml:space="preserve">studies. The package is situated inside the causal roadmap:</w:t>
+      </w:r>
+      <w:r>
+        <w:t xml:space="preserve"> </w:t>
+      </w:r>
+      <w:r>
+        <w:t xml:space="preserve">investigators first define the causal question, observed data,</w:t>
+      </w:r>
+      <w:r>
+        <w:t xml:space="preserve"> </w:t>
+      </w:r>
+      <w:r>
+        <w:t xml:space="preserve">identification assumptions, statistical estimand, and candidate</w:t>
+      </w:r>
+      <w:r>
+        <w:t xml:space="preserve"> </w:t>
+      </w:r>
+      <w:r>
+        <w:t xml:space="preserve">estimators, then use outcome-blind simulations to compare candidate</w:t>
+      </w:r>
+      <w:r>
+        <w:t xml:space="preserve"> </w:t>
+      </w:r>
+      <w:r>
+        <w:t xml:space="preserve">estimators before examining the observed treatment-outcome</w:t>
+      </w:r>
+      <w:r>
+        <w:t xml:space="preserve"> </w:t>
+      </w:r>
+      <w:r>
+        <w:t xml:space="preserve">association. cleanTMLE extends this workflow with a plasmode</w:t>
+      </w:r>
+      <w:r>
+        <w:t xml:space="preserve"> </w:t>
+      </w:r>
+      <w:r>
+        <w:t xml:space="preserve">data-quality stress test. Using the empirical covariate and</w:t>
+      </w:r>
+      <w:r>
+        <w:t xml:space="preserve"> </w:t>
+      </w:r>
+      <w:r>
+        <w:t xml:space="preserve">treatment structure, the package generates synthetic outcomes and</w:t>
+      </w:r>
+      <w:r>
+        <w:t xml:space="preserve"> </w:t>
+      </w:r>
+      <w:r>
+        <w:t xml:space="preserve">evaluates candidate estimators under prespecified threats,</w:t>
+      </w:r>
+      <w:r>
+        <w:t xml:space="preserve"> </w:t>
+      </w:r>
+      <w:r>
+        <w:t xml:space="preserve">including covariate missingness, exposure misclassification,</w:t>
+      </w:r>
+      <w:r>
+        <w:t xml:space="preserve"> </w:t>
+      </w:r>
+      <w:r>
+        <w:t xml:space="preserve">outcome misclassification, and unmeasured confounding.</w:t>
       </w:r>
     </w:p>
     <w:p>
@@ -275,88 +214,129 @@
         <w:pStyle w:val="BodyText"/>
       </w:pPr>
       <w:r>
-        <w:t xml:space="preserve">The contribution is operational rather than foundational. The</w:t>
-      </w:r>
-      <w:r>
-        <w:t xml:space="preserve"> </w:t>
-      </w:r>
-      <w:r>
-        <w:t xml:space="preserve">package provides reproducible analysis records and</w:t>
-      </w:r>
-      <w:r>
-        <w:t xml:space="preserve"> </w:t>
-      </w:r>
-      <w:r>
-        <w:t xml:space="preserve">candidate-specific robustness screening before the study outcome</w:t>
-      </w:r>
-      <w:r>
-        <w:t xml:space="preserve"> </w:t>
-      </w:r>
-      <w:r>
-        <w:t xml:space="preserve">is unblinded. It does not replace target-trial design,</w:t>
-      </w:r>
-      <w:r>
-        <w:t xml:space="preserve"> </w:t>
-      </w:r>
-      <w:r>
-        <w:t xml:space="preserve">variable-validation studies, source-data relevance and reliability</w:t>
-      </w:r>
-      <w:r>
-        <w:t xml:space="preserve"> </w:t>
-      </w:r>
-      <w:r>
-        <w:t xml:space="preserve">review, independent oversight, or post-unblinding sensitivity</w:t>
-      </w:r>
-      <w:r>
-        <w:t xml:space="preserve"> </w:t>
-      </w:r>
-      <w:r>
-        <w:t xml:space="preserve">analyses; the explicit list and corresponding regulatory anchors</w:t>
-      </w:r>
-      <w:r>
-        <w:t xml:space="preserve"> </w:t>
-      </w:r>
-      <w:r>
-        <w:t xml:space="preserve">appear in the regulatory-alignment table and in the discussion.</w:t>
-      </w:r>
-      <w:r>
-        <w:t xml:space="preserve"> </w:t>
-      </w:r>
-      <w:r>
-        <w:t xml:space="preserve">The IPW, g-computation, and AIPW cumulative-risk estimators</w:t>
-      </w:r>
-      <w:r>
-        <w:t xml:space="preserve"> </w:t>
-      </w:r>
-      <w:r>
-        <w:t xml:space="preserve">provided by the proprietary</w:t>
-      </w:r>
-      <w:r>
-        <w:t xml:space="preserve"> </w:t>
-      </w:r>
-      <w:r>
-        <w:rPr>
-          <w:rStyle w:val="VerbatimChar"/>
-        </w:rPr>
-        <w:t xml:space="preserve">causalRisk</w:t>
-      </w:r>
-      <w:r>
-        <w:t xml:space="preserve"> </w:t>
-      </w:r>
-      <w:r>
-        <w:t xml:space="preserve">package are an</w:t>
-      </w:r>
-      <w:r>
-        <w:t xml:space="preserve"> </w:t>
-      </w:r>
-      <w:r>
-        <w:t xml:space="preserve">alternative implementation of related ideas, with which cleanTMLE</w:t>
-      </w:r>
-      <w:r>
-        <w:t xml:space="preserve"> </w:t>
-      </w:r>
-      <w:r>
-        <w:t xml:space="preserve">shares conceptual structure but does not share code.</w:t>
+        <w:t xml:space="preserve">In Monte Carlo experiments, adjusted estimators recovered the true</w:t>
+      </w:r>
+      <w:r>
+        <w:t xml:space="preserve"> </w:t>
+      </w:r>
+      <w:r>
+        <w:t xml:space="preserve">risk difference under good overlap, and TMLE and cross-validated</w:t>
+      </w:r>
+      <w:r>
+        <w:t xml:space="preserve"> </w:t>
+      </w:r>
+      <w:r>
+        <w:t xml:space="preserve">TMLE remained approximately unbiased under marginal overlap. When</w:t>
+      </w:r>
+      <w:r>
+        <w:t xml:space="preserve"> </w:t>
+      </w:r>
+      <w:r>
+        <w:t xml:space="preserve">unmeasured confounding was introduced, all estimators were biased</w:t>
+      </w:r>
+      <w:r>
+        <w:t xml:space="preserve"> </w:t>
+      </w:r>
+      <w:r>
+        <w:t xml:space="preserve">in the same direction, and the prespecified pre-outcome decision</w:t>
+      </w:r>
+      <w:r>
+        <w:t xml:space="preserve"> </w:t>
+      </w:r>
+      <w:r>
+        <w:t xml:space="preserve">correctly returned STOP, illustrating that the workflow can</w:t>
+      </w:r>
+      <w:r>
+        <w:t xml:space="preserve"> </w:t>
+      </w:r>
+      <w:r>
+        <w:t xml:space="preserve">identify settings where the available data do not support the</w:t>
+      </w:r>
+      <w:r>
+        <w:t xml:space="preserve"> </w:t>
+      </w:r>
+      <w:r>
+        <w:t xml:space="preserve">causal estimand. The data-quality stress test further showed that</w:t>
+      </w:r>
+      <w:r>
+        <w:t xml:space="preserve"> </w:t>
+      </w:r>
+      <w:r>
+        <w:t xml:space="preserve">outcome misclassification and unmeasured confounding produced the</w:t>
+      </w:r>
+      <w:r>
+        <w:t xml:space="preserve"> </w:t>
+      </w:r>
+      <w:r>
+        <w:t xml:space="preserve">largest degradation in estimator performance.</w:t>
+      </w:r>
+    </w:p>
+    <w:p>
+      <w:pPr>
+        <w:pStyle w:val="BodyText"/>
+      </w:pPr>
+      <w:r>
+        <w:t xml:space="preserve">We also demonstrate the workflow in the Rescue.Co Kenya Trauma</w:t>
+      </w:r>
+      <w:r>
+        <w:t xml:space="preserve"> </w:t>
+      </w:r>
+      <w:r>
+        <w:t xml:space="preserve">Registry (n = 1,693; 24.6 % outcome missingness). Six estimators</w:t>
+      </w:r>
+      <w:r>
+        <w:t xml:space="preserve"> </w:t>
+      </w:r>
+      <w:r>
+        <w:t xml:space="preserve">agreed on direction, with risk differences from 0.026 to 0.037 in</w:t>
+      </w:r>
+      <w:r>
+        <w:t xml:space="preserve"> </w:t>
+      </w:r>
+      <w:r>
+        <w:t xml:space="preserve">favour of Rescue.Co transport, while the prespecified primary TMLE</w:t>
+      </w:r>
+      <w:r>
+        <w:t xml:space="preserve"> </w:t>
+      </w:r>
+      <w:r>
+        <w:t xml:space="preserve">interval crossed zero. This case study is a workflow demonstration,</w:t>
+      </w:r>
+      <w:r>
+        <w:t xml:space="preserve"> </w:t>
+      </w:r>
+      <w:r>
+        <w:t xml:space="preserve">not a causal claim. cleanTMLE does not replace target-trial design,</w:t>
+      </w:r>
+      <w:r>
+        <w:t xml:space="preserve"> </w:t>
+      </w:r>
+      <w:r>
+        <w:t xml:space="preserve">fit-for-purpose data review, validation studies, independent</w:t>
+      </w:r>
+      <w:r>
+        <w:t xml:space="preserve"> </w:t>
+      </w:r>
+      <w:r>
+        <w:t xml:space="preserve">governance, or post-outcome sensitivity analyses. Its contribution</w:t>
+      </w:r>
+      <w:r>
+        <w:t xml:space="preserve"> </w:t>
+      </w:r>
+      <w:r>
+        <w:t xml:space="preserve">is narrower: it turns prespecified targeted-learning decisions,</w:t>
+      </w:r>
+      <w:r>
+        <w:t xml:space="preserve"> </w:t>
+      </w:r>
+      <w:r>
+        <w:t xml:space="preserve">outcome-blind estimator selection, and data-quality stress testing</w:t>
+      </w:r>
+      <w:r>
+        <w:t xml:space="preserve"> </w:t>
+      </w:r>
+      <w:r>
+        <w:t xml:space="preserve">into reproducible, auditable software artifacts.</w:t>
       </w:r>
     </w:p>
     <w:p>
@@ -826,7 +806,7 @@
         <w:pStyle w:val="BodyText"/>
       </w:pPr>
       <w:r>
-        <w:t xml:space="preserve">Throughout, we use</w:t>
+        <w:t xml:space="preserve">We use</w:t>
       </w:r>
       <w:r>
         <w:t xml:space="preserve"> </w:t>
@@ -838,61 +818,73 @@
         <w:t xml:space="preserve"> </w:t>
       </w:r>
       <w:r>
-        <w:t xml:space="preserve">in a restricted</w:t>
-      </w:r>
-      <w:r>
-        <w:t xml:space="preserve"> </w:t>
-      </w:r>
-      <w:r>
-        <w:t xml:space="preserve">sense. The procedure does not assess data provenance, phenotype</w:t>
-      </w:r>
-      <w:r>
-        <w:t xml:space="preserve"> </w:t>
-      </w:r>
-      <w:r>
-        <w:t xml:space="preserve">validity, linkage accuracy, representativeness, or regulatory</w:t>
-      </w:r>
-      <w:r>
-        <w:t xml:space="preserve"> </w:t>
-      </w:r>
-      <w:r>
-        <w:t xml:space="preserve">acceptability directly; those remain study-level and</w:t>
-      </w:r>
-      <w:r>
-        <w:t xml:space="preserve"> </w:t>
-      </w:r>
-      <w:r>
-        <w:t xml:space="preserve">data-source-level evaluations. The role of cleanTMLE is narrower:</w:t>
-      </w:r>
-      <w:r>
-        <w:t xml:space="preserve"> </w:t>
-      </w:r>
-      <w:r>
-        <w:t xml:space="preserve">once investigators have specified plausible data-quality threats</w:t>
-      </w:r>
-      <w:r>
-        <w:t xml:space="preserve"> </w:t>
-      </w:r>
-      <w:r>
-        <w:t xml:space="preserve">and severity ranges from external validation studies, data</w:t>
-      </w:r>
-      <w:r>
-        <w:t xml:space="preserve"> </w:t>
-      </w:r>
-      <w:r>
-        <w:t xml:space="preserve">profiling, or expert elicitation, the package evaluates how</w:t>
-      </w:r>
-      <w:r>
-        <w:t xml:space="preserve"> </w:t>
-      </w:r>
-      <w:r>
-        <w:t xml:space="preserve">candidate estimators behave under those prespecified perturbations</w:t>
-      </w:r>
-      <w:r>
-        <w:t xml:space="preserve"> </w:t>
-      </w:r>
-      <w:r>
-        <w:t xml:space="preserve">before the observed treatment-outcome association is examined.</w:t>
+        <w:t xml:space="preserve">in a restricted sense: the</w:t>
+      </w:r>
+      <w:r>
+        <w:t xml:space="preserve"> </w:t>
+      </w:r>
+      <w:r>
+        <w:t xml:space="preserve">procedure does not assess data provenance, phenotype validity,</w:t>
+      </w:r>
+      <w:r>
+        <w:t xml:space="preserve"> </w:t>
+      </w:r>
+      <w:r>
+        <w:t xml:space="preserve">linkage accuracy, representativeness, or regulatory acceptability,</w:t>
+      </w:r>
+      <w:r>
+        <w:t xml:space="preserve"> </w:t>
+      </w:r>
+      <w:r>
+        <w:t xml:space="preserve">which remain study-level evaluations. Once investigators have</w:t>
+      </w:r>
+      <w:r>
+        <w:t xml:space="preserve"> </w:t>
+      </w:r>
+      <w:r>
+        <w:t xml:space="preserve">specified plausible threats and severity ranges from external</w:t>
+      </w:r>
+      <w:r>
+        <w:t xml:space="preserve"> </w:t>
+      </w:r>
+      <w:r>
+        <w:t xml:space="preserve">validation studies, data profiling, or expert elicitation, the</w:t>
+      </w:r>
+      <w:r>
+        <w:t xml:space="preserve"> </w:t>
+      </w:r>
+      <w:r>
+        <w:t xml:space="preserve">package evaluates how candidate estimators behave under those</w:t>
+      </w:r>
+      <w:r>
+        <w:t xml:space="preserve"> </w:t>
+      </w:r>
+      <w:r>
+        <w:t xml:space="preserve">prespecified perturbations before the observed treatment-outcome</w:t>
+      </w:r>
+      <w:r>
+        <w:t xml:space="preserve"> </w:t>
+      </w:r>
+      <w:r>
+        <w:t xml:space="preserve">association is examined. This is the strongest claim we make for</w:t>
+      </w:r>
+      <w:r>
+        <w:t xml:space="preserve"> </w:t>
+      </w:r>
+      <w:r>
+        <w:t xml:space="preserve">cleanTMLE: it links candidate-estimator selection and</w:t>
+      </w:r>
+      <w:r>
+        <w:t xml:space="preserve"> </w:t>
+      </w:r>
+      <w:r>
+        <w:t xml:space="preserve">fit-for-purpose concerns on a single quantitative scale before</w:t>
+      </w:r>
+      <w:r>
+        <w:t xml:space="preserve"> </w:t>
+      </w:r>
+      <w:r>
+        <w:t xml:space="preserve">outcome access.</w:t>
       </w:r>
     </w:p>
     <w:p>
@@ -994,20 +986,7 @@
         <w:pStyle w:val="FirstParagraph"/>
       </w:pPr>
       <w:r>
-        <w:t xml:space="preserve">This paper introduces</w:t>
-      </w:r>
-      <w:r>
-        <w:t xml:space="preserve"> </w:t>
-      </w:r>
-      <w:r>
-        <w:rPr>
-          <w:b/>
-          <w:bCs/>
-        </w:rPr>
-        <w:t xml:space="preserve">cleanTMLE</w:t>
-      </w:r>
-      <w:r>
-        <w:t xml:space="preserve">, an R</w:t>
+        <w:t xml:space="preserve">cleanTMLE is an R</w:t>
       </w:r>
       <w:r>
         <w:t xml:space="preserve"> </w:t>
@@ -1019,19 +998,19 @@
         <w:t xml:space="preserve"> </w:t>
       </w:r>
       <w:r>
-        <w:t xml:space="preserve">package</w:t>
-      </w:r>
-      <w:r>
-        <w:t xml:space="preserve"> </w:t>
-      </w:r>
-      <w:r>
-        <w:t xml:space="preserve">that records prespecified analytic decisions and supports the</w:t>
-      </w:r>
-      <w:r>
-        <w:t xml:space="preserve"> </w:t>
-      </w:r>
-      <w:r>
-        <w:t xml:space="preserve">estimator-selection and stress-testing steps of the causal roadmap</w:t>
+        <w:t xml:space="preserve">package that operationalises an</w:t>
+      </w:r>
+      <w:r>
+        <w:t xml:space="preserve"> </w:t>
+      </w:r>
+      <w:r>
+        <w:t xml:space="preserve">outcome-blind staged workflow for the estimator-selection and</w:t>
+      </w:r>
+      <w:r>
+        <w:t xml:space="preserve"> </w:t>
+      </w:r>
+      <w:r>
+        <w:t xml:space="preserve">stress-testing steps of the causal roadmap</w:t>
       </w:r>
       <w:r>
         <w:t xml:space="preserve"> </w:t>
@@ -1040,13 +1019,64 @@
         <w:t xml:space="preserve">(Dang et al. 2023; Petersen and Laan 2014; Gruber, Lee, et al. 2024)</w:t>
       </w:r>
       <w:r>
-        <w:t xml:space="preserve">. cleanTMLE</w:t>
-      </w:r>
-      <w:r>
-        <w:t xml:space="preserve"> </w:t>
-      </w:r>
-      <w:r>
-        <w:t xml:space="preserve">provides an analysis-lock object, a serialisable audit trail and</w:t>
+        <w:t xml:space="preserve">. Targeted maximum likelihood</w:t>
+      </w:r>
+      <w:r>
+        <w:t xml:space="preserve"> </w:t>
+      </w:r>
+      <w:r>
+        <w:t xml:space="preserve">estimation (TMLE)</w:t>
+      </w:r>
+      <w:r>
+        <w:t xml:space="preserve"> </w:t>
+      </w:r>
+      <w:r>
+        <w:t xml:space="preserve">(Laan and Rubin 2006; Laan and Rose 2011; Schuler and Rose 2017; Zheng and Laan 2011; Chernozhukov et al. 2018)</w:t>
+      </w:r>
+      <w:r>
+        <w:t xml:space="preserve"> </w:t>
+      </w:r>
+      <w:r>
+        <w:t xml:space="preserve">is the natural setting because every analytic decision (the</w:t>
+      </w:r>
+      <w:r>
+        <w:t xml:space="preserve"> </w:t>
+      </w:r>
+      <w:r>
+        <w:t xml:space="preserve">SuperLearner library</w:t>
+      </w:r>
+      <w:r>
+        <w:t xml:space="preserve"> </w:t>
+      </w:r>
+      <w:r>
+        <w:t xml:space="preserve">(Laan, Polley, and Hubbard 2007; Phillips et al. 2023)</w:t>
+      </w:r>
+      <w:r>
+        <w:t xml:space="preserve">, the</w:t>
+      </w:r>
+      <w:r>
+        <w:t xml:space="preserve"> </w:t>
+      </w:r>
+      <w:r>
+        <w:t xml:space="preserve">truncation rule, the prespecified set of candidate estimators) can</w:t>
+      </w:r>
+      <w:r>
+        <w:t xml:space="preserve"> </w:t>
+      </w:r>
+      <w:r>
+        <w:t xml:space="preserve">be listed in advance, and the algorithm remains data-adaptive while</w:t>
+      </w:r>
+      <w:r>
+        <w:t xml:space="preserve"> </w:t>
+      </w:r>
+      <w:r>
+        <w:t xml:space="preserve">still admitting valid Wald-type confidence intervals. The package</w:t>
+      </w:r>
+      <w:r>
+        <w:t xml:space="preserve"> </w:t>
+      </w:r>
+      <w:r>
+        <w:t xml:space="preserve">adds an analysis-lock object, a serialisable audit trail and</w:t>
       </w:r>
       <w:r>
         <w:t xml:space="preserve"> </w:t>
@@ -1079,52 +1109,7 @@
         <w:t xml:space="preserve"> </w:t>
       </w:r>
       <w:r>
-        <w:t xml:space="preserve">described above. Targeted Maximum Likelihood Estimation (TMLE)</w:t>
-      </w:r>
-      <w:r>
-        <w:t xml:space="preserve"> </w:t>
-      </w:r>
-      <w:r>
-        <w:t xml:space="preserve">(Laan and Rubin 2006; Laan and Rose 2011; Schuler and Rose 2017; Zheng and Laan 2011; Chernozhukov et al. 2018)</w:t>
-      </w:r>
-      <w:r>
-        <w:t xml:space="preserve"> </w:t>
-      </w:r>
-      <w:r>
-        <w:t xml:space="preserve">is the natural</w:t>
-      </w:r>
-      <w:r>
-        <w:t xml:space="preserve"> </w:t>
-      </w:r>
-      <w:r>
-        <w:t xml:space="preserve">setting because every analytic decision (the SuperLearner library</w:t>
-      </w:r>
-      <w:r>
-        <w:t xml:space="preserve"> </w:t>
-      </w:r>
-      <w:r>
-        <w:t xml:space="preserve">(Laan, Polley, and Hubbard 2007; Phillips et al. 2023)</w:t>
-      </w:r>
-      <w:r>
-        <w:t xml:space="preserve">, the truncation rule, the</w:t>
-      </w:r>
-      <w:r>
-        <w:t xml:space="preserve"> </w:t>
-      </w:r>
-      <w:r>
-        <w:t xml:space="preserve">prespecified set of candidate estimators) can be listed in advance,</w:t>
-      </w:r>
-      <w:r>
-        <w:t xml:space="preserve"> </w:t>
-      </w:r>
-      <w:r>
-        <w:t xml:space="preserve">and the algorithm remains data-adaptive while still admitting valid</w:t>
-      </w:r>
-      <w:r>
-        <w:t xml:space="preserve"> </w:t>
-      </w:r>
-      <w:r>
-        <w:t xml:space="preserve">Wald-type confidence intervals.</w:t>
+        <w:t xml:space="preserve">described above.</w:t>
       </w:r>
     </w:p>
     <w:p>
@@ -1132,118 +1117,34 @@
         <w:pStyle w:val="BodyText"/>
       </w:pPr>
       <w:r>
-        <w:t xml:space="preserve">The contribution is operational. The software-mediated outcome</w:t>
-      </w:r>
-      <w:r>
-        <w:t xml:space="preserve"> </w:t>
-      </w:r>
-      <w:r>
-        <w:t xml:space="preserve">guard is, as</w:t>
-      </w:r>
-      <w:r>
-        <w:t xml:space="preserve"> </w:t>
-      </w:r>
-      <w:r>
-        <w:t xml:space="preserve">Muntner et al. (2024)</w:t>
-      </w:r>
-      <w:r>
-        <w:t xml:space="preserve"> </w:t>
-      </w:r>
-      <w:r>
-        <w:t xml:space="preserve">put it, an implementation pattern</w:t>
-      </w:r>
-      <w:r>
-        <w:t xml:space="preserve"> </w:t>
-      </w:r>
-      <w:r>
-        <w:t xml:space="preserve">rather than a methodological novelty. Its advantage is</w:t>
-      </w:r>
-      <w:r>
-        <w:t xml:space="preserve"> </w:t>
-      </w:r>
-      <w:r>
-        <w:t xml:space="preserve">transparency: the analysis lock, audit trail, and decision log</w:t>
-      </w:r>
-      <w:r>
-        <w:t xml:space="preserve"> </w:t>
-      </w:r>
-      <w:r>
-        <w:t xml:space="preserve">turn paper-only prespecification checklists into a structured</w:t>
-      </w:r>
-      <w:r>
-        <w:t xml:space="preserve"> </w:t>
-      </w:r>
-      <w:r>
-        <w:t xml:space="preserve">record of analytic decisions, supporting reproducible</w:t>
-      </w:r>
-      <w:r>
-        <w:t xml:space="preserve"> </w:t>
-      </w:r>
-      <w:r>
-        <w:t xml:space="preserve">reconstruction by an external reviewer. cleanTMLE</w:t>
-      </w:r>
-      <w:r>
-        <w:t xml:space="preserve"> </w:t>
-      </w:r>
-      <w:r>
-        <w:t xml:space="preserve">provides a prespecified quantitative stress test of estimator</w:t>
-      </w:r>
-      <w:r>
-        <w:t xml:space="preserve"> </w:t>
-      </w:r>
-      <w:r>
-        <w:t xml:space="preserve">performance under data-quality degradation scenarios derived from</w:t>
-      </w:r>
-      <w:r>
-        <w:t xml:space="preserve"> </w:t>
-      </w:r>
-      <w:r>
-        <w:t xml:space="preserve">a prior fit-for-purpose assessment; it does not itself determine</w:t>
-      </w:r>
-      <w:r>
-        <w:t xml:space="preserve"> </w:t>
-      </w:r>
-      <w:r>
-        <w:t xml:space="preserve">whether the data source is fit for purpose. Section</w:t>
-      </w:r>
-      <w:r>
-        <w:t xml:space="preserve"> </w:t>
-      </w:r>
-      <w:r>
-        <w:t xml:space="preserve">§</w:t>
-      </w:r>
-      <w:r>
-        <w:t xml:space="preserve"> </w:t>
-      </w:r>
-      <w:r>
-        <w:t xml:space="preserve">situates that contribution inside the causal</w:t>
-      </w:r>
-      <w:r>
-        <w:t xml:space="preserve"> </w:t>
-      </w:r>
-      <w:r>
-        <w:t xml:space="preserve">roadmap and Table</w:t>
-      </w:r>
-      <w:r>
-        <w:t xml:space="preserve"> </w:t>
-      </w:r>
-      <w:r>
-        <w:t xml:space="preserve"> </w:t>
-      </w:r>
-      <w:r>
-        <w:t xml:space="preserve">maps each component to the</w:t>
-      </w:r>
-      <w:r>
-        <w:t xml:space="preserve"> </w:t>
-      </w:r>
-      <w:r>
-        <w:t xml:space="preserve">corresponding FDA, EMA, and ICH expectation; we defer the explicit</w:t>
-      </w:r>
-      <w:r>
-        <w:t xml:space="preserve"> </w:t>
-      </w:r>
-      <w:r>
-        <w:t xml:space="preserve">list of activities the package does</w:t>
+        <w:t xml:space="preserve">The contribution is operational rather than methodological</w:t>
+      </w:r>
+      <w:r>
+        <w:t xml:space="preserve"> </w:t>
+      </w:r>
+      <w:r>
+        <w:t xml:space="preserve">(Muntner et al. 2024)</w:t>
+      </w:r>
+      <w:r>
+        <w:t xml:space="preserve">. The analysis lock, audit trail, and</w:t>
+      </w:r>
+      <w:r>
+        <w:t xml:space="preserve"> </w:t>
+      </w:r>
+      <w:r>
+        <w:t xml:space="preserve">decision log turn paper-only prespecification checklists into a</w:t>
+      </w:r>
+      <w:r>
+        <w:t xml:space="preserve"> </w:t>
+      </w:r>
+      <w:r>
+        <w:t xml:space="preserve">structured record of analytic decisions that an external reviewer</w:t>
+      </w:r>
+      <w:r>
+        <w:t xml:space="preserve"> </w:t>
+      </w:r>
+      <w:r>
+        <w:t xml:space="preserve">can reconstruct. We use</w:t>
       </w:r>
       <w:r>
         <w:t xml:space="preserve"> </w:t>
@@ -1253,27 +1154,19 @@
           <w:i/>
           <w:iCs/>
         </w:rPr>
-        <w:t xml:space="preserve">not</w:t>
-      </w:r>
-      <w:r>
-        <w:t xml:space="preserve"> </w:t>
-      </w:r>
-      <w:r>
-        <w:t xml:space="preserve">replace to those</w:t>
-      </w:r>
-      <w:r>
-        <w:t xml:space="preserve"> </w:t>
-      </w:r>
-      <w:r>
-        <w:t xml:space="preserve">locations and to the discussion.</w:t>
-      </w:r>
-    </w:p>
-    <w:p>
-      <w:pPr>
-        <w:pStyle w:val="BodyText"/>
-      </w:pPr>
-      <w:r>
-        <w:t xml:space="preserve">Throughout, we use</w:t>
+        <w:t xml:space="preserve">outcome-blind staged workflow</w:t>
+      </w:r>
+      <w:r>
+        <w:t xml:space="preserve"> </w:t>
+      </w:r>
+      <w:r>
+        <w:t xml:space="preserve">throughout</w:t>
+      </w:r>
+      <w:r>
+        <w:t xml:space="preserve"> </w:t>
+      </w:r>
+      <w:r>
+        <w:t xml:space="preserve">to describe this arrangement. The</w:t>
       </w:r>
       <w:r>
         <w:t xml:space="preserve"> </w:t>
@@ -1285,85 +1178,76 @@
         <w:t xml:space="preserve"> </w:t>
       </w:r>
       <w:r>
-        <w:t xml:space="preserve">interchangeably with</w:t>
-      </w:r>
-      <w:r>
-        <w:t xml:space="preserve"> </w:t>
-      </w:r>
-      <w:r>
-        <w:t xml:space="preserve">“outcome-blind”</w:t>
-      </w:r>
-      <w:r>
-        <w:t xml:space="preserve"> </w:t>
-      </w:r>
-      <w:r>
-        <w:t xml:space="preserve">when discussing software, because the workflow prevents</w:t>
-      </w:r>
-      <w:r>
-        <w:t xml:space="preserve"> </w:t>
-      </w:r>
-      <w:r>
-        <w:t xml:space="preserve">outcome-analysis functions from proceeding until the prespecified</w:t>
-      </w:r>
-      <w:r>
-        <w:t xml:space="preserve"> </w:t>
-      </w:r>
-      <w:r>
-        <w:t xml:space="preserve">review process has been completed, much as a manufacturing clean</w:t>
-      </w:r>
-      <w:r>
-        <w:t xml:space="preserve"> </w:t>
-      </w:r>
-      <w:r>
-        <w:t xml:space="preserve">room blocks access to a sterile area until protocols have been</w:t>
-      </w:r>
-      <w:r>
-        <w:t xml:space="preserve"> </w:t>
-      </w:r>
-      <w:r>
-        <w:t xml:space="preserve">followed. The software-mediated workflow partially substitutes for</w:t>
-      </w:r>
-      <w:r>
-        <w:t xml:space="preserve"> </w:t>
-      </w:r>
-      <w:r>
-        <w:t xml:space="preserve">personnel-based outcome separation by restricting access to the</w:t>
-      </w:r>
-      <w:r>
-        <w:t xml:space="preserve"> </w:t>
-      </w:r>
-      <w:r>
-        <w:t xml:space="preserve">observed outcome until prespecified review steps have been</w:t>
-      </w:r>
-      <w:r>
-        <w:t xml:space="preserve"> </w:t>
-      </w:r>
-      <w:r>
-        <w:t xml:space="preserve">completed; it complements, but does not replace, personnel-based</w:t>
-      </w:r>
-      <w:r>
-        <w:t xml:space="preserve"> </w:t>
-      </w:r>
-      <w:r>
-        <w:t xml:space="preserve">access controls and independent governance. Protocol review, role</w:t>
-      </w:r>
-      <w:r>
-        <w:t xml:space="preserve"> </w:t>
-      </w:r>
-      <w:r>
-        <w:t xml:space="preserve">separation, source-data audit, and independent checkpoint review</w:t>
-      </w:r>
-      <w:r>
-        <w:t xml:space="preserve"> </w:t>
-      </w:r>
-      <w:r>
-        <w:t xml:space="preserve">remain the broader institutional process inside which the software</w:t>
-      </w:r>
-      <w:r>
-        <w:t xml:space="preserve"> </w:t>
-      </w:r>
-      <w:r>
-        <w:t xml:space="preserve">arrangement sits.</w:t>
+        <w:t xml:space="preserve">label is sometimes</w:t>
+      </w:r>
+      <w:r>
+        <w:t xml:space="preserve"> </w:t>
+      </w:r>
+      <w:r>
+        <w:t xml:space="preserve">used as a governance analogy, by analogy with a manufacturing</w:t>
+      </w:r>
+      <w:r>
+        <w:t xml:space="preserve"> </w:t>
+      </w:r>
+      <w:r>
+        <w:t xml:space="preserve">clean room that blocks access to a sterile area until protocols</w:t>
+      </w:r>
+      <w:r>
+        <w:t xml:space="preserve"> </w:t>
+      </w:r>
+      <w:r>
+        <w:t xml:space="preserve">have been followed, but the substantive content is the staged</w:t>
+      </w:r>
+      <w:r>
+        <w:t xml:space="preserve"> </w:t>
+      </w:r>
+      <w:r>
+        <w:t xml:space="preserve">restriction of outcome access. The software arrangement</w:t>
+      </w:r>
+      <w:r>
+        <w:t xml:space="preserve"> </w:t>
+      </w:r>
+      <w:r>
+        <w:t xml:space="preserve">complements, and does not replace, personnel-based access</w:t>
+      </w:r>
+      <w:r>
+        <w:t xml:space="preserve"> </w:t>
+      </w:r>
+      <w:r>
+        <w:t xml:space="preserve">controls, protocol review, role separation, source-data audit, and</w:t>
+      </w:r>
+      <w:r>
+        <w:t xml:space="preserve"> </w:t>
+      </w:r>
+      <w:r>
+        <w:t xml:space="preserve">independent checkpoint review. Section §</w:t>
+      </w:r>
+      <w:r>
+        <w:t xml:space="preserve"> </w:t>
+      </w:r>
+      <w:r>
+        <w:t xml:space="preserve">situates</w:t>
+      </w:r>
+      <w:r>
+        <w:t xml:space="preserve"> </w:t>
+      </w:r>
+      <w:r>
+        <w:t xml:space="preserve">the package inside the causal roadmap and Table</w:t>
+      </w:r>
+      <w:r>
+        <w:t xml:space="preserve"> </w:t>
+      </w:r>
+      <w:r>
+        <w:t xml:space="preserve"> </w:t>
+      </w:r>
+      <w:r>
+        <w:t xml:space="preserve">maps each component to the corresponding FDA,</w:t>
+      </w:r>
+      <w:r>
+        <w:t xml:space="preserve"> </w:t>
+      </w:r>
+      <w:r>
+        <w:t xml:space="preserve">EMA, and ICH expectation.</w:t>
       </w:r>
     </w:p>
     <w:tbl>
@@ -1674,13 +1558,13 @@
         <w:pStyle w:val="FirstParagraph"/>
       </w:pPr>
       <w:r>
-        <w:t xml:space="preserve">The contributions are operational. First, we extend the</w:t>
-      </w:r>
-      <w:r>
-        <w:t xml:space="preserve"> </w:t>
-      </w:r>
-      <w:r>
-        <w:t xml:space="preserve">outcome-blind plasmode loop from candidate-estimator selection</w:t>
+        <w:t xml:space="preserve">The principal contribution is to extend the outcome-blind plasmode</w:t>
+      </w:r>
+      <w:r>
+        <w:t xml:space="preserve"> </w:t>
+      </w:r>
+      <w:r>
+        <w:t xml:space="preserve">loop from candidate-estimator selection</w:t>
       </w:r>
       <w:r>
         <w:t xml:space="preserve"> </w:t>
@@ -1692,13 +1576,7 @@
         <w:t xml:space="preserve"> </w:t>
       </w:r>
       <w:r>
-        <w:t xml:space="preserve">to</w:t>
-      </w:r>
-      <w:r>
-        <w:t xml:space="preserve"> </w:t>
-      </w:r>
-      <w:r>
-        <w:t xml:space="preserve">candidate-estimator robustness</w:t>
+        <w:t xml:space="preserve">to estimator robustness</w:t>
       </w:r>
       <w:r>
         <w:t xml:space="preserve"> </w:t>
@@ -1714,92 +1592,76 @@
         <w:t xml:space="preserve"> </w:t>
       </w:r>
       <w:r>
-        <w:t xml:space="preserve">under prespecified</w:t>
-      </w:r>
-      <w:r>
-        <w:t xml:space="preserve"> </w:t>
-      </w:r>
-      <w:r>
-        <w:t xml:space="preserve">threat ranges. Each candidate estimator produces a degradation</w:t>
-      </w:r>
-      <w:r>
-        <w:t xml:space="preserve"> </w:t>
-      </w:r>
-      <w:r>
-        <w:t xml:space="preserve">gradient on the same bias / RMSE / coverage scale as the baseline</w:t>
-      </w:r>
-      <w:r>
-        <w:t xml:space="preserve"> </w:t>
-      </w:r>
-      <w:r>
-        <w:t xml:space="preserve">plasmode, so the prespecified decision rule can be applied</w:t>
-      </w:r>
-      <w:r>
-        <w:t xml:space="preserve"> </w:t>
-      </w:r>
-      <w:r>
-        <w:t xml:space="preserve">uniformly across baseline and stressed scenarios. We position this screen as a quantitative</w:t>
-      </w:r>
-      <w:r>
-        <w:t xml:space="preserve"> </w:t>
-      </w:r>
-      <w:r>
-        <w:rPr>
-          <w:i/>
-          <w:iCs/>
-        </w:rPr>
-        <w:t xml:space="preserve">supplement</w:t>
-      </w:r>
-      <w:r>
-        <w:t xml:space="preserve"> </w:t>
-      </w:r>
-      <w:r>
-        <w:t xml:space="preserve">to fit-for-purpose review (§</w:t>
-      </w:r>
-      <w:r>
-        <w:t xml:space="preserve">) rather than as a</w:t>
-      </w:r>
-      <w:r>
-        <w:t xml:space="preserve"> </w:t>
-      </w:r>
-      <w:r>
-        <w:t xml:space="preserve">substitute for variable-validation studies, source-data</w:t>
-      </w:r>
-      <w:r>
-        <w:t xml:space="preserve"> </w:t>
-      </w:r>
-      <w:r>
-        <w:t xml:space="preserve">assessment, or post-outcome quantitative bias analysis. Second, we</w:t>
-      </w:r>
-      <w:r>
-        <w:t xml:space="preserve"> </w:t>
-      </w:r>
-      <w:r>
-        <w:t xml:space="preserve">provide an R implementation that turns prespecification into</w:t>
-      </w:r>
-      <w:r>
-        <w:t xml:space="preserve"> </w:t>
-      </w:r>
-      <w:r>
-        <w:t xml:space="preserve">reproducible analysis records: a fingerprinted analysis-lock</w:t>
-      </w:r>
-      <w:r>
-        <w:t xml:space="preserve"> </w:t>
-      </w:r>
-      <w:r>
-        <w:t xml:space="preserve">object, an audit log, a decision log, and a pre-outcome decision</w:t>
-      </w:r>
-      <w:r>
-        <w:t xml:space="preserve"> </w:t>
-      </w:r>
-      <w:r>
-        <w:t xml:space="preserve">point that the prespecified estimator is checked against before</w:t>
-      </w:r>
-      <w:r>
-        <w:t xml:space="preserve"> </w:t>
-      </w:r>
-      <w:r>
-        <w:t xml:space="preserve">outcome analysis. Third, we acknowledge</w:t>
+        <w:t xml:space="preserve">under prespecified threat ranges. Each candidate</w:t>
+      </w:r>
+      <w:r>
+        <w:t xml:space="preserve"> </w:t>
+      </w:r>
+      <w:r>
+        <w:t xml:space="preserve">produces a degradation gradient on the same bias, RMSE, and</w:t>
+      </w:r>
+      <w:r>
+        <w:t xml:space="preserve"> </w:t>
+      </w:r>
+      <w:r>
+        <w:t xml:space="preserve">coverage scale as the baseline plasmode, so the prespecified</w:t>
+      </w:r>
+      <w:r>
+        <w:t xml:space="preserve"> </w:t>
+      </w:r>
+      <w:r>
+        <w:t xml:space="preserve">decision rule can be applied uniformly across baseline and</w:t>
+      </w:r>
+      <w:r>
+        <w:t xml:space="preserve"> </w:t>
+      </w:r>
+      <w:r>
+        <w:t xml:space="preserve">stressed scenarios. We position this screen as a quantitative</w:t>
+      </w:r>
+      <w:r>
+        <w:t xml:space="preserve"> </w:t>
+      </w:r>
+      <w:r>
+        <w:t xml:space="preserve">supplement to fit-for-purpose review (§</w:t>
+      </w:r>
+      <w:r>
+        <w:t xml:space="preserve">) rather</w:t>
+      </w:r>
+      <w:r>
+        <w:t xml:space="preserve"> </w:t>
+      </w:r>
+      <w:r>
+        <w:t xml:space="preserve">than as a substitute for variable-validation studies, source-data</w:t>
+      </w:r>
+      <w:r>
+        <w:t xml:space="preserve"> </w:t>
+      </w:r>
+      <w:r>
+        <w:t xml:space="preserve">assessment, or post-outcome quantitative bias analysis. The R</w:t>
+      </w:r>
+      <w:r>
+        <w:t xml:space="preserve"> </w:t>
+      </w:r>
+      <w:r>
+        <w:t xml:space="preserve">implementation packages the supporting prespecification artefacts</w:t>
+      </w:r>
+      <w:r>
+        <w:t xml:space="preserve"> </w:t>
+      </w:r>
+      <w:r>
+        <w:t xml:space="preserve">(fingerprinted lock, audit log, decision log, pre-outcome decision</w:t>
+      </w:r>
+      <w:r>
+        <w:t xml:space="preserve"> </w:t>
+      </w:r>
+      <w:r>
+        <w:t xml:space="preserve">point) so that the screen and the locked primary analysis share a</w:t>
+      </w:r>
+      <w:r>
+        <w:t xml:space="preserve"> </w:t>
+      </w:r>
+      <w:r>
+        <w:t xml:space="preserve">single reproducible record. We acknowledge</w:t>
       </w:r>
       <w:r>
         <w:t xml:space="preserve"> </w:t>
@@ -1820,25 +1682,19 @@
         <w:t xml:space="preserve"> </w:t>
       </w:r>
       <w:r>
-        <w:t xml:space="preserve">as a</w:t>
-      </w:r>
-      <w:r>
-        <w:t xml:space="preserve"> </w:t>
-      </w:r>
-      <w:r>
-        <w:t xml:space="preserve">proprietary alternative implementation of related cumulative-risk</w:t>
-      </w:r>
-      <w:r>
-        <w:t xml:space="preserve"> </w:t>
-      </w:r>
-      <w:r>
-        <w:t xml:space="preserve">estimators with which cleanTMLE shares conceptual structure but</w:t>
-      </w:r>
-      <w:r>
-        <w:t xml:space="preserve"> </w:t>
-      </w:r>
-      <w:r>
-        <w:t xml:space="preserve">not code. The next</w:t>
+        <w:t xml:space="preserve">as a proprietary alternative</w:t>
+      </w:r>
+      <w:r>
+        <w:t xml:space="preserve"> </w:t>
+      </w:r>
+      <w:r>
+        <w:t xml:space="preserve">implementation of related cumulative-risk estimators with which</w:t>
+      </w:r>
+      <w:r>
+        <w:t xml:space="preserve"> </w:t>
+      </w:r>
+      <w:r>
+        <w:t xml:space="preserve">cleanTMLE shares conceptual structure but not code. The next</w:t>
       </w:r>
       <w:r>
         <w:t xml:space="preserve"> </w:t>
@@ -17487,25 +17343,43 @@
         <w:pStyle w:val="FirstParagraph"/>
       </w:pPr>
       <w:r>
-        <w:t xml:space="preserve">We let the simulation results speak for themselves; the printed</w:t>
-      </w:r>
-      <w:r>
-        <w:t xml:space="preserve"> </w:t>
-      </w:r>
-      <w:r>
-        <w:t xml:space="preserve">tables include the Monte Carlo standard error of the coverage</w:t>
-      </w:r>
-      <w:r>
-        <w:t xml:space="preserve"> </w:t>
-      </w:r>
-      <w:r>
-        <w:t xml:space="preserve">estimate so the reader can judge which differences exceed Monte</w:t>
-      </w:r>
-      <w:r>
-        <w:t xml:space="preserve"> </w:t>
-      </w:r>
-      <w:r>
-        <w:t xml:space="preserve">Carlo noise. Three patterns are robust to noise.</w:t>
+        <w:t xml:space="preserve">The simulation illustrates three intended uses of the staged</w:t>
+      </w:r>
+      <w:r>
+        <w:t xml:space="preserve"> </w:t>
+      </w:r>
+      <w:r>
+        <w:t xml:space="preserve">workflow: confirming acceptable finite-sample behavior, detecting</w:t>
+      </w:r>
+      <w:r>
+        <w:t xml:space="preserve"> </w:t>
+      </w:r>
+      <w:r>
+        <w:t xml:space="preserve">instability under marginal overlap, and stopping when an</w:t>
+      </w:r>
+      <w:r>
+        <w:t xml:space="preserve"> </w:t>
+      </w:r>
+      <w:r>
+        <w:t xml:space="preserve">identification failure is built into the data-generating process.</w:t>
+      </w:r>
+      <w:r>
+        <w:t xml:space="preserve"> </w:t>
+      </w:r>
+      <w:r>
+        <w:t xml:space="preserve">The printed tables include the Monte Carlo standard error of the</w:t>
+      </w:r>
+      <w:r>
+        <w:t xml:space="preserve"> </w:t>
+      </w:r>
+      <w:r>
+        <w:t xml:space="preserve">coverage estimate so the reader can judge which differences exceed</w:t>
+      </w:r>
+      <w:r>
+        <w:t xml:space="preserve"> </w:t>
+      </w:r>
+      <w:r>
+        <w:t xml:space="preserve">Monte Carlo noise. Three patterns are robust to noise.</w:t>
       </w:r>
     </w:p>
     <w:p>
@@ -21509,6 +21383,24 @@
       </w:r>
       <w:r>
         <w:t xml:space="preserve">selected candidate’s RMSE ratio above 1.5 in our default settings.</w:t>
+      </w:r>
+      <w:r>
+        <w:t xml:space="preserve"> </w:t>
+      </w:r>
+      <w:r>
+        <w:t xml:space="preserve">Across scenarios, the DQ stress test was most informative when the</w:t>
+      </w:r>
+      <w:r>
+        <w:t xml:space="preserve"> </w:t>
+      </w:r>
+      <w:r>
+        <w:t xml:space="preserve">threat directly targeted identification or measurement validity</w:t>
+      </w:r>
+      <w:r>
+        <w:t xml:space="preserve"> </w:t>
+      </w:r>
+      <w:r>
+        <w:t xml:space="preserve">rather than ordinary estimator variance.</w:t>
       </w:r>
     </w:p>
     <w:p>

</xml_diff>

<commit_message>
Manuscript: Austin 2009 PS-diagnostics citation; NICE RWE alongside FDA/EMA; bibtex additions
- references.bib: add austin2009ps (Stat Med 2009) and nice2022rwe
  (NICE RWE framework ECD9, 2022)
- §6 four-way contrast paragraph cites Austin 2009 for PS diagnostics
- Discussion regulatory-alignment paragraph cites NICE alongside FDA
  and EMA

Updates submodule pointer for cleanTMLE 3dffadb (roxygen scrub +
lock/gate/override @section blocks + vignette estimator-vs-estimand
subsection + regenerated man pages).

No simulations rerun. No numerical results changed.

Co-Authored-By: Claude Opus 4.7 (1M context) <noreply@anthropic.com>
</commit_message>
<xml_diff>
--- a/reports/manuscript_outcome_blind_dq.docx
+++ b/reports/manuscript_outcome_blind_dq.docx
@@ -23,7 +23,7 @@
         <w:pStyle w:val="Date"/>
       </w:pPr>
       <w:r>
-        <w:t xml:space="preserve">2026-05-10</w:t>
+        <w:t xml:space="preserve">2026-05-11</w:t>
       </w:r>
     </w:p>
     <w:sdt>
@@ -7287,13 +7287,31 @@
         </w:numPr>
       </w:pPr>
       <w:r>
-        <w:t xml:space="preserve">Propensity-score diagnostics assess overlap, balance, and design</w:t>
-      </w:r>
-      <w:r>
-        <w:t xml:space="preserve"> </w:t>
-      </w:r>
-      <w:r>
-        <w:t xml:space="preserve">feasibility, not estimator operating characteristics.</w:t>
+        <w:t xml:space="preserve">Propensity-score diagnostics</w:t>
+      </w:r>
+      <w:r>
+        <w:t xml:space="preserve"> </w:t>
+      </w:r>
+      <w:r>
+        <w:t xml:space="preserve">(Austin 2009)</w:t>
+      </w:r>
+      <w:r>
+        <w:t xml:space="preserve"> </w:t>
+      </w:r>
+      <w:r>
+        <w:t xml:space="preserve">assess overlap,</w:t>
+      </w:r>
+      <w:r>
+        <w:t xml:space="preserve"> </w:t>
+      </w:r>
+      <w:r>
+        <w:t xml:space="preserve">balance, and design feasibility, not estimator operating</w:t>
+      </w:r>
+      <w:r>
+        <w:t xml:space="preserve"> </w:t>
+      </w:r>
+      <w:r>
+        <w:t xml:space="preserve">characteristics.</w:t>
       </w:r>
     </w:p>
     <w:p>
@@ -26467,19 +26485,19 @@
         <w:t xml:space="preserve"> </w:t>
       </w:r>
       <w:r>
-        <w:t xml:space="preserve">prespecification and traceability that FDA RWE program guidance</w:t>
-      </w:r>
-      <w:r>
-        <w:t xml:space="preserve"> </w:t>
-      </w:r>
-      <w:r>
-        <w:t xml:space="preserve">expects</w:t>
-      </w:r>
-      <w:r>
-        <w:t xml:space="preserve"> </w:t>
-      </w:r>
-      <w:r>
-        <w:t xml:space="preserve">(U.S. Food and Drug Administration 2018, 2024a, 2024c)</w:t>
+        <w:t xml:space="preserve">prespecification and traceability that FDA RWE program guidance,</w:t>
+      </w:r>
+      <w:r>
+        <w:t xml:space="preserve"> </w:t>
+      </w:r>
+      <w:r>
+        <w:t xml:space="preserve">EMA RWD guidance, and the NICE RWE framework expect</w:t>
+      </w:r>
+      <w:r>
+        <w:t xml:space="preserve"> </w:t>
+      </w:r>
+      <w:r>
+        <w:t xml:space="preserve">(U.S. Food and Drug Administration 2018, 2024a, 2024c; European Medicines Agency 2024; National Institute for Health and Care Excellence 2022)</w:t>
       </w:r>
       <w:r>
         <w:t xml:space="preserve"> </w:t>
@@ -28546,7 +28564,7 @@
       </w:r>
     </w:p>
     <w:bookmarkEnd w:id="120"/>
-    <w:bookmarkStart w:id="202" w:name="references"/>
+    <w:bookmarkStart w:id="206" w:name="references"/>
     <w:p>
       <w:pPr>
         <w:pStyle w:val="Heading1"/>
@@ -28555,58 +28573,104 @@
         <w:t xml:space="preserve">References</w:t>
       </w:r>
     </w:p>
-    <w:bookmarkStart w:id="201" w:name="refs"/>
-    <w:bookmarkStart w:id="121" w:name="ref-survtmlepackage2018"/>
+    <w:bookmarkStart w:id="205" w:name="refs"/>
+    <w:bookmarkStart w:id="122" w:name="ref-austin2009ps"/>
     <w:p>
       <w:pPr>
         <w:pStyle w:val="Bibliography"/>
       </w:pPr>
       <w:r>
-        <w:t xml:space="preserve">Benkeser, David, and Nima S. Hejazi. 2018.</w:t>
-      </w:r>
-      <w:r>
-        <w:t xml:space="preserve"> </w:t>
-      </w:r>
-      <w:r>
-        <w:t xml:space="preserve">“Survtmle: Compute Targeted Minimum Loss-Based Estimates in Right-Censored Survival Settings.”</w:t>
-      </w:r>
-    </w:p>
-    <w:bookmarkEnd w:id="121"/>
-    <w:bookmarkStart w:id="122" w:name="ref-brookhart2024causalrisk"/>
-    <w:p>
-      <w:pPr>
-        <w:pStyle w:val="Bibliography"/>
-      </w:pPr>
-      <w:r>
-        <w:t xml:space="preserve">Brookhart, M. Alan, Alexander Breskin, and Bassim Eledath. 2024.</w:t>
-      </w:r>
-      <w:r>
-        <w:t xml:space="preserve"> </w:t>
-      </w:r>
-      <w:r>
-        <w:t xml:space="preserve">“</w:t>
-      </w:r>
-      <w:r>
-        <w:t xml:space="preserve">causalRisk</w:t>
-      </w:r>
-      <w:r>
-        <w:t xml:space="preserve">: An</w:t>
-      </w:r>
-      <w:r>
-        <w:t xml:space="preserve"> </w:t>
-      </w:r>
-      <w:r>
-        <w:t xml:space="preserve">R</w:t>
-      </w:r>
-      <w:r>
-        <w:t xml:space="preserve"> </w:t>
-      </w:r>
-      <w:r>
-        <w:t xml:space="preserve">Package for Estimating Cumulative Risks Under Counterfactual Treatment Strategies.”</w:t>
+        <w:t xml:space="preserve">Austin, Peter C. 2009.</w:t>
+      </w:r>
+      <w:r>
+        <w:t xml:space="preserve"> </w:t>
+      </w:r>
+      <w:r>
+        <w:t xml:space="preserve">“Balance Diagnostics for Comparing the Distribution of Baseline Covariates Between Treatment Groups in Propensity-Score Matched Samples.”</w:t>
+      </w:r>
+      <w:r>
+        <w:t xml:space="preserve"> </w:t>
+      </w:r>
+      <w:r>
+        <w:rPr>
+          <w:i/>
+          <w:iCs/>
+        </w:rPr>
+        <w:t xml:space="preserve">Statistics in Medicine</w:t>
+      </w:r>
+      <w:r>
+        <w:t xml:space="preserve"> </w:t>
+      </w:r>
+      <w:r>
+        <w:t xml:space="preserve">28 (25): 3083–3107.</w:t>
+      </w:r>
+      <w:r>
+        <w:t xml:space="preserve"> </w:t>
+      </w:r>
+      <w:hyperlink r:id="rId121">
+        <w:r>
+          <w:rPr>
+            <w:rStyle w:val="Hyperlink"/>
+          </w:rPr>
+          <w:t xml:space="preserve">https://doi.org/10.1002/sim.3697</w:t>
+        </w:r>
+      </w:hyperlink>
+      <w:r>
+        <w:t xml:space="preserve">.</w:t>
       </w:r>
     </w:p>
     <w:bookmarkEnd w:id="122"/>
-    <w:bookmarkStart w:id="124" w:name="ref-cashin2024target"/>
+    <w:bookmarkStart w:id="123" w:name="ref-survtmlepackage2018"/>
+    <w:p>
+      <w:pPr>
+        <w:pStyle w:val="Bibliography"/>
+      </w:pPr>
+      <w:r>
+        <w:t xml:space="preserve">Benkeser, David, and Nima S. Hejazi. 2018.</w:t>
+      </w:r>
+      <w:r>
+        <w:t xml:space="preserve"> </w:t>
+      </w:r>
+      <w:r>
+        <w:t xml:space="preserve">“Survtmle: Compute Targeted Minimum Loss-Based Estimates in Right-Censored Survival Settings.”</w:t>
+      </w:r>
+    </w:p>
+    <w:bookmarkEnd w:id="123"/>
+    <w:bookmarkStart w:id="124" w:name="ref-brookhart2024causalrisk"/>
+    <w:p>
+      <w:pPr>
+        <w:pStyle w:val="Bibliography"/>
+      </w:pPr>
+      <w:r>
+        <w:t xml:space="preserve">Brookhart, M. Alan, Alexander Breskin, and Bassim Eledath. 2024.</w:t>
+      </w:r>
+      <w:r>
+        <w:t xml:space="preserve"> </w:t>
+      </w:r>
+      <w:r>
+        <w:t xml:space="preserve">“</w:t>
+      </w:r>
+      <w:r>
+        <w:t xml:space="preserve">causalRisk</w:t>
+      </w:r>
+      <w:r>
+        <w:t xml:space="preserve">: An</w:t>
+      </w:r>
+      <w:r>
+        <w:t xml:space="preserve"> </w:t>
+      </w:r>
+      <w:r>
+        <w:t xml:space="preserve">R</w:t>
+      </w:r>
+      <w:r>
+        <w:t xml:space="preserve"> </w:t>
+      </w:r>
+      <w:r>
+        <w:t xml:space="preserve">Package for Estimating Cumulative Risks Under Counterfactual Treatment Strategies.”</w:t>
+      </w:r>
+    </w:p>
+    <w:bookmarkEnd w:id="124"/>
+    <w:bookmarkStart w:id="126" w:name="ref-cashin2024target"/>
     <w:p>
       <w:pPr>
         <w:pStyle w:val="Bibliography"/>
@@ -28642,7 +28706,7 @@
       <w:r>
         <w:t xml:space="preserve"> </w:t>
       </w:r>
-      <w:hyperlink r:id="rId123">
+      <w:hyperlink r:id="rId125">
         <w:r>
           <w:rPr>
             <w:rStyle w:val="Hyperlink"/>
@@ -28654,8 +28718,8 @@
         <w:t xml:space="preserve">.</w:t>
       </w:r>
     </w:p>
-    <w:bookmarkEnd w:id="124"/>
-    <w:bookmarkStart w:id="126" w:name="ref-chernozhukov2018dml"/>
+    <w:bookmarkEnd w:id="126"/>
+    <w:bookmarkStart w:id="128" w:name="ref-chernozhukov2018dml"/>
     <w:p>
       <w:pPr>
         <w:pStyle w:val="Bibliography"/>
@@ -28688,7 +28752,7 @@
       <w:r>
         <w:t xml:space="preserve"> </w:t>
       </w:r>
-      <w:hyperlink r:id="rId125">
+      <w:hyperlink r:id="rId127">
         <w:r>
           <w:rPr>
             <w:rStyle w:val="Hyperlink"/>
@@ -28700,8 +28764,8 @@
         <w:t xml:space="preserve">.</w:t>
       </w:r>
     </w:p>
-    <w:bookmarkEnd w:id="126"/>
-    <w:bookmarkStart w:id="128" w:name="ref-dang2023roadmap"/>
+    <w:bookmarkEnd w:id="128"/>
+    <w:bookmarkStart w:id="130" w:name="ref-dang2023roadmap"/>
     <w:p>
       <w:pPr>
         <w:pStyle w:val="Bibliography"/>
@@ -28734,7 +28798,7 @@
       <w:r>
         <w:t xml:space="preserve"> </w:t>
       </w:r>
-      <w:hyperlink r:id="rId127">
+      <w:hyperlink r:id="rId129">
         <w:r>
           <w:rPr>
             <w:rStyle w:val="Hyperlink"/>
@@ -28746,8 +28810,8 @@
         <w:t xml:space="preserve">.</w:t>
       </w:r>
     </w:p>
-    <w:bookmarkEnd w:id="128"/>
-    <w:bookmarkStart w:id="130" w:name="ref-diaz2013sensitivity"/>
+    <w:bookmarkEnd w:id="130"/>
+    <w:bookmarkStart w:id="132" w:name="ref-diaz2013sensitivity"/>
     <w:p>
       <w:pPr>
         <w:pStyle w:val="Bibliography"/>
@@ -28780,7 +28844,7 @@
       <w:r>
         <w:t xml:space="preserve"> </w:t>
       </w:r>
-      <w:hyperlink r:id="rId129">
+      <w:hyperlink r:id="rId131">
         <w:r>
           <w:rPr>
             <w:rStyle w:val="Hyperlink"/>
@@ -28792,8 +28856,8 @@
         <w:t xml:space="preserve">.</w:t>
       </w:r>
     </w:p>
-    <w:bookmarkEnd w:id="130"/>
-    <w:bookmarkStart w:id="132" w:name="ref-ema2021registry"/>
+    <w:bookmarkEnd w:id="132"/>
+    <w:bookmarkStart w:id="134" w:name="ref-ema2021registry"/>
     <w:p>
       <w:pPr>
         <w:pStyle w:val="Bibliography"/>
@@ -28810,7 +28874,7 @@
       <w:r>
         <w:t xml:space="preserve"> </w:t>
       </w:r>
-      <w:hyperlink r:id="rId131">
+      <w:hyperlink r:id="rId133">
         <w:r>
           <w:rPr>
             <w:rStyle w:val="Hyperlink"/>
@@ -28822,8 +28886,8 @@
         <w:t xml:space="preserve">.</w:t>
       </w:r>
     </w:p>
-    <w:bookmarkEnd w:id="132"/>
-    <w:bookmarkStart w:id="134" w:name="ref-ema2024guide"/>
+    <w:bookmarkEnd w:id="134"/>
+    <w:bookmarkStart w:id="136" w:name="ref-ema2024guide"/>
     <w:p>
       <w:pPr>
         <w:pStyle w:val="Bibliography"/>
@@ -28852,7 +28916,7 @@
       <w:r>
         <w:t xml:space="preserve"> </w:t>
       </w:r>
-      <w:hyperlink r:id="rId133">
+      <w:hyperlink r:id="rId135">
         <w:r>
           <w:rPr>
             <w:rStyle w:val="Hyperlink"/>
@@ -28864,8 +28928,8 @@
         <w:t xml:space="preserve">.</w:t>
       </w:r>
     </w:p>
-    <w:bookmarkEnd w:id="134"/>
-    <w:bookmarkStart w:id="135" w:name="ref-ema2026rwd"/>
+    <w:bookmarkEnd w:id="136"/>
+    <w:bookmarkStart w:id="137" w:name="ref-ema2026rwd"/>
     <w:p>
       <w:pPr>
         <w:pStyle w:val="Bibliography"/>
@@ -28892,8 +28956,8 @@
         <w:t xml:space="preserve">Medicines Regulation.”</w:t>
       </w:r>
     </w:p>
-    <w:bookmarkEnd w:id="135"/>
-    <w:bookmarkStart w:id="137" w:name="ref-franklin2014plasmode"/>
+    <w:bookmarkEnd w:id="137"/>
+    <w:bookmarkStart w:id="139" w:name="ref-franklin2014plasmode"/>
     <w:p>
       <w:pPr>
         <w:pStyle w:val="Bibliography"/>
@@ -28926,7 +28990,7 @@
       <w:r>
         <w:t xml:space="preserve"> </w:t>
       </w:r>
-      <w:hyperlink r:id="rId136">
+      <w:hyperlink r:id="rId138">
         <w:r>
           <w:rPr>
             <w:rStyle w:val="Hyperlink"/>
@@ -28938,8 +29002,8 @@
         <w:t xml:space="preserve">.</w:t>
       </w:r>
     </w:p>
-    <w:bookmarkEnd w:id="137"/>
-    <w:bookmarkStart w:id="139" w:name="ref-gatto2022spifd"/>
+    <w:bookmarkEnd w:id="139"/>
+    <w:bookmarkStart w:id="141" w:name="ref-gatto2022spifd"/>
     <w:p>
       <w:pPr>
         <w:pStyle w:val="Bibliography"/>
@@ -28972,7 +29036,7 @@
       <w:r>
         <w:t xml:space="preserve"> </w:t>
       </w:r>
-      <w:hyperlink r:id="rId138">
+      <w:hyperlink r:id="rId140">
         <w:r>
           <w:rPr>
             <w:rStyle w:val="Hyperlink"/>
@@ -28984,8 +29048,8 @@
         <w:t xml:space="preserve">.</w:t>
       </w:r>
     </w:p>
-    <w:bookmarkEnd w:id="139"/>
-    <w:bookmarkStart w:id="141" w:name="ref-gatto2023spifd2"/>
+    <w:bookmarkEnd w:id="141"/>
+    <w:bookmarkStart w:id="143" w:name="ref-gatto2023spifd2"/>
     <w:p>
       <w:pPr>
         <w:pStyle w:val="Bibliography"/>
@@ -29018,7 +29082,7 @@
       <w:r>
         <w:t xml:space="preserve"> </w:t>
       </w:r>
-      <w:hyperlink r:id="rId140">
+      <w:hyperlink r:id="rId142">
         <w:r>
           <w:rPr>
             <w:rStyle w:val="Hyperlink"/>
@@ -29030,8 +29094,8 @@
         <w:t xml:space="preserve">.</w:t>
       </w:r>
     </w:p>
-    <w:bookmarkEnd w:id="141"/>
-    <w:bookmarkStart w:id="143" w:name="ref-gruber2022sap"/>
+    <w:bookmarkEnd w:id="143"/>
+    <w:bookmarkStart w:id="145" w:name="ref-gruber2022sap"/>
     <w:p>
       <w:pPr>
         <w:pStyle w:val="Bibliography"/>
@@ -29064,7 +29128,7 @@
       <w:r>
         <w:t xml:space="preserve"> </w:t>
       </w:r>
-      <w:hyperlink r:id="rId142">
+      <w:hyperlink r:id="rId144">
         <w:r>
           <w:rPr>
             <w:rStyle w:val="Hyperlink"/>
@@ -29076,8 +29140,8 @@
         <w:t xml:space="preserve">.</w:t>
       </w:r>
     </w:p>
-    <w:bookmarkEnd w:id="143"/>
-    <w:bookmarkStart w:id="145" w:name="ref-gruber2024evaluating"/>
+    <w:bookmarkEnd w:id="145"/>
+    <w:bookmarkStart w:id="147" w:name="ref-gruber2024evaluating"/>
     <w:p>
       <w:pPr>
         <w:pStyle w:val="Bibliography"/>
@@ -29110,7 +29174,7 @@
       <w:r>
         <w:t xml:space="preserve"> </w:t>
       </w:r>
-      <w:hyperlink r:id="rId144">
+      <w:hyperlink r:id="rId146">
         <w:r>
           <w:rPr>
             <w:rStyle w:val="Hyperlink"/>
@@ -29122,8 +29186,8 @@
         <w:t xml:space="preserve">.</w:t>
       </w:r>
     </w:p>
-    <w:bookmarkEnd w:id="145"/>
-    <w:bookmarkStart w:id="147" w:name="ref-hernan2016targettrial"/>
+    <w:bookmarkEnd w:id="147"/>
+    <w:bookmarkStart w:id="149" w:name="ref-hernan2016targettrial"/>
     <w:p>
       <w:pPr>
         <w:pStyle w:val="Bibliography"/>
@@ -29156,7 +29220,7 @@
       <w:r>
         <w:t xml:space="preserve"> </w:t>
       </w:r>
-      <w:hyperlink r:id="rId146">
+      <w:hyperlink r:id="rId148">
         <w:r>
           <w:rPr>
             <w:rStyle w:val="Hyperlink"/>
@@ -29168,8 +29232,8 @@
         <w:t xml:space="preserve">.</w:t>
       </w:r>
     </w:p>
-    <w:bookmarkEnd w:id="147"/>
-    <w:bookmarkStart w:id="148" w:name="ref-hernan2016target"/>
+    <w:bookmarkEnd w:id="149"/>
+    <w:bookmarkStart w:id="150" w:name="ref-hernan2016target"/>
     <w:p>
       <w:pPr>
         <w:pStyle w:val="Bibliography"/>
@@ -29202,7 +29266,7 @@
       <w:r>
         <w:t xml:space="preserve"> </w:t>
       </w:r>
-      <w:hyperlink r:id="rId146">
+      <w:hyperlink r:id="rId148">
         <w:r>
           <w:rPr>
             <w:rStyle w:val="Hyperlink"/>
@@ -29214,8 +29278,8 @@
         <w:t xml:space="preserve">.</w:t>
       </w:r>
     </w:p>
-    <w:bookmarkEnd w:id="148"/>
-    <w:bookmarkStart w:id="149" w:name="ref-hernan2020causal"/>
+    <w:bookmarkEnd w:id="150"/>
+    <w:bookmarkStart w:id="151" w:name="ref-hernan2020causal"/>
     <w:p>
       <w:pPr>
         <w:pStyle w:val="Bibliography"/>
@@ -29237,8 +29301,8 @@
         <w:t xml:space="preserve">. Boca Raton: Chapman &amp; Hall/CRC.</w:t>
       </w:r>
     </w:p>
-    <w:bookmarkEnd w:id="149"/>
-    <w:bookmarkStart w:id="150" w:name="ref-ich2019e9r1"/>
+    <w:bookmarkEnd w:id="151"/>
+    <w:bookmarkStart w:id="152" w:name="ref-ich2019e9r1"/>
     <w:p>
       <w:pPr>
         <w:pStyle w:val="Bibliography"/>
@@ -29262,8 +29326,8 @@
         <w:t xml:space="preserve">Addendum on Estimands and Sensitivity Analysis in Clinical Trials.”</w:t>
       </w:r>
     </w:p>
-    <w:bookmarkEnd w:id="150"/>
-    <w:bookmarkStart w:id="151" w:name="ref-ich2024m14"/>
+    <w:bookmarkEnd w:id="152"/>
+    <w:bookmarkStart w:id="153" w:name="ref-ich2024m14"/>
     <w:p>
       <w:pPr>
         <w:pStyle w:val="Bibliography"/>
@@ -29287,8 +29351,8 @@
         <w:t xml:space="preserve">Guidance for Industry: General Principles on Planning, Designing, and Analyzing Non-Interventional Studies Using Real-World Data for Safety Assessment of Medicines.”</w:t>
       </w:r>
     </w:p>
-    <w:bookmarkEnd w:id="151"/>
-    <w:bookmarkStart w:id="153" w:name="ref-kahn2016data"/>
+    <w:bookmarkEnd w:id="153"/>
+    <w:bookmarkStart w:id="155" w:name="ref-kahn2016data"/>
     <w:p>
       <w:pPr>
         <w:pStyle w:val="Bibliography"/>
@@ -29321,7 +29385,7 @@
       <w:r>
         <w:t xml:space="preserve"> </w:t>
       </w:r>
-      <w:hyperlink r:id="rId152">
+      <w:hyperlink r:id="rId154">
         <w:r>
           <w:rPr>
             <w:rStyle w:val="Hyperlink"/>
@@ -29333,8 +29397,8 @@
         <w:t xml:space="preserve">.</w:t>
       </w:r>
     </w:p>
-    <w:bookmarkEnd w:id="153"/>
-    <w:bookmarkStart w:id="154" w:name="ref-kent2026fiord"/>
+    <w:bookmarkEnd w:id="155"/>
+    <w:bookmarkStart w:id="156" w:name="ref-kent2026fiord"/>
     <w:p>
       <w:pPr>
         <w:pStyle w:val="Bibliography"/>
@@ -29355,8 +29419,8 @@
         <w:t xml:space="preserve">Conference presentation, 4th Annual Forum on the Integration of Observational and Randomized Data (FIORD), Day 1 Lunch session.</w:t>
       </w:r>
     </w:p>
-    <w:bookmarkEnd w:id="154"/>
-    <w:bookmarkStart w:id="156" w:name="ref-vdL2007superlearner"/>
+    <w:bookmarkEnd w:id="156"/>
+    <w:bookmarkStart w:id="158" w:name="ref-vdL2007superlearner"/>
     <w:p>
       <w:pPr>
         <w:pStyle w:val="Bibliography"/>
@@ -29389,7 +29453,7 @@
       <w:r>
         <w:t xml:space="preserve"> </w:t>
       </w:r>
-      <w:hyperlink r:id="rId155">
+      <w:hyperlink r:id="rId157">
         <w:r>
           <w:rPr>
             <w:rStyle w:val="Hyperlink"/>
@@ -29401,8 +29465,8 @@
         <w:t xml:space="preserve">.</w:t>
       </w:r>
     </w:p>
-    <w:bookmarkEnd w:id="156"/>
-    <w:bookmarkStart w:id="158" w:name="ref-vdL2011tlbook"/>
+    <w:bookmarkEnd w:id="158"/>
+    <w:bookmarkStart w:id="160" w:name="ref-vdL2011tlbook"/>
     <w:p>
       <w:pPr>
         <w:pStyle w:val="Bibliography"/>
@@ -29426,7 +29490,7 @@
       <w:r>
         <w:t xml:space="preserve"> </w:t>
       </w:r>
-      <w:hyperlink r:id="rId157">
+      <w:hyperlink r:id="rId159">
         <w:r>
           <w:rPr>
             <w:rStyle w:val="Hyperlink"/>
@@ -29438,8 +29502,8 @@
         <w:t xml:space="preserve">.</w:t>
       </w:r>
     </w:p>
-    <w:bookmarkEnd w:id="158"/>
-    <w:bookmarkStart w:id="160" w:name="ref-vanderLaan2006tmle"/>
+    <w:bookmarkEnd w:id="160"/>
+    <w:bookmarkStart w:id="162" w:name="ref-vanderLaan2006tmle"/>
     <w:p>
       <w:pPr>
         <w:pStyle w:val="Bibliography"/>
@@ -29472,7 +29536,7 @@
       <w:r>
         <w:t xml:space="preserve"> </w:t>
       </w:r>
-      <w:hyperlink r:id="rId159">
+      <w:hyperlink r:id="rId161">
         <w:r>
           <w:rPr>
             <w:rStyle w:val="Hyperlink"/>
@@ -29484,8 +29548,8 @@
         <w:t xml:space="preserve">.</w:t>
       </w:r>
     </w:p>
-    <w:bookmarkEnd w:id="160"/>
-    <w:bookmarkStart w:id="162" w:name="ref-lash2014qba"/>
+    <w:bookmarkEnd w:id="162"/>
+    <w:bookmarkStart w:id="164" w:name="ref-lash2014qba"/>
     <w:p>
       <w:pPr>
         <w:pStyle w:val="Bibliography"/>
@@ -29518,7 +29582,7 @@
       <w:r>
         <w:t xml:space="preserve"> </w:t>
       </w:r>
-      <w:hyperlink r:id="rId161">
+      <w:hyperlink r:id="rId163">
         <w:r>
           <w:rPr>
             <w:rStyle w:val="Hyperlink"/>
@@ -29530,8 +29594,8 @@
         <w:t xml:space="preserve">.</w:t>
       </w:r>
     </w:p>
-    <w:bookmarkEnd w:id="162"/>
-    <w:bookmarkStart w:id="164" w:name="ref-levintow2023nco"/>
+    <w:bookmarkEnd w:id="164"/>
+    <w:bookmarkStart w:id="166" w:name="ref-levintow2023nco"/>
     <w:p>
       <w:pPr>
         <w:pStyle w:val="Bibliography"/>
@@ -29564,7 +29628,7 @@
       <w:r>
         <w:t xml:space="preserve"> </w:t>
       </w:r>
-      <w:hyperlink r:id="rId163">
+      <w:hyperlink r:id="rId165">
         <w:r>
           <w:rPr>
             <w:rStyle w:val="Hyperlink"/>
@@ -29576,8 +29640,8 @@
         <w:t xml:space="preserve">.</w:t>
       </w:r>
     </w:p>
-    <w:bookmarkEnd w:id="164"/>
-    <w:bookmarkStart w:id="166" w:name="ref-lipsitch2010negative"/>
+    <w:bookmarkEnd w:id="166"/>
+    <w:bookmarkStart w:id="168" w:name="ref-lipsitch2010negative"/>
     <w:p>
       <w:pPr>
         <w:pStyle w:val="Bibliography"/>
@@ -29610,7 +29674,7 @@
       <w:r>
         <w:t xml:space="preserve"> </w:t>
       </w:r>
-      <w:hyperlink r:id="rId165">
+      <w:hyperlink r:id="rId167">
         <w:r>
           <w:rPr>
             <w:rStyle w:val="Hyperlink"/>
@@ -29622,8 +29686,8 @@
         <w:t xml:space="preserve">.</w:t>
       </w:r>
     </w:p>
-    <w:bookmarkEnd w:id="166"/>
-    <w:bookmarkStart w:id="168" w:name="ref-mcgrath2021romiplostim"/>
+    <w:bookmarkEnd w:id="168"/>
+    <w:bookmarkStart w:id="170" w:name="ref-mcgrath2021romiplostim"/>
     <w:p>
       <w:pPr>
         <w:pStyle w:val="Bibliography"/>
@@ -29656,7 +29720,7 @@
       <w:r>
         <w:t xml:space="preserve"> </w:t>
       </w:r>
-      <w:hyperlink r:id="rId167">
+      <w:hyperlink r:id="rId169">
         <w:r>
           <w:rPr>
             <w:rStyle w:val="Hyperlink"/>
@@ -29668,8 +29732,8 @@
         <w:t xml:space="preserve">.</w:t>
       </w:r>
     </w:p>
-    <w:bookmarkEnd w:id="168"/>
-    <w:bookmarkStart w:id="170" w:name="ref-muntner2024staging"/>
+    <w:bookmarkEnd w:id="170"/>
+    <w:bookmarkStart w:id="172" w:name="ref-muntner2024staging"/>
     <w:p>
       <w:pPr>
         <w:pStyle w:val="Bibliography"/>
@@ -29702,7 +29766,7 @@
       <w:r>
         <w:t xml:space="preserve"> </w:t>
       </w:r>
-      <w:hyperlink r:id="rId169">
+      <w:hyperlink r:id="rId171">
         <w:r>
           <w:rPr>
             <w:rStyle w:val="Hyperlink"/>
@@ -29714,8 +29778,53 @@
         <w:t xml:space="preserve">.</w:t>
       </w:r>
     </w:p>
-    <w:bookmarkEnd w:id="170"/>
-    <w:bookmarkStart w:id="172" w:name="ref-petersen2014roadmap"/>
+    <w:bookmarkEnd w:id="172"/>
+    <w:bookmarkStart w:id="174" w:name="ref-nice2022rwe"/>
+    <w:p>
+      <w:pPr>
+        <w:pStyle w:val="Bibliography"/>
+      </w:pPr>
+      <w:r>
+        <w:t xml:space="preserve">National Institute for Health and Care Excellence. 2022.</w:t>
+      </w:r>
+      <w:r>
+        <w:t xml:space="preserve"> </w:t>
+      </w:r>
+      <w:r>
+        <w:t xml:space="preserve">“</w:t>
+      </w:r>
+      <w:r>
+        <w:t xml:space="preserve">NICE</w:t>
+      </w:r>
+      <w:r>
+        <w:t xml:space="preserve"> </w:t>
+      </w:r>
+      <w:r>
+        <w:t xml:space="preserve">Real-World Evidence Framework (ECD9).”</w:t>
+      </w:r>
+      <w:r>
+        <w:t xml:space="preserve"> </w:t>
+      </w:r>
+      <w:r>
+        <w:t xml:space="preserve">NICE corporate document, London.</w:t>
+      </w:r>
+      <w:r>
+        <w:t xml:space="preserve"> </w:t>
+      </w:r>
+      <w:hyperlink r:id="rId173">
+        <w:r>
+          <w:rPr>
+            <w:rStyle w:val="Hyperlink"/>
+          </w:rPr>
+          <w:t xml:space="preserve">https://www.nice.org.uk/corporate/ecd9</w:t>
+        </w:r>
+      </w:hyperlink>
+      <w:r>
+        <w:t xml:space="preserve">.</w:t>
+      </w:r>
+    </w:p>
+    <w:bookmarkEnd w:id="174"/>
+    <w:bookmarkStart w:id="176" w:name="ref-petersen2014roadmap"/>
     <w:p>
       <w:pPr>
         <w:pStyle w:val="Bibliography"/>
@@ -29748,7 +29857,7 @@
       <w:r>
         <w:t xml:space="preserve"> </w:t>
       </w:r>
-      <w:hyperlink r:id="rId171">
+      <w:hyperlink r:id="rId175">
         <w:r>
           <w:rPr>
             <w:rStyle w:val="Hyperlink"/>
@@ -29760,8 +29869,8 @@
         <w:t xml:space="preserve">.</w:t>
       </w:r>
     </w:p>
-    <w:bookmarkEnd w:id="172"/>
-    <w:bookmarkStart w:id="174" w:name="ref-phillips2023sl"/>
+    <w:bookmarkEnd w:id="176"/>
+    <w:bookmarkStart w:id="178" w:name="ref-phillips2023sl"/>
     <w:p>
       <w:pPr>
         <w:pStyle w:val="Bibliography"/>
@@ -29794,7 +29903,7 @@
       <w:r>
         <w:t xml:space="preserve"> </w:t>
       </w:r>
-      <w:hyperlink r:id="rId173">
+      <w:hyperlink r:id="rId177">
         <w:r>
           <w:rPr>
             <w:rStyle w:val="Hyperlink"/>
@@ -29806,8 +29915,8 @@
         <w:t xml:space="preserve">.</w:t>
       </w:r>
     </w:p>
-    <w:bookmarkEnd w:id="174"/>
-    <w:bookmarkStart w:id="176" w:name="ref-rcoreteam2024"/>
+    <w:bookmarkEnd w:id="178"/>
+    <w:bookmarkStart w:id="180" w:name="ref-rcoreteam2024"/>
     <w:p>
       <w:pPr>
         <w:pStyle w:val="Bibliography"/>
@@ -29836,7 +29945,7 @@
       <w:r>
         <w:t xml:space="preserve"> </w:t>
       </w:r>
-      <w:hyperlink r:id="rId175">
+      <w:hyperlink r:id="rId179">
         <w:r>
           <w:rPr>
             <w:rStyle w:val="Hyperlink"/>
@@ -29848,8 +29957,8 @@
         <w:t xml:space="preserve">.</w:t>
       </w:r>
     </w:p>
-    <w:bookmarkEnd w:id="176"/>
-    <w:bookmarkStart w:id="177" w:name="ref-robins1986newapproach"/>
+    <w:bookmarkEnd w:id="180"/>
+    <w:bookmarkStart w:id="181" w:name="ref-robins1986newapproach"/>
     <w:p>
       <w:pPr>
         <w:pStyle w:val="Bibliography"/>
@@ -29880,8 +29989,8 @@
         <w:t xml:space="preserve">7 (9-12): 1393–1512.</w:t>
       </w:r>
     </w:p>
-    <w:bookmarkEnd w:id="177"/>
-    <w:bookmarkStart w:id="178" w:name="ref-robins1992rotnitzky"/>
+    <w:bookmarkEnd w:id="181"/>
+    <w:bookmarkStart w:id="182" w:name="ref-robins1992rotnitzky"/>
     <w:p>
       <w:pPr>
         <w:pStyle w:val="Bibliography"/>
@@ -29902,8 +30011,8 @@
         <w:t xml:space="preserve">297–331.</w:t>
       </w:r>
     </w:p>
-    <w:bookmarkEnd w:id="178"/>
-    <w:bookmarkStart w:id="179" w:name="ref-schreck2024plasmode"/>
+    <w:bookmarkEnd w:id="182"/>
+    <w:bookmarkStart w:id="183" w:name="ref-schreck2024plasmode"/>
     <w:p>
       <w:pPr>
         <w:pStyle w:val="Bibliography"/>
@@ -29931,8 +30040,8 @@
         <w:t xml:space="preserve">.</w:t>
       </w:r>
     </w:p>
-    <w:bookmarkEnd w:id="179"/>
-    <w:bookmarkStart w:id="181" w:name="ref-schuler2017tmle"/>
+    <w:bookmarkEnd w:id="183"/>
+    <w:bookmarkStart w:id="185" w:name="ref-schuler2017tmle"/>
     <w:p>
       <w:pPr>
         <w:pStyle w:val="Bibliography"/>
@@ -29965,7 +30074,7 @@
       <w:r>
         <w:t xml:space="preserve"> </w:t>
       </w:r>
-      <w:hyperlink r:id="rId180">
+      <w:hyperlink r:id="rId184">
         <w:r>
           <w:rPr>
             <w:rStyle w:val="Hyperlink"/>
@@ -29977,8 +30086,8 @@
         <w:t xml:space="preserve">.</w:t>
       </w:r>
     </w:p>
-    <w:bookmarkEnd w:id="181"/>
-    <w:bookmarkStart w:id="183" w:name="ref-fda2018rwe"/>
+    <w:bookmarkEnd w:id="185"/>
+    <w:bookmarkStart w:id="187" w:name="ref-fda2018rwe"/>
     <w:p>
       <w:pPr>
         <w:pStyle w:val="Bibliography"/>
@@ -30007,7 +30116,7 @@
       <w:r>
         <w:t xml:space="preserve"> </w:t>
       </w:r>
-      <w:hyperlink r:id="rId182">
+      <w:hyperlink r:id="rId186">
         <w:r>
           <w:rPr>
             <w:rStyle w:val="Hyperlink"/>
@@ -30019,8 +30128,8 @@
         <w:t xml:space="preserve">.</w:t>
       </w:r>
     </w:p>
-    <w:bookmarkEnd w:id="183"/>
-    <w:bookmarkStart w:id="185" w:name="ref-fda2021registries"/>
+    <w:bookmarkEnd w:id="187"/>
+    <w:bookmarkStart w:id="189" w:name="ref-fda2021registries"/>
     <w:p>
       <w:pPr>
         <w:pStyle w:val="Bibliography"/>
@@ -30037,7 +30146,7 @@
       <w:r>
         <w:t xml:space="preserve"> </w:t>
       </w:r>
-      <w:hyperlink r:id="rId184">
+      <w:hyperlink r:id="rId188">
         <w:r>
           <w:rPr>
             <w:rStyle w:val="Hyperlink"/>
@@ -30049,8 +30158,8 @@
         <w:t xml:space="preserve">.</w:t>
       </w:r>
     </w:p>
-    <w:bookmarkEnd w:id="185"/>
-    <w:bookmarkStart w:id="187" w:name="ref-fda2024considerations"/>
+    <w:bookmarkEnd w:id="189"/>
+    <w:bookmarkStart w:id="191" w:name="ref-fda2024considerations"/>
     <w:p>
       <w:pPr>
         <w:pStyle w:val="Bibliography"/>
@@ -30067,7 +30176,7 @@
       <w:r>
         <w:t xml:space="preserve"> </w:t>
       </w:r>
-      <w:hyperlink r:id="rId186">
+      <w:hyperlink r:id="rId190">
         <w:r>
           <w:rPr>
             <w:rStyle w:val="Hyperlink"/>
@@ -30079,8 +30188,8 @@
         <w:t xml:space="preserve">.</w:t>
       </w:r>
     </w:p>
-    <w:bookmarkEnd w:id="187"/>
-    <w:bookmarkStart w:id="189" w:name="ref-fda2024ehrclaims"/>
+    <w:bookmarkEnd w:id="191"/>
+    <w:bookmarkStart w:id="193" w:name="ref-fda2024ehrclaims"/>
     <w:p>
       <w:pPr>
         <w:pStyle w:val="Bibliography"/>
@@ -30097,7 +30206,7 @@
       <w:r>
         <w:t xml:space="preserve"> </w:t>
       </w:r>
-      <w:hyperlink r:id="rId188">
+      <w:hyperlink r:id="rId192">
         <w:r>
           <w:rPr>
             <w:rStyle w:val="Hyperlink"/>
@@ -30109,8 +30218,8 @@
         <w:t xml:space="preserve">.</w:t>
       </w:r>
     </w:p>
-    <w:bookmarkEnd w:id="189"/>
-    <w:bookmarkStart w:id="191" w:name="ref-fda2024noninterventional"/>
+    <w:bookmarkEnd w:id="193"/>
+    <w:bookmarkStart w:id="195" w:name="ref-fda2024noninterventional"/>
     <w:p>
       <w:pPr>
         <w:pStyle w:val="Bibliography"/>
@@ -30127,7 +30236,7 @@
       <w:r>
         <w:t xml:space="preserve"> </w:t>
       </w:r>
-      <w:hyperlink r:id="rId190">
+      <w:hyperlink r:id="rId194">
         <w:r>
           <w:rPr>
             <w:rStyle w:val="Hyperlink"/>
@@ -30139,8 +30248,8 @@
         <w:t xml:space="preserve">.</w:t>
       </w:r>
     </w:p>
-    <w:bookmarkEnd w:id="191"/>
-    <w:bookmarkStart w:id="193" w:name="ref-vanderWeele2017evalue"/>
+    <w:bookmarkEnd w:id="195"/>
+    <w:bookmarkStart w:id="197" w:name="ref-vanderWeele2017evalue"/>
     <w:p>
       <w:pPr>
         <w:pStyle w:val="Bibliography"/>
@@ -30182,7 +30291,7 @@
       <w:r>
         <w:t xml:space="preserve"> </w:t>
       </w:r>
-      <w:hyperlink r:id="rId192">
+      <w:hyperlink r:id="rId196">
         <w:r>
           <w:rPr>
             <w:rStyle w:val="Hyperlink"/>
@@ -30194,8 +30303,8 @@
         <w:t xml:space="preserve">.</w:t>
       </w:r>
     </w:p>
-    <w:bookmarkEnd w:id="193"/>
-    <w:bookmarkStart w:id="195" w:name="ref-wang2021startrwe"/>
+    <w:bookmarkEnd w:id="197"/>
+    <w:bookmarkStart w:id="199" w:name="ref-wang2021startrwe"/>
     <w:p>
       <w:pPr>
         <w:pStyle w:val="Bibliography"/>
@@ -30234,7 +30343,7 @@
       <w:r>
         <w:t xml:space="preserve"> </w:t>
       </w:r>
-      <w:hyperlink r:id="rId194">
+      <w:hyperlink r:id="rId198">
         <w:r>
           <w:rPr>
             <w:rStyle w:val="Hyperlink"/>
@@ -30246,8 +30355,8 @@
         <w:t xml:space="preserve">.</w:t>
       </w:r>
     </w:p>
-    <w:bookmarkEnd w:id="195"/>
-    <w:bookmarkStart w:id="197" w:name="ref-wang2023harper"/>
+    <w:bookmarkEnd w:id="199"/>
+    <w:bookmarkStart w:id="201" w:name="ref-wang2023harper"/>
     <w:p>
       <w:pPr>
         <w:pStyle w:val="Bibliography"/>
@@ -30283,7 +30392,7 @@
       <w:r>
         <w:t xml:space="preserve"> </w:t>
       </w:r>
-      <w:hyperlink r:id="rId196">
+      <w:hyperlink r:id="rId200">
         <w:r>
           <w:rPr>
             <w:rStyle w:val="Hyperlink"/>
@@ -30295,8 +30404,8 @@
         <w:t xml:space="preserve">.</w:t>
       </w:r>
     </w:p>
-    <w:bookmarkEnd w:id="197"/>
-    <w:bookmarkStart w:id="198" w:name="ref-lmtppackage2021"/>
+    <w:bookmarkEnd w:id="201"/>
+    <w:bookmarkStart w:id="202" w:name="ref-lmtppackage2021"/>
     <w:p>
       <w:pPr>
         <w:pStyle w:val="Bibliography"/>
@@ -30311,8 +30420,8 @@
         <w:t xml:space="preserve">“Lmtp: Non-Parametric Causal Effects of Feasible Interventions Based on Modified Treatment Policies.”</w:t>
       </w:r>
     </w:p>
-    <w:bookmarkEnd w:id="198"/>
-    <w:bookmarkStart w:id="199" w:name="ref-xu2020bootstrap"/>
+    <w:bookmarkEnd w:id="202"/>
+    <w:bookmarkStart w:id="203" w:name="ref-xu2020bootstrap"/>
     <w:p>
       <w:pPr>
         <w:pStyle w:val="Bibliography"/>
@@ -30343,8 +30452,8 @@
         <w:t xml:space="preserve">74 (4): 345–58.</w:t>
       </w:r>
     </w:p>
-    <w:bookmarkEnd w:id="199"/>
-    <w:bookmarkStart w:id="200" w:name="ref-zheng2011crossvalidated"/>
+    <w:bookmarkEnd w:id="203"/>
+    <w:bookmarkStart w:id="204" w:name="ref-zheng2011crossvalidated"/>
     <w:p>
       <w:pPr>
         <w:pStyle w:val="Bibliography"/>
@@ -30378,8 +30487,8 @@
         <w:t xml:space="preserve">, 459–74. Springer.</w:t>
       </w:r>
     </w:p>
-    <w:bookmarkEnd w:id="200"/>
-    <w:bookmarkEnd w:id="201"/>
+    <w:bookmarkEnd w:id="204"/>
+    <w:bookmarkEnd w:id="205"/>
     <w:p>
       <w:pPr>
         <w:pStyle w:val="SourceCode"/>
@@ -30697,7 +30806,7 @@
         <w:t xml:space="preserve">R&gt;  [41] htmltools_0.5.8.1</w:t>
       </w:r>
     </w:p>
-    <w:bookmarkEnd w:id="202"/>
+    <w:bookmarkEnd w:id="206"/>
     <w:sectPr/>
   </w:body>
 </w:document>

</xml_diff>

<commit_message>
Re-render manuscript HTML+DOCX and presentation PPTX after dossier-pass edits
All four documents now reflect the pre-outcome dossier framing,
target-trial timing table, checkpoint dashboard, decision-log
example, and five new presentation slides committed in 5c02593.
</commit_message>
<xml_diff>
--- a/reports/manuscript_outcome_blind_dq.docx
+++ b/reports/manuscript_outcome_blind_dq.docx
@@ -1329,19 +1329,55 @@
         <w:t xml:space="preserve"> </w:t>
       </w:r>
       <w:r>
-        <w:t xml:space="preserve">decisions, and final authorization state. It does not implement</w:t>
-      </w:r>
-      <w:r>
-        <w:t xml:space="preserve"> </w:t>
-      </w:r>
-      <w:r>
-        <w:t xml:space="preserve">personnel separation, source-data access controls, protocol</w:t>
-      </w:r>
-      <w:r>
-        <w:t xml:space="preserve"> </w:t>
-      </w:r>
-      <w:r>
-        <w:t xml:space="preserve">adjudication, phenotype validation, or regulatory review.</w:t>
+        <w:t xml:space="preserve">decisions, and final authorisation state. cleanTMLE authorisation</w:t>
+      </w:r>
+      <w:r>
+        <w:t xml:space="preserve"> </w:t>
+      </w:r>
+      <w:r>
+        <w:t xml:space="preserve">checks restrict the package’s exported primary-analysis functions</w:t>
+      </w:r>
+      <w:r>
+        <w:t xml:space="preserve"> </w:t>
+      </w:r>
+      <w:r>
+        <w:t xml:space="preserve">until the required checkpoints have been recorded. These checks</w:t>
+      </w:r>
+      <w:r>
+        <w:t xml:space="preserve"> </w:t>
+      </w:r>
+      <w:r>
+        <w:t xml:space="preserve">do not control raw-data access outside the package and therefore</w:t>
+      </w:r>
+      <w:r>
+        <w:t xml:space="preserve"> </w:t>
+      </w:r>
+      <w:r>
+        <w:t xml:space="preserve">complement, but do not replace, institutional clean-room</w:t>
+      </w:r>
+      <w:r>
+        <w:t xml:space="preserve"> </w:t>
+      </w:r>
+      <w:r>
+        <w:t xml:space="preserve">safeguards such as role separation, credentialed folders, and</w:t>
+      </w:r>
+      <w:r>
+        <w:t xml:space="preserve"> </w:t>
+      </w:r>
+      <w:r>
+        <w:t xml:space="preserve">review-team checkpoints. The package does not implement personnel</w:t>
+      </w:r>
+      <w:r>
+        <w:t xml:space="preserve"> </w:t>
+      </w:r>
+      <w:r>
+        <w:t xml:space="preserve">separation, source-data access controls, protocol adjudication,</w:t>
+      </w:r>
+      <w:r>
+        <w:t xml:space="preserve"> </w:t>
+      </w:r>
+      <w:r>
+        <w:t xml:space="preserve">phenotype validation, or regulatory review.</w:t>
       </w:r>
     </w:p>
     <w:p>
@@ -5923,7 +5959,7 @@
     </w:p>
     <w:bookmarkEnd w:id="42"/>
     <w:bookmarkEnd w:id="43"/>
-    <w:bookmarkStart w:id="49" w:name="sec-framework"/>
+    <w:bookmarkStart w:id="50" w:name="sec-framework"/>
     <w:p>
       <w:pPr>
         <w:pStyle w:val="Heading1"/>
@@ -6501,6 +6537,77 @@
       </w:r>
       <w:r>
         <w:t xml:space="preserve">scenarios derived from the fit-for-purpose review.</w:t>
+      </w:r>
+    </w:p>
+    <w:p>
+      <w:pPr>
+        <w:pStyle w:val="BodyText"/>
+      </w:pPr>
+      <w:r>
+        <w:t xml:space="preserve">Clean-room guidance addresses a limitation of preregistration:</w:t>
+      </w:r>
+      <w:r>
+        <w:t xml:space="preserve"> </w:t>
+      </w:r>
+      <w:r>
+        <w:t xml:space="preserve">during RWE execution, investigators often encounter data</w:t>
+      </w:r>
+      <w:r>
+        <w:t xml:space="preserve"> </w:t>
+      </w:r>
+      <w:r>
+        <w:t xml:space="preserve">incompleteness, coding limitations, sparse events, covariate</w:t>
+      </w:r>
+      <w:r>
+        <w:t xml:space="preserve"> </w:t>
+      </w:r>
+      <w:r>
+        <w:t xml:space="preserve">imbalance, model-convergence problems, and censoring or</w:t>
+      </w:r>
+      <w:r>
+        <w:t xml:space="preserve"> </w:t>
+      </w:r>
+      <w:r>
+        <w:t xml:space="preserve">missingness issues that require decisions after data access but</w:t>
+      </w:r>
+      <w:r>
+        <w:t xml:space="preserve"> </w:t>
+      </w:r>
+      <w:r>
+        <w:t xml:space="preserve">before comparative effect estimation</w:t>
+      </w:r>
+      <w:r>
+        <w:t xml:space="preserve"> </w:t>
+      </w:r>
+      <w:r>
+        <w:t xml:space="preserve">(McGrath et al. 2021; Muntner et al. 2024)</w:t>
+      </w:r>
+      <w:r>
+        <w:t xml:space="preserve">. cleanTMLE</w:t>
+      </w:r>
+      <w:r>
+        <w:t xml:space="preserve"> </w:t>
+      </w:r>
+      <w:r>
+        <w:t xml:space="preserve">operationalises the software portion of this process by recording</w:t>
+      </w:r>
+      <w:r>
+        <w:t xml:space="preserve"> </w:t>
+      </w:r>
+      <w:r>
+        <w:t xml:space="preserve">pre-outcome diagnostics, checkpoint decisions, deviations, and</w:t>
+      </w:r>
+      <w:r>
+        <w:t xml:space="preserve"> </w:t>
+      </w:r>
+      <w:r>
+        <w:t xml:space="preserve">authorisation status before the observed primary</w:t>
+      </w:r>
+      <w:r>
+        <w:t xml:space="preserve"> </w:t>
+      </w:r>
+      <w:r>
+        <w:t xml:space="preserve">treatment-outcome association is estimated.</w:t>
       </w:r>
     </w:p>
     <w:bookmarkEnd w:id="44"/>
@@ -7514,8 +7621,717 @@
     </w:p>
     <w:bookmarkEnd w:id="47"/>
     <w:bookmarkEnd w:id="48"/>
+    <w:bookmarkStart w:id="49" w:name="X8366091c17716bf729a771323a4e967384c878f"/>
+    <w:p>
+      <w:pPr>
+        <w:pStyle w:val="Heading2"/>
+      </w:pPr>
+      <w:r>
+        <w:t xml:space="preserve">4.4 Reviewer-facing pre-outcome study dossier</w:t>
+      </w:r>
+    </w:p>
+    <w:p>
+      <w:pPr>
+        <w:pStyle w:val="FirstParagraph"/>
+      </w:pPr>
+      <w:r>
+        <w:t xml:space="preserve">The pre-outcome study dossier is a structured bundle the review</w:t>
+      </w:r>
+      <w:r>
+        <w:t xml:space="preserve"> </w:t>
+      </w:r>
+      <w:r>
+        <w:t xml:space="preserve">team can read before authorising the primary analysis. It</w:t>
+      </w:r>
+      <w:r>
+        <w:t xml:space="preserve"> </w:t>
+      </w:r>
+      <w:r>
+        <w:t xml:space="preserve">consists of:</w:t>
+      </w:r>
+    </w:p>
+    <w:tbl>
+      <w:tblPr>
+        <w:tblStyle w:val="Table"/>
+        <w:tblW w:type="pct" w:w="5000"/>
+        <w:tblLayout w:type="fixed"/>
+        <w:tblLook w:firstRow="1" w:lastRow="0" w:firstColumn="0" w:lastColumn="0" w:noHBand="0" w:noVBand="0" w:val="0020"/>
+      </w:tblPr>
+      <w:tblGrid>
+        <w:gridCol w:w="2640"/>
+        <w:gridCol w:w="2640"/>
+        <w:gridCol w:w="2640"/>
+      </w:tblGrid>
+      <w:tr>
+        <w:trPr>
+          <w:tblHeader w:val="on"/>
+        </w:trPr>
+        <w:tc>
+          <w:tcPr/>
+          <w:p>
+            <w:pPr>
+              <w:pStyle w:val="Compact"/>
+            </w:pPr>
+            <w:r>
+              <w:t xml:space="preserve">Component</w:t>
+            </w:r>
+          </w:p>
+        </w:tc>
+        <w:tc>
+          <w:tcPr/>
+          <w:p>
+            <w:pPr>
+              <w:pStyle w:val="Compact"/>
+            </w:pPr>
+            <w:r>
+              <w:t xml:space="preserve">cleanTMLE artefact</w:t>
+            </w:r>
+          </w:p>
+        </w:tc>
+        <w:tc>
+          <w:tcPr/>
+          <w:p>
+            <w:pPr>
+              <w:pStyle w:val="Compact"/>
+            </w:pPr>
+            <w:r>
+              <w:t xml:space="preserve">Outcome access</w:t>
+            </w:r>
+          </w:p>
+        </w:tc>
+      </w:tr>
+      <w:tr>
+        <w:tc>
+          <w:tcPr/>
+          <w:p>
+            <w:pPr>
+              <w:pStyle w:val="Compact"/>
+            </w:pPr>
+            <w:r>
+              <w:t xml:space="preserve">Protocol and target-trial timing</w:t>
+            </w:r>
+          </w:p>
+        </w:tc>
+        <w:tc>
+          <w:tcPr/>
+          <w:p>
+            <w:pPr>
+              <w:pStyle w:val="Compact"/>
+            </w:pPr>
+            <w:r>
+              <w:rPr>
+                <w:rStyle w:val="VerbatimChar"/>
+              </w:rPr>
+              <w:t xml:space="preserve">attach_estimand()</w:t>
+            </w:r>
+            <w:r>
+              <w:t xml:space="preserve"> </w:t>
+            </w:r>
+            <w:r>
+              <w:t xml:space="preserve">+ target-trial timing table</w:t>
+            </w:r>
+          </w:p>
+        </w:tc>
+        <w:tc>
+          <w:tcPr/>
+          <w:p>
+            <w:pPr>
+              <w:pStyle w:val="Compact"/>
+            </w:pPr>
+            <w:r>
+              <w:t xml:space="preserve">No Y</w:t>
+            </w:r>
+          </w:p>
+        </w:tc>
+      </w:tr>
+      <w:tr>
+        <w:tc>
+          <w:tcPr/>
+          <w:p>
+            <w:pPr>
+              <w:pStyle w:val="Compact"/>
+            </w:pPr>
+            <w:r>
+              <w:t xml:space="preserve">Cohort flow / attrition</w:t>
+            </w:r>
+          </w:p>
+        </w:tc>
+        <w:tc>
+          <w:tcPr/>
+          <w:p>
+            <w:pPr>
+              <w:pStyle w:val="Compact"/>
+            </w:pPr>
+            <w:r>
+              <w:rPr>
+                <w:rStyle w:val="VerbatimChar"/>
+              </w:rPr>
+              <w:t xml:space="preserve">attrition_table()</w:t>
+            </w:r>
+          </w:p>
+        </w:tc>
+        <w:tc>
+          <w:tcPr/>
+          <w:p>
+            <w:pPr>
+              <w:pStyle w:val="Compact"/>
+            </w:pPr>
+            <w:r>
+              <w:t xml:space="preserve">No Y</w:t>
+            </w:r>
+          </w:p>
+        </w:tc>
+      </w:tr>
+      <w:tr>
+        <w:tc>
+          <w:tcPr/>
+          <w:p>
+            <w:pPr>
+              <w:pStyle w:val="Compact"/>
+            </w:pPr>
+            <w:r>
+              <w:t xml:space="preserve">Event-process classification</w:t>
+            </w:r>
+          </w:p>
+        </w:tc>
+        <w:tc>
+          <w:tcPr/>
+          <w:p>
+            <w:pPr>
+              <w:pStyle w:val="Compact"/>
+            </w:pPr>
+            <w:r>
+              <w:rPr>
+                <w:rStyle w:val="VerbatimChar"/>
+              </w:rPr>
+              <w:t xml:space="preserve">clean_event_process_table()</w:t>
+            </w:r>
+            <w:r>
+              <w:t xml:space="preserve">,</w:t>
+            </w:r>
+            <w:r>
+              <w:t xml:space="preserve"> </w:t>
+            </w:r>
+            <w:r>
+              <w:rPr>
+                <w:rStyle w:val="VerbatimChar"/>
+              </w:rPr>
+              <w:t xml:space="preserve">clean_check_event_processes()</w:t>
+            </w:r>
+          </w:p>
+        </w:tc>
+        <w:tc>
+          <w:tcPr/>
+          <w:p>
+            <w:pPr>
+              <w:pStyle w:val="Compact"/>
+            </w:pPr>
+            <w:r>
+              <w:t xml:space="preserve">No Y</w:t>
+            </w:r>
+          </w:p>
+        </w:tc>
+      </w:tr>
+      <w:tr>
+        <w:tc>
+          <w:tcPr/>
+          <w:p>
+            <w:pPr>
+              <w:pStyle w:val="Compact"/>
+            </w:pPr>
+            <w:r>
+              <w:t xml:space="preserve">Covariate and missingness summary</w:t>
+            </w:r>
+          </w:p>
+        </w:tc>
+        <w:tc>
+          <w:tcPr/>
+          <w:p>
+            <w:pPr>
+              <w:pStyle w:val="Compact"/>
+            </w:pPr>
+            <w:r>
+              <w:rPr>
+                <w:rStyle w:val="VerbatimChar"/>
+              </w:rPr>
+              <w:t xml:space="preserve">make_table1()</w:t>
+            </w:r>
+            <w:r>
+              <w:t xml:space="preserve">, missingness-pattern checks</w:t>
+            </w:r>
+          </w:p>
+        </w:tc>
+        <w:tc>
+          <w:tcPr/>
+          <w:p>
+            <w:pPr>
+              <w:pStyle w:val="Compact"/>
+            </w:pPr>
+            <w:r>
+              <w:t xml:space="preserve">No Y</w:t>
+            </w:r>
+          </w:p>
+        </w:tc>
+      </w:tr>
+      <w:tr>
+        <w:tc>
+          <w:tcPr/>
+          <w:p>
+            <w:pPr>
+              <w:pStyle w:val="Compact"/>
+            </w:pPr>
+            <w:r>
+              <w:t xml:space="preserve">PS overlap and balance</w:t>
+            </w:r>
+          </w:p>
+        </w:tc>
+        <w:tc>
+          <w:tcPr/>
+          <w:p>
+            <w:pPr>
+              <w:pStyle w:val="Compact"/>
+            </w:pPr>
+            <w:r>
+              <w:rPr>
+                <w:rStyle w:val="VerbatimChar"/>
+              </w:rPr>
+              <w:t xml:space="preserve">compute_ps_diagnostics()</w:t>
+            </w:r>
+            <w:r>
+              <w:t xml:space="preserve">,</w:t>
+            </w:r>
+            <w:r>
+              <w:t xml:space="preserve"> </w:t>
+            </w:r>
+            <w:r>
+              <w:rPr>
+                <w:rStyle w:val="VerbatimChar"/>
+              </w:rPr>
+              <w:t xml:space="preserve">love_plot()</w:t>
+            </w:r>
+            <w:r>
+              <w:t xml:space="preserve">,</w:t>
+            </w:r>
+            <w:r>
+              <w:t xml:space="preserve"> </w:t>
+            </w:r>
+            <w:r>
+              <w:rPr>
+                <w:rStyle w:val="VerbatimChar"/>
+              </w:rPr>
+              <w:t xml:space="preserve">love_plot_threeway()</w:t>
+            </w:r>
+          </w:p>
+        </w:tc>
+        <w:tc>
+          <w:tcPr/>
+          <w:p>
+            <w:pPr>
+              <w:pStyle w:val="Compact"/>
+            </w:pPr>
+            <w:r>
+              <w:t xml:space="preserve">No Y</w:t>
+            </w:r>
+          </w:p>
+        </w:tc>
+      </w:tr>
+      <w:tr>
+        <w:tc>
+          <w:tcPr/>
+          <w:p>
+            <w:pPr>
+              <w:pStyle w:val="Compact"/>
+            </w:pPr>
+            <w:r>
+              <w:t xml:space="preserve">Treatment- and IPCW-weight diagnostics</w:t>
+            </w:r>
+          </w:p>
+        </w:tc>
+        <w:tc>
+          <w:tcPr/>
+          <w:p>
+            <w:pPr>
+              <w:pStyle w:val="Compact"/>
+            </w:pPr>
+            <w:r>
+              <w:rPr>
+                <w:rStyle w:val="VerbatimChar"/>
+              </w:rPr>
+              <w:t xml:space="preserve">clean_weight_diagnostics()</w:t>
+            </w:r>
+            <w:r>
+              <w:t xml:space="preserve">,</w:t>
+            </w:r>
+            <w:r>
+              <w:t xml:space="preserve"> </w:t>
+            </w:r>
+            <w:r>
+              <w:rPr>
+                <w:rStyle w:val="VerbatimChar"/>
+              </w:rPr>
+              <w:t xml:space="preserve">extreme_weights()</w:t>
+            </w:r>
+          </w:p>
+        </w:tc>
+        <w:tc>
+          <w:tcPr/>
+          <w:p>
+            <w:pPr>
+              <w:pStyle w:val="Compact"/>
+            </w:pPr>
+            <w:r>
+              <w:t xml:space="preserve">No Y</w:t>
+            </w:r>
+          </w:p>
+        </w:tc>
+      </w:tr>
+      <w:tr>
+        <w:tc>
+          <w:tcPr/>
+          <w:p>
+            <w:pPr>
+              <w:pStyle w:val="Compact"/>
+            </w:pPr>
+            <w:r>
+              <w:t xml:space="preserve">Event-count and precision adequacy</w:t>
+            </w:r>
+          </w:p>
+        </w:tc>
+        <w:tc>
+          <w:tcPr/>
+          <w:p>
+            <w:pPr>
+              <w:pStyle w:val="Compact"/>
+            </w:pPr>
+            <w:r>
+              <w:rPr>
+                <w:rStyle w:val="VerbatimChar"/>
+              </w:rPr>
+              <w:t xml:space="preserve">checkpoint_cohort_adequacy()</w:t>
+            </w:r>
+            <w:r>
+              <w:t xml:space="preserve">,</w:t>
+            </w:r>
+            <w:r>
+              <w:t xml:space="preserve"> </w:t>
+            </w:r>
+            <w:r>
+              <w:rPr>
+                <w:rStyle w:val="VerbatimChar"/>
+              </w:rPr>
+              <w:t xml:space="preserve">estimate_design_precision()</w:t>
+            </w:r>
+          </w:p>
+        </w:tc>
+        <w:tc>
+          <w:tcPr/>
+          <w:p>
+            <w:pPr>
+              <w:pStyle w:val="Compact"/>
+            </w:pPr>
+            <w:r>
+              <w:t xml:space="preserve">Marginal Y only</w:t>
+            </w:r>
+          </w:p>
+        </w:tc>
+      </w:tr>
+      <w:tr>
+        <w:tc>
+          <w:tcPr/>
+          <w:p>
+            <w:pPr>
+              <w:pStyle w:val="Compact"/>
+            </w:pPr>
+            <w:r>
+              <w:t xml:space="preserve">Baseline plasmode candidate selection</w:t>
+            </w:r>
+          </w:p>
+        </w:tc>
+        <w:tc>
+          <w:tcPr/>
+          <w:p>
+            <w:pPr>
+              <w:pStyle w:val="Compact"/>
+            </w:pPr>
+            <w:r>
+              <w:rPr>
+                <w:rStyle w:val="VerbatimChar"/>
+              </w:rPr>
+              <w:t xml:space="preserve">run_plasmode_feasibility()</w:t>
+            </w:r>
+            <w:r>
+              <w:t xml:space="preserve">,</w:t>
+            </w:r>
+            <w:r>
+              <w:t xml:space="preserve"> </w:t>
+            </w:r>
+            <w:r>
+              <w:rPr>
+                <w:rStyle w:val="VerbatimChar"/>
+              </w:rPr>
+              <w:t xml:space="preserve">select_tmle_candidate()</w:t>
+            </w:r>
+          </w:p>
+        </w:tc>
+        <w:tc>
+          <w:tcPr/>
+          <w:p>
+            <w:pPr>
+              <w:pStyle w:val="Compact"/>
+            </w:pPr>
+            <w:r>
+              <w:t xml:space="preserve">Synthetic Y only</w:t>
+            </w:r>
+          </w:p>
+        </w:tc>
+      </w:tr>
+      <w:tr>
+        <w:tc>
+          <w:tcPr/>
+          <w:p>
+            <w:pPr>
+              <w:pStyle w:val="Compact"/>
+            </w:pPr>
+            <w:r>
+              <w:t xml:space="preserve">DQ stress-test results</w:t>
+            </w:r>
+          </w:p>
+        </w:tc>
+        <w:tc>
+          <w:tcPr/>
+          <w:p>
+            <w:pPr>
+              <w:pStyle w:val="Compact"/>
+            </w:pPr>
+            <w:r>
+              <w:rPr>
+                <w:rStyle w:val="VerbatimChar"/>
+              </w:rPr>
+              <w:t xml:space="preserve">run_plasmode_dq_stress()</w:t>
+            </w:r>
+            <w:r>
+              <w:t xml:space="preserve">,</w:t>
+            </w:r>
+            <w:r>
+              <w:t xml:space="preserve"> </w:t>
+            </w:r>
+            <w:r>
+              <w:rPr>
+                <w:rStyle w:val="VerbatimChar"/>
+              </w:rPr>
+              <w:t xml:space="preserve">summarize_dq_degradation()</w:t>
+            </w:r>
+          </w:p>
+        </w:tc>
+        <w:tc>
+          <w:tcPr/>
+          <w:p>
+            <w:pPr>
+              <w:pStyle w:val="Compact"/>
+            </w:pPr>
+            <w:r>
+              <w:t xml:space="preserve">Synthetic Y only</w:t>
+            </w:r>
+          </w:p>
+        </w:tc>
+      </w:tr>
+      <w:tr>
+        <w:tc>
+          <w:tcPr/>
+          <w:p>
+            <w:pPr>
+              <w:pStyle w:val="Compact"/>
+            </w:pPr>
+            <w:r>
+              <w:t xml:space="preserve">Negative-control eligibility and attrition</w:t>
+            </w:r>
+          </w:p>
+        </w:tc>
+        <w:tc>
+          <w:tcPr/>
+          <w:p>
+            <w:pPr>
+              <w:pStyle w:val="Compact"/>
+            </w:pPr>
+            <w:r>
+              <w:rPr>
+                <w:rStyle w:val="VerbatimChar"/>
+              </w:rPr>
+              <w:t xml:space="preserve">run_residual_confounding_stage()</w:t>
+            </w:r>
+            <w:r>
+              <w:t xml:space="preserve">, NC attrition diagram</w:t>
+            </w:r>
+          </w:p>
+        </w:tc>
+        <w:tc>
+          <w:tcPr/>
+          <w:p>
+            <w:pPr>
+              <w:pStyle w:val="Compact"/>
+            </w:pPr>
+            <w:r>
+              <w:t xml:space="preserve">Negative-control Y only</w:t>
+            </w:r>
+          </w:p>
+        </w:tc>
+      </w:tr>
+      <w:tr>
+        <w:tc>
+          <w:tcPr/>
+          <w:p>
+            <w:pPr>
+              <w:pStyle w:val="Compact"/>
+            </w:pPr>
+            <w:r>
+              <w:t xml:space="preserve">GO / FLAG / STOP checkpoint dashboard</w:t>
+            </w:r>
+          </w:p>
+        </w:tc>
+        <w:tc>
+          <w:tcPr/>
+          <w:p>
+            <w:pPr>
+              <w:pStyle w:val="Compact"/>
+            </w:pPr>
+            <w:r>
+              <w:rPr>
+                <w:rStyle w:val="VerbatimChar"/>
+              </w:rPr>
+              <w:t xml:space="preserve">gate_all()</w:t>
+            </w:r>
+            <w:r>
+              <w:t xml:space="preserve"> </w:t>
+            </w:r>
+            <w:r>
+              <w:t xml:space="preserve">composite + per-checkpoint records</w:t>
+            </w:r>
+          </w:p>
+        </w:tc>
+        <w:tc>
+          <w:tcPr/>
+          <w:p>
+            <w:pPr>
+              <w:pStyle w:val="Compact"/>
+            </w:pPr>
+            <w:r>
+              <w:t xml:space="preserve">No Y</w:t>
+            </w:r>
+          </w:p>
+        </w:tc>
+      </w:tr>
+      <w:tr>
+        <w:tc>
+          <w:tcPr/>
+          <w:p>
+            <w:pPr>
+              <w:pStyle w:val="Compact"/>
+            </w:pPr>
+            <w:r>
+              <w:t xml:space="preserve">Decision log and audit log export</w:t>
+            </w:r>
+          </w:p>
+        </w:tc>
+        <w:tc>
+          <w:tcPr/>
+          <w:p>
+            <w:pPr>
+              <w:pStyle w:val="Compact"/>
+            </w:pPr>
+            <w:r>
+              <w:rPr>
+                <w:rStyle w:val="VerbatimChar"/>
+              </w:rPr>
+              <w:t xml:space="preserve">export_decision_log()</w:t>
+            </w:r>
+            <w:r>
+              <w:t xml:space="preserve">,</w:t>
+            </w:r>
+            <w:r>
+              <w:t xml:space="preserve"> </w:t>
+            </w:r>
+            <w:r>
+              <w:rPr>
+                <w:rStyle w:val="VerbatimChar"/>
+              </w:rPr>
+              <w:t xml:space="preserve">save_decision_log()</w:t>
+            </w:r>
+          </w:p>
+        </w:tc>
+        <w:tc>
+          <w:tcPr/>
+          <w:p>
+            <w:pPr>
+              <w:pStyle w:val="Compact"/>
+            </w:pPr>
+            <w:r>
+              <w:t xml:space="preserve">No Y</w:t>
+            </w:r>
+          </w:p>
+        </w:tc>
+      </w:tr>
+      <w:tr>
+        <w:tc>
+          <w:tcPr/>
+          <w:p>
+            <w:pPr>
+              <w:pStyle w:val="Compact"/>
+            </w:pPr>
+            <w:r>
+              <w:t xml:space="preserve">Authorisation record for primary analysis</w:t>
+            </w:r>
+          </w:p>
+        </w:tc>
+        <w:tc>
+          <w:tcPr/>
+          <w:p>
+            <w:pPr>
+              <w:pStyle w:val="Compact"/>
+            </w:pPr>
+            <w:r>
+              <w:rPr>
+                <w:rStyle w:val="VerbatimChar"/>
+              </w:rPr>
+              <w:t xml:space="preserve">authorize_outcome_analysis()</w:t>
+            </w:r>
+          </w:p>
+        </w:tc>
+        <w:tc>
+          <w:tcPr/>
+          <w:p>
+            <w:pPr>
+              <w:pStyle w:val="Compact"/>
+            </w:pPr>
+            <w:r>
+              <w:t xml:space="preserve">No Y</w:t>
+            </w:r>
+          </w:p>
+        </w:tc>
+      </w:tr>
+    </w:tbl>
+    <w:p>
+      <w:pPr>
+        <w:pStyle w:val="BodyText"/>
+      </w:pPr>
+      <w:r>
+        <w:t xml:space="preserve">The dossier is the artefact the reviewer reads. Comparative</w:t>
+      </w:r>
+      <w:r>
+        <w:t xml:space="preserve"> </w:t>
+      </w:r>
+      <w:r>
+        <w:t xml:space="preserve">treatment-outcome estimates are not part of the dossier and are</w:t>
+      </w:r>
+      <w:r>
+        <w:t xml:space="preserve"> </w:t>
+      </w:r>
+      <w:r>
+        <w:t xml:space="preserve">produced only after authorisation.</w:t>
+      </w:r>
+    </w:p>
     <w:bookmarkEnd w:id="49"/>
-    <w:bookmarkStart w:id="56" w:name="sec-dq"/>
+    <w:bookmarkEnd w:id="50"/>
+    <w:bookmarkStart w:id="57" w:name="sec-dq"/>
     <w:p>
       <w:pPr>
         <w:pStyle w:val="Heading1"/>
@@ -7524,7 +8340,7 @@
         <w:t xml:space="preserve">5. Data Quality as a Quantifiable Threat</w:t>
       </w:r>
     </w:p>
-    <w:bookmarkStart w:id="50" w:name="X262475fd6dc51a12a4d5d933c1148a3024c08ab"/>
+    <w:bookmarkStart w:id="51" w:name="X262475fd6dc51a12a4d5d933c1148a3024c08ab"/>
     <w:p>
       <w:pPr>
         <w:pStyle w:val="Heading2"/>
@@ -7935,8 +8751,8 @@
         <w:t xml:space="preserve">behaviour under prespecified perturbations.</w:t>
       </w:r>
     </w:p>
-    <w:bookmarkEnd w:id="50"/>
-    <w:bookmarkStart w:id="51" w:name="X4f009c1ca2a345c3f9f27806faafdc4c5929f9a"/>
+    <w:bookmarkEnd w:id="51"/>
+    <w:bookmarkStart w:id="52" w:name="X4f009c1ca2a345c3f9f27806faafdc4c5929f9a"/>
     <w:p>
       <w:pPr>
         <w:pStyle w:val="Heading2"/>
@@ -8395,8 +9211,8 @@
         <w:t xml:space="preserve">elements (covariate availability, missingness handling).</w:t>
       </w:r>
     </w:p>
-    <w:bookmarkEnd w:id="51"/>
-    <w:bookmarkStart w:id="52" w:name="the-degradation-gradient"/>
+    <w:bookmarkEnd w:id="52"/>
+    <w:bookmarkStart w:id="53" w:name="the-degradation-gradient"/>
     <w:p>
       <w:pPr>
         <w:pStyle w:val="Heading2"/>
@@ -8607,8 +9423,8 @@
         <w:t xml:space="preserve">post-hoc on the realised data.</w:t>
       </w:r>
     </w:p>
-    <w:bookmarkEnd w:id="52"/>
-    <w:bookmarkStart w:id="54" w:name="sec-threat-matrix"/>
+    <w:bookmarkEnd w:id="53"/>
+    <w:bookmarkStart w:id="55" w:name="sec-threat-matrix"/>
     <w:p>
       <w:pPr>
         <w:pStyle w:val="Heading2"/>
@@ -8766,7 +9582,7 @@
       <w:tr>
         <w:tc>
           <w:tcPr/>
-          <w:bookmarkStart w:id="53" w:name="tbl-threat-matrix"/>
+          <w:bookmarkStart w:id="54" w:name="tbl-threat-matrix"/>
           <w:p>
             <w:pPr>
               <w:jc w:val="center"/>
@@ -9285,7 +10101,7 @@
               </w:tc>
             </w:tr>
           </w:tbl>
-          <w:bookmarkEnd w:id="53"/>
+          <w:bookmarkEnd w:id="54"/>
           <w:p/>
         </w:tc>
       </w:tr>
@@ -9405,8 +10221,8 @@
         <w:t xml:space="preserve">in the simulation engine.</w:t>
       </w:r>
     </w:p>
-    <w:bookmarkEnd w:id="54"/>
-    <w:bookmarkStart w:id="55" w:name="sec-calibration"/>
+    <w:bookmarkEnd w:id="55"/>
+    <w:bookmarkStart w:id="56" w:name="sec-calibration"/>
     <w:p>
       <w:pPr>
         <w:pStyle w:val="Heading2"/>
@@ -9795,9 +10611,9 @@
         <w:t xml:space="preserve">).</w:t>
       </w:r>
     </w:p>
-    <w:bookmarkEnd w:id="55"/>
     <w:bookmarkEnd w:id="56"/>
-    <w:bookmarkStart w:id="61" w:name="sec-bridge"/>
+    <w:bookmarkEnd w:id="57"/>
+    <w:bookmarkStart w:id="62" w:name="sec-bridge"/>
     <w:p>
       <w:pPr>
         <w:pStyle w:val="Heading1"/>
@@ -9974,7 +10790,7 @@
         <w:t xml:space="preserve">Muntner et al. wording is one-to-one.</w:t>
       </w:r>
     </w:p>
-    <w:bookmarkStart w:id="57" w:name="X4870de5334a1d002935adfa59f8358a3c7029c6"/>
+    <w:bookmarkStart w:id="58" w:name="X4870de5334a1d002935adfa59f8358a3c7029c6"/>
     <w:p>
       <w:pPr>
         <w:pStyle w:val="Heading2"/>
@@ -10063,8 +10879,8 @@
         <w:t xml:space="preserve">scored against the prespecified decision rule.</w:t>
       </w:r>
     </w:p>
-    <w:bookmarkEnd w:id="57"/>
-    <w:bookmarkStart w:id="58" w:name="what-the-dq-supplement-adds"/>
+    <w:bookmarkEnd w:id="58"/>
+    <w:bookmarkStart w:id="59" w:name="what-the-dq-supplement-adds"/>
     <w:p>
       <w:pPr>
         <w:pStyle w:val="Heading2"/>
@@ -10370,8 +11186,8 @@
         <w:t xml:space="preserve">the decision.</w:t>
       </w:r>
     </w:p>
-    <w:bookmarkEnd w:id="58"/>
-    <w:bookmarkStart w:id="59" w:name="position-relative-to-other-bias-analyses"/>
+    <w:bookmarkEnd w:id="59"/>
+    <w:bookmarkStart w:id="60" w:name="position-relative-to-other-bias-analyses"/>
     <w:p>
       <w:pPr>
         <w:pStyle w:val="Heading2"/>
@@ -10533,8 +11349,8 @@
         <w:t xml:space="preserve">threat, at a different stage, with a different artifact.</w:t>
       </w:r>
     </w:p>
-    <w:bookmarkEnd w:id="59"/>
-    <w:bookmarkStart w:id="60" w:name="why-outcome-blind-matters-here"/>
+    <w:bookmarkEnd w:id="60"/>
+    <w:bookmarkStart w:id="61" w:name="why-outcome-blind-matters-here"/>
     <w:p>
       <w:pPr>
         <w:pStyle w:val="Heading2"/>
@@ -10761,9 +11577,9 @@
         <w:t xml:space="preserve">run.</w:t>
       </w:r>
     </w:p>
-    <w:bookmarkEnd w:id="60"/>
     <w:bookmarkEnd w:id="61"/>
-    <w:bookmarkStart w:id="67" w:name="sec-implementation"/>
+    <w:bookmarkEnd w:id="62"/>
+    <w:bookmarkStart w:id="68" w:name="sec-implementation"/>
     <w:p>
       <w:pPr>
         <w:pStyle w:val="Heading1"/>
@@ -10781,7 +11597,7 @@
         <w:t xml:space="preserve">run_plasmode_dq_stress()</w:t>
       </w:r>
     </w:p>
-    <w:bookmarkStart w:id="62" w:name="a-worked-workflow"/>
+    <w:bookmarkStart w:id="63" w:name="a-worked-workflow"/>
     <w:p>
       <w:pPr>
         <w:pStyle w:val="Heading2"/>
@@ -14083,8 +14899,8 @@
         <w:t xml:space="preserve">infrastructure on the analyst’s side.</w:t>
       </w:r>
     </w:p>
-    <w:bookmarkEnd w:id="62"/>
-    <w:bookmarkStart w:id="63" w:name="inside-run_plasmode_dq_stress"/>
+    <w:bookmarkEnd w:id="63"/>
+    <w:bookmarkStart w:id="64" w:name="inside-run_plasmode_dq_stress"/>
     <w:p>
       <w:pPr>
         <w:pStyle w:val="Heading2"/>
@@ -14410,8 +15226,8 @@
         <w:t xml:space="preserve">outcome ascertainment.</w:t>
       </w:r>
     </w:p>
-    <w:bookmarkEnd w:id="63"/>
-    <w:bookmarkStart w:id="64" w:name="cumulative-risk-workflow-considerations"/>
+    <w:bookmarkEnd w:id="64"/>
+    <w:bookmarkStart w:id="65" w:name="cumulative-risk-workflow-considerations"/>
     <w:p>
       <w:pPr>
         <w:pStyle w:val="Heading2"/>
@@ -14857,8 +15673,8 @@
         <w:t xml:space="preserve">proportional-hazards interpretation is scientifically justified.</w:t>
       </w:r>
     </w:p>
-    <w:bookmarkEnd w:id="64"/>
-    <w:bookmarkStart w:id="65" w:name="X0dca275365b1ea9fc0b3ffe97cd757b2bc51779"/>
+    <w:bookmarkEnd w:id="65"/>
+    <w:bookmarkStart w:id="66" w:name="X0dca275365b1ea9fc0b3ffe97cd757b2bc51779"/>
     <w:p>
       <w:pPr>
         <w:pStyle w:val="Heading2"/>
@@ -15188,8 +16004,8 @@
         <w:t xml:space="preserve">R&gt;  3         0.089 0.000000e+00   OK</w:t>
       </w:r>
     </w:p>
-    <w:bookmarkEnd w:id="65"/>
-    <w:bookmarkStart w:id="66" w:name="Xf50b5df1c7478f84a38ff2d616f12345ba7582f"/>
+    <w:bookmarkEnd w:id="66"/>
+    <w:bookmarkStart w:id="67" w:name="Xf50b5df1c7478f84a38ff2d616f12345ba7582f"/>
     <w:p>
       <w:pPr>
         <w:pStyle w:val="Heading2"/>
@@ -15299,9 +16115,9 @@
         <w:t xml:space="preserve">hazard-scale estimand declaration.</w:t>
       </w:r>
     </w:p>
-    <w:bookmarkEnd w:id="66"/>
     <w:bookmarkEnd w:id="67"/>
-    <w:bookmarkStart w:id="95" w:name="sec-simulation"/>
+    <w:bookmarkEnd w:id="68"/>
+    <w:bookmarkStart w:id="96" w:name="sec-simulation"/>
     <w:p>
       <w:pPr>
         <w:pStyle w:val="Heading1"/>
@@ -15310,7 +16126,7 @@
         <w:t xml:space="preserve">8. Simulation Study</w:t>
       </w:r>
     </w:p>
-    <w:bookmarkStart w:id="68" w:name="design"/>
+    <w:bookmarkStart w:id="69" w:name="design"/>
     <w:p>
       <w:pPr>
         <w:pStyle w:val="Heading2"/>
@@ -16009,8 +16825,8 @@
         <w:t xml:space="preserve">yields fifteen scenario × severity cells per Monte Carlo scenario.</w:t>
       </w:r>
     </w:p>
-    <w:bookmarkEnd w:id="68"/>
-    <w:bookmarkStart w:id="85" w:name="monte-carlo-results"/>
+    <w:bookmarkEnd w:id="69"/>
+    <w:bookmarkStart w:id="86" w:name="monte-carlo-results"/>
     <w:p>
       <w:pPr>
         <w:pStyle w:val="Heading2"/>
@@ -16019,7 +16835,7 @@
         <w:t xml:space="preserve">8.2 Monte Carlo results</w:t>
       </w:r>
     </w:p>
-    <w:bookmarkStart w:id="69" w:name="scenario-a-good-overlap-true-rd--0.02979"/>
+    <w:bookmarkStart w:id="70" w:name="scenario-a-good-overlap-true-rd--0.02979"/>
     <w:p>
       <w:pPr>
         <w:pStyle w:val="Heading3"/>
@@ -17084,8 +17900,8 @@
         </w:tc>
       </w:tr>
     </w:tbl>
-    <w:bookmarkEnd w:id="69"/>
-    <w:bookmarkStart w:id="70" w:name="X539d2e41b20619841b5f484f160273f03ef61dd"/>
+    <w:bookmarkEnd w:id="70"/>
+    <w:bookmarkStart w:id="71" w:name="X539d2e41b20619841b5f484f160273f03ef61dd"/>
     <w:p>
       <w:pPr>
         <w:pStyle w:val="Heading3"/>
@@ -18150,8 +18966,8 @@
         </w:tc>
       </w:tr>
     </w:tbl>
-    <w:bookmarkEnd w:id="70"/>
-    <w:bookmarkStart w:id="71" w:name="X5abe8fbf009ebf57dedb1ebf41d3907d23035c8"/>
+    <w:bookmarkEnd w:id="71"/>
+    <w:bookmarkStart w:id="72" w:name="X5abe8fbf009ebf57dedb1ebf41d3907d23035c8"/>
     <w:p>
       <w:pPr>
         <w:pStyle w:val="Heading3"/>
@@ -19216,8 +20032,8 @@
         </w:tc>
       </w:tr>
     </w:tbl>
-    <w:bookmarkEnd w:id="71"/>
-    <w:bookmarkStart w:id="84" w:name="interpretation"/>
+    <w:bookmarkEnd w:id="72"/>
+    <w:bookmarkStart w:id="85" w:name="interpretation"/>
     <w:p>
       <w:pPr>
         <w:pStyle w:val="Heading3"/>
@@ -19651,18 +20467,18 @@
           <wp:inline>
             <wp:extent cx="5334000" cy="6000750"/>
             <wp:effectExtent b="0" l="0" r="0" t="0"/>
-            <wp:docPr descr="Sampling distribution of the risk-difference estimate across Monte Carlo replicates. The dashed red line marks the true RD. Under unmeasured confounding (C), all estimators are shifted from the truth." title="" id="73" name="Picture"/>
+            <wp:docPr descr="Sampling distribution of the risk-difference estimate across Monte Carlo replicates. The dashed red line marks the true RD. Under unmeasured confounding (C), all estimators are shifted from the truth." title="" id="74" name="Picture"/>
             <a:graphic>
               <a:graphicData uri="http://schemas.openxmlformats.org/drawingml/2006/picture">
                 <pic:pic>
                   <pic:nvPicPr>
-                    <pic:cNvPr descr="manuscript_outcome_blind_dq_files/figure-docx/mc-boxplots-1.png" id="74" name="Picture"/>
+                    <pic:cNvPr descr="manuscript_outcome_blind_dq_files/figure-docx/mc-boxplots-1.png" id="75" name="Picture"/>
                     <pic:cNvPicPr>
                       <a:picLocks noChangeArrowheads="1" noChangeAspect="1"/>
                     </pic:cNvPicPr>
                   </pic:nvPicPr>
                   <pic:blipFill>
-                    <a:blip r:embed="rId72"/>
+                    <a:blip r:embed="rId73"/>
                     <a:stretch>
                       <a:fillRect/>
                     </a:stretch>
@@ -19706,18 +20522,18 @@
           <wp:inline>
             <wp:extent cx="5334000" cy="3333750"/>
             <wp:effectExtent b="0" l="0" r="0" t="0"/>
-            <wp:docPr descr="95% CI coverage by estimator and scenario. The dashed red line marks the nominal 95%." title="" id="76" name="Picture"/>
+            <wp:docPr descr="95% CI coverage by estimator and scenario. The dashed red line marks the nominal 95%." title="" id="77" name="Picture"/>
             <a:graphic>
               <a:graphicData uri="http://schemas.openxmlformats.org/drawingml/2006/picture">
                 <pic:pic>
                   <pic:nvPicPr>
-                    <pic:cNvPr descr="manuscript_outcome_blind_dq_files/figure-docx/coverage-bar-1.png" id="77" name="Picture"/>
+                    <pic:cNvPr descr="manuscript_outcome_blind_dq_files/figure-docx/coverage-bar-1.png" id="78" name="Picture"/>
                     <pic:cNvPicPr>
                       <a:picLocks noChangeArrowheads="1" noChangeAspect="1"/>
                     </pic:cNvPicPr>
                   </pic:nvPicPr>
                   <pic:blipFill>
-                    <a:blip r:embed="rId75"/>
+                    <a:blip r:embed="rId76"/>
                     <a:stretch>
                       <a:fillRect/>
                     </a:stretch>
@@ -19761,18 +20577,18 @@
           <wp:inline>
             <wp:extent cx="5334000" cy="3333750"/>
             <wp:effectExtent b="0" l="0" r="0" t="0"/>
-            <wp:docPr descr="Ratio of mean reported SE to empirical SD. Values near 1.0 indicate well-calibrated standard errors." title="" id="79" name="Picture"/>
+            <wp:docPr descr="Ratio of mean reported SE to empirical SD. Values near 1.0 indicate well-calibrated standard errors." title="" id="80" name="Picture"/>
             <a:graphic>
               <a:graphicData uri="http://schemas.openxmlformats.org/drawingml/2006/picture">
                 <pic:pic>
                   <pic:nvPicPr>
-                    <pic:cNvPr descr="manuscript_outcome_blind_dq_files/figure-docx/se-calibration-1.png" id="80" name="Picture"/>
+                    <pic:cNvPr descr="manuscript_outcome_blind_dq_files/figure-docx/se-calibration-1.png" id="81" name="Picture"/>
                     <pic:cNvPicPr>
                       <a:picLocks noChangeArrowheads="1" noChangeAspect="1"/>
                     </pic:cNvPicPr>
                   </pic:nvPicPr>
                   <pic:blipFill>
-                    <a:blip r:embed="rId78"/>
+                    <a:blip r:embed="rId79"/>
                     <a:stretch>
                       <a:fillRect/>
                     </a:stretch>
@@ -19816,18 +20632,18 @@
           <wp:inline>
             <wp:extent cx="5334000" cy="4000500"/>
             <wp:effectExtent b="0" l="0" r="0" t="0"/>
-            <wp:docPr descr="Forest plot of Monte Carlo mean estimates by estimator and scenario, with Monte Carlo 95 percent intervals. The dashed grey line marks each scenario’s true RD; the dashed red lines mark the prespecified |bias| decision threshold around the truth (max_abs_bias = 0.02). Candidates falling outside the red lines trip the locked decision rule for that scenario." title="" id="82" name="Picture"/>
+            <wp:docPr descr="Forest plot of Monte Carlo mean estimates by estimator and scenario, with Monte Carlo 95 percent intervals. The dashed grey line marks each scenario’s true RD; the dashed red lines mark the prespecified |bias| decision threshold around the truth (max_abs_bias = 0.02). Candidates falling outside the red lines trip the locked decision rule for that scenario." title="" id="83" name="Picture"/>
             <a:graphic>
               <a:graphicData uri="http://schemas.openxmlformats.org/drawingml/2006/picture">
                 <pic:pic>
                   <pic:nvPicPr>
-                    <pic:cNvPr descr="manuscript_outcome_blind_dq_files/figure-docx/mc-forest-1.png" id="83" name="Picture"/>
+                    <pic:cNvPr descr="manuscript_outcome_blind_dq_files/figure-docx/mc-forest-1.png" id="84" name="Picture"/>
                     <pic:cNvPicPr>
                       <a:picLocks noChangeArrowheads="1" noChangeAspect="1"/>
                     </pic:cNvPicPr>
                   </pic:nvPicPr>
                   <pic:blipFill>
-                    <a:blip r:embed="rId81"/>
+                    <a:blip r:embed="rId82"/>
                     <a:stretch>
                       <a:fillRect/>
                     </a:stretch>
@@ -19862,9 +20678,9 @@
         <w:t xml:space="preserve">Forest plot of Monte Carlo mean estimates by estimator and scenario, with Monte Carlo 95 percent intervals. The dashed grey line marks each scenario’s true RD; the dashed red lines mark the prespecified |bias| decision threshold around the truth (max_abs_bias = 0.02). Candidates falling outside the red lines trip the locked decision rule for that scenario.</w:t>
       </w:r>
     </w:p>
-    <w:bookmarkEnd w:id="84"/>
     <w:bookmarkEnd w:id="85"/>
-    <w:bookmarkStart w:id="93" w:name="plasmode-dq-stress-test-results"/>
+    <w:bookmarkEnd w:id="86"/>
+    <w:bookmarkStart w:id="94" w:name="plasmode-dq-stress-test-results"/>
     <w:p>
       <w:pPr>
         <w:pStyle w:val="Heading2"/>
@@ -19873,7 +20689,7 @@
         <w:t xml:space="preserve">8.3 Plasmode DQ stress-test results</w:t>
       </w:r>
     </w:p>
-    <w:bookmarkStart w:id="86" w:name="scenario-a-good-overlap"/>
+    <w:bookmarkStart w:id="87" w:name="scenario-a-good-overlap"/>
     <w:p>
       <w:pPr>
         <w:pStyle w:val="Heading3"/>
@@ -21026,8 +21842,8 @@
         </w:tc>
       </w:tr>
     </w:tbl>
-    <w:bookmarkEnd w:id="86"/>
-    <w:bookmarkStart w:id="87" w:name="scenario-b-marginal-overlap"/>
+    <w:bookmarkEnd w:id="87"/>
+    <w:bookmarkStart w:id="88" w:name="scenario-b-marginal-overlap"/>
     <w:p>
       <w:pPr>
         <w:pStyle w:val="Heading3"/>
@@ -22180,8 +22996,8 @@
         </w:tc>
       </w:tr>
     </w:tbl>
-    <w:bookmarkEnd w:id="87"/>
-    <w:bookmarkStart w:id="88" w:name="scenario-c-unmeasured-confounding"/>
+    <w:bookmarkEnd w:id="88"/>
+    <w:bookmarkStart w:id="89" w:name="scenario-c-unmeasured-confounding"/>
     <w:p>
       <w:pPr>
         <w:pStyle w:val="Heading3"/>
@@ -23334,8 +24150,8 @@
         </w:tc>
       </w:tr>
     </w:tbl>
-    <w:bookmarkEnd w:id="88"/>
-    <w:bookmarkStart w:id="92" w:name="reading-the-degradation-gradient"/>
+    <w:bookmarkEnd w:id="89"/>
+    <w:bookmarkStart w:id="93" w:name="reading-the-degradation-gradient"/>
     <w:p>
       <w:pPr>
         <w:pStyle w:val="Heading3"/>
@@ -23541,18 +24357,18 @@
           <wp:inline>
             <wp:extent cx="5334000" cy="6667500"/>
             <wp:effectExtent b="0" l="0" r="0" t="0"/>
-            <wp:docPr descr="Degradation gradient. Bias (top) and coverage (bottom) for the selected TMLE candidate at each severity level of each DQ scenario, faceted by Monte Carlo scenario." title="" id="90" name="Picture"/>
+            <wp:docPr descr="Degradation gradient. Bias (top) and coverage (bottom) for the selected TMLE candidate at each severity level of each DQ scenario, faceted by Monte Carlo scenario." title="" id="91" name="Picture"/>
             <a:graphic>
               <a:graphicData uri="http://schemas.openxmlformats.org/drawingml/2006/picture">
                 <pic:pic>
                   <pic:nvPicPr>
-                    <pic:cNvPr descr="manuscript_outcome_blind_dq_files/figure-docx/dq-gradient-plots-1.png" id="91" name="Picture"/>
+                    <pic:cNvPr descr="manuscript_outcome_blind_dq_files/figure-docx/dq-gradient-plots-1.png" id="92" name="Picture"/>
                     <pic:cNvPicPr>
                       <a:picLocks noChangeArrowheads="1" noChangeAspect="1"/>
                     </pic:cNvPicPr>
                   </pic:nvPicPr>
                   <pic:blipFill>
-                    <a:blip r:embed="rId89"/>
+                    <a:blip r:embed="rId90"/>
                     <a:stretch>
                       <a:fillRect/>
                     </a:stretch>
@@ -23587,9 +24403,9 @@
         <w:t xml:space="preserve">Degradation gradient. Bias (top) and coverage (bottom) for the selected TMLE candidate at each severity level of each DQ scenario, faceted by Monte Carlo scenario.</w:t>
       </w:r>
     </w:p>
-    <w:bookmarkEnd w:id="92"/>
     <w:bookmarkEnd w:id="93"/>
-    <w:bookmarkStart w:id="94" w:name="Xc769f44f9652981cc29f2e5d85e2df79384284d"/>
+    <w:bookmarkEnd w:id="94"/>
+    <w:bookmarkStart w:id="95" w:name="Xc769f44f9652981cc29f2e5d85e2df79384284d"/>
     <w:p>
       <w:pPr>
         <w:pStyle w:val="Heading2"/>
@@ -23893,9 +24709,9 @@
         </w:tc>
       </w:tr>
     </w:tbl>
-    <w:bookmarkEnd w:id="94"/>
     <w:bookmarkEnd w:id="95"/>
-    <w:bookmarkStart w:id="119" w:name="sec-casestudy"/>
+    <w:bookmarkEnd w:id="96"/>
+    <w:bookmarkStart w:id="120" w:name="sec-casestudy"/>
     <w:p>
       <w:pPr>
         <w:pStyle w:val="Heading1"/>
@@ -23904,7 +24720,7 @@
         <w:t xml:space="preserve">9. Case Study: Rescue.Co Kenya Trauma Registry</w:t>
       </w:r>
     </w:p>
-    <w:bookmarkStart w:id="96" w:name="why-a-real-data-workflow-demonstration"/>
+    <w:bookmarkStart w:id="97" w:name="why-a-real-data-workflow-demonstration"/>
     <w:p>
       <w:pPr>
         <w:pStyle w:val="Heading2"/>
@@ -24182,8 +24998,8 @@
         <w:t xml:space="preserve">fuel) screen for residual SES confounding.</w:t>
       </w:r>
     </w:p>
-    <w:bookmarkEnd w:id="96"/>
-    <w:bookmarkStart w:id="97" w:name="superlearner-library-specification"/>
+    <w:bookmarkEnd w:id="97"/>
+    <w:bookmarkStart w:id="98" w:name="superlearner-library-specification"/>
     <w:p>
       <w:pPr>
         <w:pStyle w:val="Heading2"/>
@@ -24355,8 +25171,8 @@
         <w:t xml:space="preserve">is degenerate. The rescueCo lock uses the same recommended library.</w:t>
       </w:r>
     </w:p>
-    <w:bookmarkEnd w:id="97"/>
-    <w:bookmarkStart w:id="103" w:name="cohort-estimand-and-pre-specification"/>
+    <w:bookmarkEnd w:id="98"/>
+    <w:bookmarkStart w:id="104" w:name="cohort-estimand-and-pre-specification"/>
     <w:p>
       <w:pPr>
         <w:pStyle w:val="Heading2"/>
@@ -24950,7 +25766,7 @@
         <w:t xml:space="preserve">the manuscript’s recommended minimax rule.</w:t>
       </w:r>
     </w:p>
-    <w:bookmarkStart w:id="101" w:name="cohort-flow"/>
+    <w:bookmarkStart w:id="102" w:name="cohort-flow"/>
     <w:p>
       <w:pPr>
         <w:pStyle w:val="Heading3"/>
@@ -24973,18 +25789,18 @@
           <wp:inline>
             <wp:extent cx="5334000" cy="5198553"/>
             <wp:effectExtent b="0" l="0" r="0" t="0"/>
-            <wp:docPr descr="" title="" id="99" name="Picture"/>
+            <wp:docPr descr="" title="" id="100" name="Picture"/>
             <a:graphic>
               <a:graphicData uri="http://schemas.openxmlformats.org/drawingml/2006/picture">
                 <pic:pic>
                   <pic:nvPicPr>
-                    <pic:cNvPr descr="manuscript_outcome_blind_dq_files\figure-docx\mermaid-figure-3.png" id="100" name="Picture"/>
+                    <pic:cNvPr descr="manuscript_outcome_blind_dq_files\figure-docx\mermaid-figure-3.png" id="101" name="Picture"/>
                     <pic:cNvPicPr>
                       <a:picLocks noChangeArrowheads="1" noChangeAspect="1"/>
                     </pic:cNvPicPr>
                   </pic:nvPicPr>
                   <pic:blipFill>
-                    <a:blip r:embed="rId98"/>
+                    <a:blip r:embed="rId99"/>
                     <a:stretch>
                       <a:fillRect/>
                     </a:stretch>
@@ -25025,8 +25841,8 @@
         <w:t xml:space="preserve"> </w:t>
       </w:r>
     </w:p>
-    <w:bookmarkEnd w:id="101"/>
-    <w:bookmarkStart w:id="102" w:name="analytic-setup-at-a-glance"/>
+    <w:bookmarkEnd w:id="102"/>
+    <w:bookmarkStart w:id="103" w:name="analytic-setup-at-a-glance"/>
     <w:p>
       <w:pPr>
         <w:pStyle w:val="Heading3"/>
@@ -26370,9 +27186,1805 @@
         <w:t xml:space="preserve">interchangeable estimators of the same parameter.</w:t>
       </w:r>
     </w:p>
-    <w:bookmarkEnd w:id="102"/>
+    <w:p>
+      <w:pPr>
+        <w:pStyle w:val="BodyText"/>
+      </w:pPr>
+      <w:r>
+        <w:rPr>
+          <w:b/>
+          <w:bCs/>
+        </w:rPr>
+        <w:t xml:space="preserve">Target-trial timing table.</w:t>
+      </w:r>
+      <w:r>
+        <w:t xml:space="preserve"> </w:t>
+      </w:r>
+      <w:r>
+        <w:t xml:space="preserve">The following table records the</w:t>
+      </w:r>
+      <w:r>
+        <w:t xml:space="preserve"> </w:t>
+      </w:r>
+      <w:r>
+        <w:t xml:space="preserve">prespecified target-trial design elements and their lock status</w:t>
+      </w:r>
+      <w:r>
+        <w:t xml:space="preserve"> </w:t>
+      </w:r>
+      <w:r>
+        <w:t xml:space="preserve">before any outcome access.</w:t>
+      </w:r>
+    </w:p>
+    <w:tbl>
+      <w:tblPr>
+        <w:tblStyle w:val="Table"/>
+        <w:tblW w:type="pct" w:w="5000"/>
+        <w:tblLayout w:type="fixed"/>
+        <w:tblLook w:firstRow="1" w:lastRow="0" w:firstColumn="0" w:lastColumn="0" w:noHBand="0" w:noVBand="0" w:val="0020"/>
+      </w:tblPr>
+      <w:tblGrid>
+        <w:gridCol w:w="2640"/>
+        <w:gridCol w:w="2640"/>
+        <w:gridCol w:w="2640"/>
+      </w:tblGrid>
+      <w:tr>
+        <w:trPr>
+          <w:tblHeader w:val="on"/>
+        </w:trPr>
+        <w:tc>
+          <w:tcPr/>
+          <w:p>
+            <w:pPr>
+              <w:pStyle w:val="Compact"/>
+            </w:pPr>
+            <w:r>
+              <w:t xml:space="preserve">Design element</w:t>
+            </w:r>
+          </w:p>
+        </w:tc>
+        <w:tc>
+          <w:tcPr/>
+          <w:p>
+            <w:pPr>
+              <w:pStyle w:val="Compact"/>
+            </w:pPr>
+            <w:r>
+              <w:t xml:space="preserve">Rescue.Co implementation</w:t>
+            </w:r>
+          </w:p>
+        </w:tc>
+        <w:tc>
+          <w:tcPr/>
+          <w:p>
+            <w:pPr>
+              <w:pStyle w:val="Compact"/>
+            </w:pPr>
+            <w:r>
+              <w:t xml:space="preserve">Pre-outcome status</w:t>
+            </w:r>
+          </w:p>
+        </w:tc>
+      </w:tr>
+      <w:tr>
+        <w:tc>
+          <w:tcPr/>
+          <w:p>
+            <w:pPr>
+              <w:pStyle w:val="Compact"/>
+            </w:pPr>
+            <w:r>
+              <w:t xml:space="preserve">Index date / time zero</w:t>
+            </w:r>
+          </w:p>
+        </w:tc>
+        <w:tc>
+          <w:tcPr/>
+          <w:p>
+            <w:pPr>
+              <w:pStyle w:val="Compact"/>
+            </w:pPr>
+            <w:r>
+              <w:t xml:space="preserve">Time of trauma-related ambulance arrival at participating hospital</w:t>
+            </w:r>
+          </w:p>
+        </w:tc>
+        <w:tc>
+          <w:tcPr/>
+          <w:p>
+            <w:pPr>
+              <w:pStyle w:val="Compact"/>
+            </w:pPr>
+            <w:r>
+              <w:t xml:space="preserve">Locked in</w:t>
+            </w:r>
+            <w:r>
+              <w:t xml:space="preserve"> </w:t>
+            </w:r>
+            <w:r>
+              <w:rPr>
+                <w:rStyle w:val="VerbatimChar"/>
+              </w:rPr>
+              <w:t xml:space="preserve">identify_interval()</w:t>
+            </w:r>
+          </w:p>
+        </w:tc>
+      </w:tr>
+      <w:tr>
+        <w:tc>
+          <w:tcPr/>
+          <w:p>
+            <w:pPr>
+              <w:pStyle w:val="Compact"/>
+            </w:pPr>
+            <w:r>
+              <w:t xml:space="preserve">Treatment definition</w:t>
+            </w:r>
+          </w:p>
+        </w:tc>
+        <w:tc>
+          <w:tcPr/>
+          <w:p>
+            <w:pPr>
+              <w:pStyle w:val="Compact"/>
+            </w:pPr>
+            <w:r>
+              <w:t xml:space="preserve">Rescue.Co EMS transport (A = 1) vs. other ambulance services (A = 0) at index</w:t>
+            </w:r>
+          </w:p>
+        </w:tc>
+        <w:tc>
+          <w:tcPr/>
+          <w:p>
+            <w:pPr>
+              <w:pStyle w:val="Compact"/>
+            </w:pPr>
+            <w:r>
+              <w:t xml:space="preserve">Locked in</w:t>
+            </w:r>
+            <w:r>
+              <w:t xml:space="preserve"> </w:t>
+            </w:r>
+            <w:r>
+              <w:rPr>
+                <w:rStyle w:val="VerbatimChar"/>
+              </w:rPr>
+              <w:t xml:space="preserve">identify_treatment()</w:t>
+            </w:r>
+          </w:p>
+        </w:tc>
+      </w:tr>
+      <w:tr>
+        <w:tc>
+          <w:tcPr/>
+          <w:p>
+            <w:pPr>
+              <w:pStyle w:val="Compact"/>
+            </w:pPr>
+            <w:r>
+              <w:t xml:space="preserve">Reference group</w:t>
+            </w:r>
+          </w:p>
+        </w:tc>
+        <w:tc>
+          <w:tcPr/>
+          <w:p>
+            <w:pPr>
+              <w:pStyle w:val="Compact"/>
+            </w:pPr>
+            <w:r>
+              <w:t xml:space="preserve">Other ambulance services at the same hospitals during the same period</w:t>
+            </w:r>
+          </w:p>
+        </w:tc>
+        <w:tc>
+          <w:tcPr/>
+          <w:p>
+            <w:pPr>
+              <w:pStyle w:val="Compact"/>
+            </w:pPr>
+            <w:r>
+              <w:t xml:space="preserve">Locked</w:t>
+            </w:r>
+          </w:p>
+        </w:tc>
+      </w:tr>
+      <w:tr>
+        <w:tc>
+          <w:tcPr/>
+          <w:p>
+            <w:pPr>
+              <w:pStyle w:val="Compact"/>
+            </w:pPr>
+            <w:r>
+              <w:t xml:space="preserve">Eligibility window</w:t>
+            </w:r>
+          </w:p>
+        </w:tc>
+        <w:tc>
+          <w:tcPr/>
+          <w:p>
+            <w:pPr>
+              <w:pStyle w:val="Compact"/>
+            </w:pPr>
+            <w:r>
+              <w:t xml:space="preserve">2018 to 2024 trauma transports, direct-from-scene only</w:t>
+            </w:r>
+          </w:p>
+        </w:tc>
+        <w:tc>
+          <w:tcPr/>
+          <w:p>
+            <w:pPr>
+              <w:pStyle w:val="Compact"/>
+            </w:pPr>
+            <w:r>
+              <w:t xml:space="preserve">Locked</w:t>
+            </w:r>
+          </w:p>
+        </w:tc>
+      </w:tr>
+      <w:tr>
+        <w:tc>
+          <w:tcPr/>
+          <w:p>
+            <w:pPr>
+              <w:pStyle w:val="Compact"/>
+            </w:pPr>
+            <w:r>
+              <w:t xml:space="preserve">Covariate window</w:t>
+            </w:r>
+          </w:p>
+        </w:tc>
+        <w:tc>
+          <w:tcPr/>
+          <w:p>
+            <w:pPr>
+              <w:pStyle w:val="Compact"/>
+            </w:pPr>
+            <w:r>
+              <w:t xml:space="preserve">At or before index (no post-index covariates)</w:t>
+            </w:r>
+          </w:p>
+        </w:tc>
+        <w:tc>
+          <w:tcPr/>
+          <w:p>
+            <w:pPr>
+              <w:pStyle w:val="Compact"/>
+            </w:pPr>
+            <w:r>
+              <w:t xml:space="preserve">Locked</w:t>
+            </w:r>
+          </w:p>
+        </w:tc>
+      </w:tr>
+      <w:tr>
+        <w:tc>
+          <w:tcPr/>
+          <w:p>
+            <w:pPr>
+              <w:pStyle w:val="Compact"/>
+            </w:pPr>
+            <w:r>
+              <w:t xml:space="preserve">Outcome window</w:t>
+            </w:r>
+          </w:p>
+        </w:tc>
+        <w:tc>
+          <w:tcPr/>
+          <w:p>
+            <w:pPr>
+              <w:pStyle w:val="Compact"/>
+            </w:pPr>
+            <w:r>
+              <w:t xml:space="preserve">6 months from index</w:t>
+            </w:r>
+          </w:p>
+        </w:tc>
+        <w:tc>
+          <w:tcPr/>
+          <w:p>
+            <w:pPr>
+              <w:pStyle w:val="Compact"/>
+            </w:pPr>
+            <w:r>
+              <w:t xml:space="preserve">Locked</w:t>
+            </w:r>
+          </w:p>
+        </w:tc>
+      </w:tr>
+      <w:tr>
+        <w:tc>
+          <w:tcPr/>
+          <w:p>
+            <w:pPr>
+              <w:pStyle w:val="Compact"/>
+            </w:pPr>
+            <w:r>
+              <w:t xml:space="preserve">Outcome definition</w:t>
+            </w:r>
+          </w:p>
+        </w:tc>
+        <w:tc>
+          <w:tcPr/>
+          <w:p>
+            <w:pPr>
+              <w:pStyle w:val="Compact"/>
+            </w:pPr>
+            <w:r>
+              <w:t xml:space="preserve">GOSE &gt; 4 at 6 months (good functional outcome)</w:t>
+            </w:r>
+          </w:p>
+        </w:tc>
+        <w:tc>
+          <w:tcPr/>
+          <w:p>
+            <w:pPr>
+              <w:pStyle w:val="Compact"/>
+            </w:pPr>
+            <w:r>
+              <w:t xml:space="preserve">Locked</w:t>
+            </w:r>
+          </w:p>
+        </w:tc>
+      </w:tr>
+      <w:tr>
+        <w:tc>
+          <w:tcPr/>
+          <w:p>
+            <w:pPr>
+              <w:pStyle w:val="Compact"/>
+            </w:pPr>
+            <w:r>
+              <w:t xml:space="preserve">Missingness / censoring definition</w:t>
+            </w:r>
+          </w:p>
+        </w:tc>
+        <w:tc>
+          <w:tcPr/>
+          <w:p>
+            <w:pPr>
+              <w:pStyle w:val="Compact"/>
+            </w:pPr>
+            <w:r>
+              <w:t xml:space="preserve">Missing 6-month GOSE = missingness; primary complete-outcome with IPCW sensitivity</w:t>
+            </w:r>
+          </w:p>
+        </w:tc>
+        <w:tc>
+          <w:tcPr/>
+          <w:p>
+            <w:pPr>
+              <w:pStyle w:val="Compact"/>
+            </w:pPr>
+            <w:r>
+              <w:t xml:space="preserve">Locked</w:t>
+            </w:r>
+          </w:p>
+        </w:tc>
+      </w:tr>
+      <w:tr>
+        <w:tc>
+          <w:tcPr/>
+          <w:p>
+            <w:pPr>
+              <w:pStyle w:val="Compact"/>
+            </w:pPr>
+            <w:r>
+              <w:t xml:space="preserve">Treatment switching / discontinuation</w:t>
+            </w:r>
+          </w:p>
+        </w:tc>
+        <w:tc>
+          <w:tcPr/>
+          <w:p>
+            <w:pPr>
+              <w:pStyle w:val="Compact"/>
+            </w:pPr>
+            <w:r>
+              <w:t xml:space="preserve">Not applicable (point exposure at scene)</w:t>
+            </w:r>
+          </w:p>
+        </w:tc>
+        <w:tc>
+          <w:tcPr/>
+          <w:p>
+            <w:pPr>
+              <w:pStyle w:val="Compact"/>
+            </w:pPr>
+            <w:r>
+              <w:t xml:space="preserve">Locked</w:t>
+            </w:r>
+          </w:p>
+        </w:tc>
+      </w:tr>
+      <w:tr>
+        <w:tc>
+          <w:tcPr/>
+          <w:p>
+            <w:pPr>
+              <w:pStyle w:val="Compact"/>
+            </w:pPr>
+            <w:r>
+              <w:t xml:space="preserve">Administrative end of follow-up</w:t>
+            </w:r>
+          </w:p>
+        </w:tc>
+        <w:tc>
+          <w:tcPr/>
+          <w:p>
+            <w:pPr>
+              <w:pStyle w:val="Compact"/>
+            </w:pPr>
+            <w:r>
+              <w:t xml:space="preserve">Fixed at 6 months; no admin censoring before that</w:t>
+            </w:r>
+          </w:p>
+        </w:tc>
+        <w:tc>
+          <w:tcPr/>
+          <w:p>
+            <w:pPr>
+              <w:pStyle w:val="Compact"/>
+            </w:pPr>
+            <w:r>
+              <w:t xml:space="preserve">Locked</w:t>
+            </w:r>
+          </w:p>
+        </w:tc>
+      </w:tr>
+      <w:tr>
+        <w:tc>
+          <w:tcPr/>
+          <w:p>
+            <w:pPr>
+              <w:pStyle w:val="Compact"/>
+            </w:pPr>
+            <w:r>
+              <w:t xml:space="preserve">Excluded intercurrent events / transfer groups</w:t>
+            </w:r>
+          </w:p>
+        </w:tc>
+        <w:tc>
+          <w:tcPr/>
+          <w:p>
+            <w:pPr>
+              <w:pStyle w:val="Compact"/>
+            </w:pPr>
+            <w:r>
+              <w:t xml:space="preserve">Inter-facility transfers excluded; recorded as</w:t>
+            </w:r>
+            <w:r>
+              <w:t xml:space="preserve"> </w:t>
+            </w:r>
+            <w:r>
+              <w:rPr>
+                <w:rStyle w:val="VerbatimChar"/>
+              </w:rPr>
+              <w:t xml:space="preserve">is_transfer</w:t>
+            </w:r>
+            <w:r>
+              <w:t xml:space="preserve"> </w:t>
+            </w:r>
+            <w:r>
+              <w:t xml:space="preserve">for sensitivity</w:t>
+            </w:r>
+          </w:p>
+        </w:tc>
+        <w:tc>
+          <w:tcPr/>
+          <w:p>
+            <w:pPr>
+              <w:pStyle w:val="Compact"/>
+            </w:pPr>
+            <w:r>
+              <w:t xml:space="preserve">Locked</w:t>
+            </w:r>
+          </w:p>
+        </w:tc>
+      </w:tr>
+    </w:tbl>
+    <w:p>
+      <w:pPr>
+        <w:pStyle w:val="BodyText"/>
+      </w:pPr>
+      <w:r>
+        <w:rPr>
+          <w:b/>
+          <w:bCs/>
+        </w:rPr>
+        <w:t xml:space="preserve">Checkpoint dashboard.</w:t>
+      </w:r>
+      <w:r>
+        <w:t xml:space="preserve"> </w:t>
+      </w:r>
+      <w:r>
+        <w:t xml:space="preserve">The reviewer-facing dashboard summarises</w:t>
+      </w:r>
+      <w:r>
+        <w:t xml:space="preserve"> </w:t>
+      </w:r>
+      <w:r>
+        <w:t xml:space="preserve">the evidence available at each checkpoint and whether the decision</w:t>
+      </w:r>
+      <w:r>
+        <w:t xml:space="preserve"> </w:t>
+      </w:r>
+      <w:r>
+        <w:t xml:space="preserve">is software-enforced (driven by a prespecified threshold the</w:t>
+      </w:r>
+      <w:r>
+        <w:t xml:space="preserve"> </w:t>
+      </w:r>
+      <w:r>
+        <w:t xml:space="preserve">package evaluates automatically) or rests on reviewer judgment.</w:t>
+      </w:r>
+    </w:p>
+    <w:tbl>
+      <w:tblPr>
+        <w:tblStyle w:val="Table"/>
+        <w:tblW w:type="pct" w:w="5000"/>
+        <w:tblLayout w:type="fixed"/>
+        <w:tblLook w:firstRow="1" w:lastRow="0" w:firstColumn="0" w:lastColumn="0" w:noHBand="0" w:noVBand="0" w:val="0020"/>
+      </w:tblPr>
+      <w:tblGrid>
+        <w:gridCol w:w="1320"/>
+        <w:gridCol w:w="1320"/>
+        <w:gridCol w:w="1320"/>
+        <w:gridCol w:w="1320"/>
+        <w:gridCol w:w="1320"/>
+        <w:gridCol w:w="1320"/>
+      </w:tblGrid>
+      <w:tr>
+        <w:trPr>
+          <w:tblHeader w:val="on"/>
+        </w:trPr>
+        <w:tc>
+          <w:tcPr/>
+          <w:p>
+            <w:pPr>
+              <w:pStyle w:val="Compact"/>
+            </w:pPr>
+            <w:r>
+              <w:t xml:space="preserve">Stage</w:t>
+            </w:r>
+          </w:p>
+        </w:tc>
+        <w:tc>
+          <w:tcPr/>
+          <w:p>
+            <w:pPr>
+              <w:pStyle w:val="Compact"/>
+            </w:pPr>
+            <w:r>
+              <w:t xml:space="preserve">Evidence used</w:t>
+            </w:r>
+          </w:p>
+        </w:tc>
+        <w:tc>
+          <w:tcPr/>
+          <w:p>
+            <w:pPr>
+              <w:pStyle w:val="Compact"/>
+            </w:pPr>
+            <w:r>
+              <w:t xml:space="preserve">Threshold</w:t>
+            </w:r>
+          </w:p>
+        </w:tc>
+        <w:tc>
+          <w:tcPr/>
+          <w:p>
+            <w:pPr>
+              <w:pStyle w:val="Compact"/>
+            </w:pPr>
+            <w:r>
+              <w:t xml:space="preserve">Decision</w:t>
+            </w:r>
+          </w:p>
+        </w:tc>
+        <w:tc>
+          <w:tcPr/>
+          <w:p>
+            <w:pPr>
+              <w:pStyle w:val="Compact"/>
+            </w:pPr>
+            <w:r>
+              <w:t xml:space="preserve">Reviewer interpretation</w:t>
+            </w:r>
+          </w:p>
+        </w:tc>
+        <w:tc>
+          <w:tcPr/>
+          <w:p>
+            <w:pPr>
+              <w:pStyle w:val="Compact"/>
+            </w:pPr>
+            <w:r>
+              <w:t xml:space="preserve">Software-enforced vs reviewer-judgment</w:t>
+            </w:r>
+          </w:p>
+        </w:tc>
+      </w:tr>
+      <w:tr>
+        <w:tc>
+          <w:tcPr/>
+          <w:p>
+            <w:pPr>
+              <w:pStyle w:val="Compact"/>
+            </w:pPr>
+            <w:r>
+              <w:t xml:space="preserve">Stage 0 protocol/setup</w:t>
+            </w:r>
+          </w:p>
+        </w:tc>
+        <w:tc>
+          <w:tcPr/>
+          <w:p>
+            <w:pPr>
+              <w:pStyle w:val="Compact"/>
+            </w:pPr>
+            <w:r>
+              <w:t xml:space="preserve">Target-trial timing table, SAP, lock fingerprint</w:t>
+            </w:r>
+          </w:p>
+        </w:tc>
+        <w:tc>
+          <w:tcPr/>
+          <w:p>
+            <w:pPr>
+              <w:pStyle w:val="Compact"/>
+            </w:pPr>
+            <w:r>
+              <w:t xml:space="preserve">All design elements specified before data access</w:t>
+            </w:r>
+          </w:p>
+        </w:tc>
+        <w:tc>
+          <w:tcPr/>
+          <w:p>
+            <w:pPr>
+              <w:pStyle w:val="Compact"/>
+            </w:pPr>
+            <w:r>
+              <w:t xml:space="preserve">GO</w:t>
+            </w:r>
+          </w:p>
+        </w:tc>
+        <w:tc>
+          <w:tcPr/>
+          <w:p>
+            <w:pPr>
+              <w:pStyle w:val="Compact"/>
+            </w:pPr>
+            <w:r>
+              <w:t xml:space="preserve">Cohort and estimand definitions complete</w:t>
+            </w:r>
+          </w:p>
+        </w:tc>
+        <w:tc>
+          <w:tcPr/>
+          <w:p>
+            <w:pPr>
+              <w:pStyle w:val="Compact"/>
+            </w:pPr>
+            <w:r>
+              <w:t xml:space="preserve">Reviewer-judgment</w:t>
+            </w:r>
+          </w:p>
+        </w:tc>
+      </w:tr>
+      <w:tr>
+        <w:tc>
+          <w:tcPr/>
+          <w:p>
+            <w:pPr>
+              <w:pStyle w:val="Compact"/>
+            </w:pPr>
+            <w:r>
+              <w:t xml:space="preserve">Stage 1b cohort adequacy and event counts</w:t>
+            </w:r>
+          </w:p>
+        </w:tc>
+        <w:tc>
+          <w:tcPr/>
+          <w:p>
+            <w:pPr>
+              <w:pStyle w:val="Compact"/>
+            </w:pPr>
+            <w:r>
+              <w:rPr>
+                <w:rStyle w:val="VerbatimChar"/>
+              </w:rPr>
+              <w:t xml:space="preserve">checkpoint_cohort_adequacy()</w:t>
+            </w:r>
+            <w:r>
+              <w:t xml:space="preserve"> </w:t>
+            </w:r>
+            <w:r>
+              <w:t xml:space="preserve">output, attrition table</w:t>
+            </w:r>
+          </w:p>
+        </w:tc>
+        <w:tc>
+          <w:tcPr/>
+          <w:p>
+            <w:pPr>
+              <w:pStyle w:val="Compact"/>
+            </w:pPr>
+            <w:r>
+              <w:rPr>
+                <w:rStyle w:val="VerbatimChar"/>
+              </w:rPr>
+              <w:t xml:space="preserve">min_n_per_arm</w:t>
+            </w:r>
+            <w:r>
+              <w:t xml:space="preserve"> </w:t>
+            </w:r>
+            <w:r>
+              <w:t xml:space="preserve">= 200,</w:t>
+            </w:r>
+            <w:r>
+              <w:t xml:space="preserve"> </w:t>
+            </w:r>
+            <w:r>
+              <w:rPr>
+                <w:rStyle w:val="VerbatimChar"/>
+              </w:rPr>
+              <w:t xml:space="preserve">min_events</w:t>
+            </w:r>
+            <w:r>
+              <w:t xml:space="preserve"> </w:t>
+            </w:r>
+            <w:r>
+              <w:t xml:space="preserve">= 50</w:t>
+            </w:r>
+          </w:p>
+        </w:tc>
+        <w:tc>
+          <w:tcPr/>
+          <w:p>
+            <w:pPr>
+              <w:pStyle w:val="Compact"/>
+            </w:pPr>
+            <w:r>
+              <w:t xml:space="preserve">GO</w:t>
+            </w:r>
+          </w:p>
+        </w:tc>
+        <w:tc>
+          <w:tcPr/>
+          <w:p>
+            <w:pPr>
+              <w:pStyle w:val="Compact"/>
+            </w:pPr>
+            <w:r>
+              <w:t xml:space="preserve">Adequate cohort for the prespecified estimand</w:t>
+            </w:r>
+          </w:p>
+        </w:tc>
+        <w:tc>
+          <w:tcPr/>
+          <w:p>
+            <w:pPr>
+              <w:pStyle w:val="Compact"/>
+            </w:pPr>
+            <w:r>
+              <w:t xml:space="preserve">Software-enforced</w:t>
+            </w:r>
+          </w:p>
+        </w:tc>
+      </w:tr>
+      <w:tr>
+        <w:tc>
+          <w:tcPr/>
+          <w:p>
+            <w:pPr>
+              <w:pStyle w:val="Compact"/>
+            </w:pPr>
+            <w:r>
+              <w:t xml:space="preserve">Stage 2a overlap, balance, ESS, weight stability</w:t>
+            </w:r>
+          </w:p>
+        </w:tc>
+        <w:tc>
+          <w:tcPr/>
+          <w:p>
+            <w:pPr>
+              <w:pStyle w:val="Compact"/>
+            </w:pPr>
+            <w:r>
+              <w:rPr>
+                <w:rStyle w:val="VerbatimChar"/>
+              </w:rPr>
+              <w:t xml:space="preserve">compute_ps_diagnostics()</w:t>
+            </w:r>
+            <w:r>
+              <w:t xml:space="preserve">,</w:t>
+            </w:r>
+            <w:r>
+              <w:t xml:space="preserve"> </w:t>
+            </w:r>
+            <w:r>
+              <w:rPr>
+                <w:rStyle w:val="VerbatimChar"/>
+              </w:rPr>
+              <w:t xml:space="preserve">love_plot_threeway()</w:t>
+            </w:r>
+            <w:r>
+              <w:t xml:space="preserve">,</w:t>
+            </w:r>
+            <w:r>
+              <w:t xml:space="preserve"> </w:t>
+            </w:r>
+            <w:r>
+              <w:rPr>
+                <w:rStyle w:val="VerbatimChar"/>
+              </w:rPr>
+              <w:t xml:space="preserve">clean_weight_diagnostics()</w:t>
+            </w:r>
+          </w:p>
+        </w:tc>
+        <w:tc>
+          <w:tcPr/>
+          <w:p>
+            <w:pPr>
+              <w:pStyle w:val="Compact"/>
+            </w:pPr>
+            <w:r>
+              <w:t xml:space="preserve">PS in [0.01, 0.99]; max-SMD &lt;= 0.10 after weighting; max weight &lt;= 10</w:t>
+            </w:r>
+          </w:p>
+        </w:tc>
+        <w:tc>
+          <w:tcPr/>
+          <w:p>
+            <w:pPr>
+              <w:pStyle w:val="Compact"/>
+            </w:pPr>
+            <w:r>
+              <w:t xml:space="preserve">GO</w:t>
+            </w:r>
+          </w:p>
+        </w:tc>
+        <w:tc>
+          <w:tcPr/>
+          <w:p>
+            <w:pPr>
+              <w:pStyle w:val="Compact"/>
+            </w:pPr>
+            <w:r>
+              <w:t xml:space="preserve">Positivity and balance acceptable for full-cohort target</w:t>
+            </w:r>
+          </w:p>
+        </w:tc>
+        <w:tc>
+          <w:tcPr/>
+          <w:p>
+            <w:pPr>
+              <w:pStyle w:val="Compact"/>
+            </w:pPr>
+            <w:r>
+              <w:t xml:space="preserve">Software-enforced</w:t>
+            </w:r>
+          </w:p>
+        </w:tc>
+      </w:tr>
+      <w:tr>
+        <w:tc>
+          <w:tcPr/>
+          <w:p>
+            <w:pPr>
+              <w:pStyle w:val="Compact"/>
+            </w:pPr>
+            <w:r>
+              <w:t xml:space="preserve">Stage 2b baseline plasmode</w:t>
+            </w:r>
+          </w:p>
+        </w:tc>
+        <w:tc>
+          <w:tcPr/>
+          <w:p>
+            <w:pPr>
+              <w:pStyle w:val="Compact"/>
+            </w:pPr>
+            <w:r>
+              <w:rPr>
+                <w:rStyle w:val="VerbatimChar"/>
+              </w:rPr>
+              <w:t xml:space="preserve">run_plasmode_feasibility()</w:t>
+            </w:r>
+            <w:r>
+              <w:t xml:space="preserve"> </w:t>
+            </w:r>
+            <w:r>
+              <w:t xml:space="preserve">bias 0.001, coverage 0.94</w:t>
+            </w:r>
+          </w:p>
+        </w:tc>
+        <w:tc>
+          <w:tcPr/>
+          <w:p>
+            <w:pPr>
+              <w:pStyle w:val="Compact"/>
+            </w:pPr>
+            <w:r>
+              <w:t xml:space="preserve">bias &lt;= 0.01, coverage &gt;= 0.90, SE/SD in (0.8, 1.2)</w:t>
+            </w:r>
+          </w:p>
+        </w:tc>
+        <w:tc>
+          <w:tcPr/>
+          <w:p>
+            <w:pPr>
+              <w:pStyle w:val="Compact"/>
+            </w:pPr>
+            <w:r>
+              <w:t xml:space="preserve">GO</w:t>
+            </w:r>
+          </w:p>
+        </w:tc>
+        <w:tc>
+          <w:tcPr/>
+          <w:p>
+            <w:pPr>
+              <w:pStyle w:val="Compact"/>
+            </w:pPr>
+            <w:r>
+              <w:t xml:space="preserve">Candidate operates within prespecified envelope</w:t>
+            </w:r>
+          </w:p>
+        </w:tc>
+        <w:tc>
+          <w:tcPr/>
+          <w:p>
+            <w:pPr>
+              <w:pStyle w:val="Compact"/>
+            </w:pPr>
+            <w:r>
+              <w:t xml:space="preserve">Software-enforced</w:t>
+            </w:r>
+          </w:p>
+        </w:tc>
+      </w:tr>
+      <w:tr>
+        <w:tc>
+          <w:tcPr/>
+          <w:p>
+            <w:pPr>
+              <w:pStyle w:val="Compact"/>
+            </w:pPr>
+            <w:r>
+              <w:t xml:space="preserve">Stage 2c DQ stress test</w:t>
+            </w:r>
+          </w:p>
+        </w:tc>
+        <w:tc>
+          <w:tcPr/>
+          <w:p>
+            <w:pPr>
+              <w:pStyle w:val="Compact"/>
+            </w:pPr>
+            <w:r>
+              <w:rPr>
+                <w:rStyle w:val="VerbatimChar"/>
+              </w:rPr>
+              <w:t xml:space="preserve">run_plasmode_dq_stress()</w:t>
+            </w:r>
+            <w:r>
+              <w:t xml:space="preserve"> </w:t>
+            </w:r>
+            <w:r>
+              <w:t xml:space="preserve">minimax rule</w:t>
+            </w:r>
+          </w:p>
+        </w:tc>
+        <w:tc>
+          <w:tcPr/>
+          <w:p>
+            <w:pPr>
+              <w:pStyle w:val="Compact"/>
+            </w:pPr>
+            <w:r>
+              <w:t xml:space="preserve">Each scenario within thresholds across severities</w:t>
+            </w:r>
+          </w:p>
+        </w:tc>
+        <w:tc>
+          <w:tcPr/>
+          <w:p>
+            <w:pPr>
+              <w:pStyle w:val="Compact"/>
+            </w:pPr>
+            <w:r>
+              <w:t xml:space="preserve">GO</w:t>
+            </w:r>
+          </w:p>
+        </w:tc>
+        <w:tc>
+          <w:tcPr/>
+          <w:p>
+            <w:pPr>
+              <w:pStyle w:val="Compact"/>
+            </w:pPr>
+            <w:r>
+              <w:t xml:space="preserve">Selected candidate is stable across prespecified threats</w:t>
+            </w:r>
+          </w:p>
+        </w:tc>
+        <w:tc>
+          <w:tcPr/>
+          <w:p>
+            <w:pPr>
+              <w:pStyle w:val="Compact"/>
+            </w:pPr>
+            <w:r>
+              <w:t xml:space="preserve">Software-enforced</w:t>
+            </w:r>
+          </w:p>
+        </w:tc>
+      </w:tr>
+      <w:tr>
+        <w:tc>
+          <w:tcPr/>
+          <w:p>
+            <w:pPr>
+              <w:pStyle w:val="Compact"/>
+            </w:pPr>
+            <w:r>
+              <w:t xml:space="preserve">Stage 3 negative controls</w:t>
+            </w:r>
+          </w:p>
+        </w:tc>
+        <w:tc>
+          <w:tcPr/>
+          <w:p>
+            <w:pPr>
+              <w:pStyle w:val="Compact"/>
+            </w:pPr>
+            <w:r>
+              <w:rPr>
+                <w:rStyle w:val="VerbatimChar"/>
+              </w:rPr>
+              <w:t xml:space="preserve">run_residual_confounding_stage()</w:t>
+            </w:r>
+            <w:r>
+              <w:t xml:space="preserve"> </w:t>
+            </w:r>
+            <w:r>
+              <w:t xml:space="preserve">(2 of 5 NCs survived NZV; both pass)</w:t>
+            </w:r>
+          </w:p>
+        </w:tc>
+        <w:tc>
+          <w:tcPr/>
+          <w:p>
+            <w:pPr>
+              <w:pStyle w:val="Compact"/>
+            </w:pPr>
+            <w:r>
+              <w:t xml:space="preserve">All analysed NCs pass at</w:t>
+            </w:r>
+            <w:r>
+              <w:t xml:space="preserve"> </w:t>
+            </w:r>
+            <m:oMath>
+              <m:r>
+                <m:t>α</m:t>
+              </m:r>
+            </m:oMath>
+            <w:r>
+              <w:t xml:space="preserve"> </w:t>
+            </w:r>
+            <w:r>
+              <w:t xml:space="preserve">= 0.05</w:t>
+            </w:r>
+          </w:p>
+        </w:tc>
+        <w:tc>
+          <w:tcPr/>
+          <w:p>
+            <w:pPr>
+              <w:pStyle w:val="Compact"/>
+            </w:pPr>
+            <w:r>
+              <w:t xml:space="preserve">GO with FLAG</w:t>
+            </w:r>
+          </w:p>
+        </w:tc>
+        <w:tc>
+          <w:tcPr/>
+          <w:p>
+            <w:pPr>
+              <w:pStyle w:val="Compact"/>
+            </w:pPr>
+            <w:r>
+              <w:t xml:space="preserve">Narrower NC panel than SAP; residual-confounding probe partial</w:t>
+            </w:r>
+          </w:p>
+        </w:tc>
+        <w:tc>
+          <w:tcPr/>
+          <w:p>
+            <w:pPr>
+              <w:pStyle w:val="Compact"/>
+            </w:pPr>
+            <w:r>
+              <w:t xml:space="preserve">Reviewer-judgment</w:t>
+            </w:r>
+          </w:p>
+        </w:tc>
+      </w:tr>
+      <w:tr>
+        <w:tc>
+          <w:tcPr/>
+          <w:p>
+            <w:pPr>
+              <w:pStyle w:val="Compact"/>
+            </w:pPr>
+            <w:r>
+              <w:t xml:space="preserve">Gate authorisation</w:t>
+            </w:r>
+          </w:p>
+        </w:tc>
+        <w:tc>
+          <w:tcPr/>
+          <w:p>
+            <w:pPr>
+              <w:pStyle w:val="Compact"/>
+            </w:pPr>
+            <w:r>
+              <w:rPr>
+                <w:rStyle w:val="VerbatimChar"/>
+              </w:rPr>
+              <w:t xml:space="preserve">authorize_outcome_analysis()</w:t>
+            </w:r>
+            <w:r>
+              <w:t xml:space="preserve"> </w:t>
+            </w:r>
+            <w:r>
+              <w:t xml:space="preserve">returns GO</w:t>
+            </w:r>
+          </w:p>
+        </w:tc>
+        <w:tc>
+          <w:tcPr/>
+          <w:p>
+            <w:pPr>
+              <w:pStyle w:val="Compact"/>
+            </w:pPr>
+            <w:r>
+              <w:t xml:space="preserve">All preceding checkpoints GO or documented FLAG</w:t>
+            </w:r>
+          </w:p>
+        </w:tc>
+        <w:tc>
+          <w:tcPr/>
+          <w:p>
+            <w:pPr>
+              <w:pStyle w:val="Compact"/>
+            </w:pPr>
+            <w:r>
+              <w:t xml:space="preserve">GO</w:t>
+            </w:r>
+          </w:p>
+        </w:tc>
+        <w:tc>
+          <w:tcPr/>
+          <w:p>
+            <w:pPr>
+              <w:pStyle w:val="Compact"/>
+            </w:pPr>
+            <w:r>
+              <w:t xml:space="preserve">Proceed to locked primary analysis</w:t>
+            </w:r>
+          </w:p>
+        </w:tc>
+        <w:tc>
+          <w:tcPr/>
+          <w:p>
+            <w:pPr>
+              <w:pStyle w:val="Compact"/>
+            </w:pPr>
+            <w:r>
+              <w:t xml:space="preserve">Software-enforced</w:t>
+            </w:r>
+          </w:p>
+        </w:tc>
+      </w:tr>
+    </w:tbl>
+    <w:p>
+      <w:pPr>
+        <w:pStyle w:val="BodyText"/>
+      </w:pPr>
+      <w:r>
+        <w:rPr>
+          <w:b/>
+          <w:bCs/>
+        </w:rPr>
+        <w:t xml:space="preserve">Decision-log example (illustrative).</w:t>
+      </w:r>
+      <w:r>
+        <w:t xml:space="preserve"> </w:t>
+      </w:r>
+      <w:r>
+        <w:t xml:space="preserve">The following rows are</w:t>
+      </w:r>
+      <w:r>
+        <w:t xml:space="preserve"> </w:t>
+      </w:r>
+      <w:r>
+        <w:t xml:space="preserve">illustrative entries in the format produced by</w:t>
+      </w:r>
+      <w:r>
+        <w:t xml:space="preserve"> </w:t>
+      </w:r>
+      <w:r>
+        <w:rPr>
+          <w:rStyle w:val="VerbatimChar"/>
+        </w:rPr>
+        <w:t xml:space="preserve">export_decision_log()</w:t>
+      </w:r>
+      <w:r>
+        <w:t xml:space="preserve">. They are not the literal log; they show</w:t>
+      </w:r>
+      <w:r>
+        <w:t xml:space="preserve"> </w:t>
+      </w:r>
+      <w:r>
+        <w:t xml:space="preserve">the structure a reviewer would read for each prespecified or</w:t>
+      </w:r>
+      <w:r>
+        <w:t xml:space="preserve"> </w:t>
+      </w:r>
+      <w:r>
+        <w:t xml:space="preserve">deviation entry.</w:t>
+      </w:r>
+    </w:p>
+    <w:tbl>
+      <w:tblPr>
+        <w:tblStyle w:val="Table"/>
+        <w:tblW w:type="pct" w:w="5000"/>
+        <w:tblLayout w:type="fixed"/>
+        <w:tblLook w:firstRow="1" w:lastRow="0" w:firstColumn="0" w:lastColumn="0" w:noHBand="0" w:noVBand="0" w:val="0020"/>
+      </w:tblPr>
+      <w:tblGrid>
+        <w:gridCol w:w="792"/>
+        <w:gridCol w:w="792"/>
+        <w:gridCol w:w="792"/>
+        <w:gridCol w:w="792"/>
+        <w:gridCol w:w="792"/>
+        <w:gridCol w:w="792"/>
+        <w:gridCol w:w="792"/>
+        <w:gridCol w:w="792"/>
+        <w:gridCol w:w="792"/>
+        <w:gridCol w:w="792"/>
+      </w:tblGrid>
+      <w:tr>
+        <w:trPr>
+          <w:tblHeader w:val="on"/>
+        </w:trPr>
+        <w:tc>
+          <w:tcPr/>
+          <w:p>
+            <w:pPr>
+              <w:pStyle w:val="Compact"/>
+            </w:pPr>
+            <w:r>
+              <w:t xml:space="preserve">timestamp</w:t>
+            </w:r>
+          </w:p>
+        </w:tc>
+        <w:tc>
+          <w:tcPr/>
+          <w:p>
+            <w:pPr>
+              <w:pStyle w:val="Compact"/>
+            </w:pPr>
+            <w:r>
+              <w:t xml:space="preserve">stage</w:t>
+            </w:r>
+          </w:p>
+        </w:tc>
+        <w:tc>
+          <w:tcPr/>
+          <w:p>
+            <w:pPr>
+              <w:pStyle w:val="Compact"/>
+            </w:pPr>
+            <w:r>
+              <w:t xml:space="preserve">diagnostic or issue</w:t>
+            </w:r>
+          </w:p>
+        </w:tc>
+        <w:tc>
+          <w:tcPr/>
+          <w:p>
+            <w:pPr>
+              <w:pStyle w:val="Compact"/>
+            </w:pPr>
+            <w:r>
+              <w:t xml:space="preserve">prespecified criterion</w:t>
+            </w:r>
+          </w:p>
+        </w:tc>
+        <w:tc>
+          <w:tcPr/>
+          <w:p>
+            <w:pPr>
+              <w:pStyle w:val="Compact"/>
+            </w:pPr>
+            <w:r>
+              <w:t xml:space="preserve">decision</w:t>
+            </w:r>
+          </w:p>
+        </w:tc>
+        <w:tc>
+          <w:tcPr/>
+          <w:p>
+            <w:pPr>
+              <w:pStyle w:val="Compact"/>
+            </w:pPr>
+            <w:r>
+              <w:t xml:space="preserve">rationale</w:t>
+            </w:r>
+          </w:p>
+        </w:tc>
+        <w:tc>
+          <w:tcPr/>
+          <w:p>
+            <w:pPr>
+              <w:pStyle w:val="Compact"/>
+            </w:pPr>
+            <w:r>
+              <w:t xml:space="preserve">reviewer role</w:t>
+            </w:r>
+          </w:p>
+        </w:tc>
+        <w:tc>
+          <w:tcPr/>
+          <w:p>
+            <w:pPr>
+              <w:pStyle w:val="Compact"/>
+            </w:pPr>
+            <w:r>
+              <w:t xml:space="preserve">effect estimate visible?</w:t>
+            </w:r>
+          </w:p>
+        </w:tc>
+        <w:tc>
+          <w:tcPr/>
+          <w:p>
+            <w:pPr>
+              <w:pStyle w:val="Compact"/>
+            </w:pPr>
+            <w:r>
+              <w:t xml:space="preserve">action taken</w:t>
+            </w:r>
+          </w:p>
+        </w:tc>
+        <w:tc>
+          <w:tcPr/>
+          <w:p>
+            <w:pPr>
+              <w:pStyle w:val="Compact"/>
+            </w:pPr>
+            <w:r>
+              <w:t xml:space="preserve">override?</w:t>
+            </w:r>
+          </w:p>
+        </w:tc>
+      </w:tr>
+      <w:tr>
+        <w:tc>
+          <w:tcPr/>
+          <w:p>
+            <w:pPr>
+              <w:pStyle w:val="Compact"/>
+            </w:pPr>
+            <w:r>
+              <w:t xml:space="preserve">2026-01-12 09:14</w:t>
+            </w:r>
+          </w:p>
+        </w:tc>
+        <w:tc>
+          <w:tcPr/>
+          <w:p>
+            <w:pPr>
+              <w:pStyle w:val="Compact"/>
+            </w:pPr>
+            <w:r>
+              <w:t xml:space="preserve">Stage 2a</w:t>
+            </w:r>
+          </w:p>
+        </w:tc>
+        <w:tc>
+          <w:tcPr/>
+          <w:p>
+            <w:pPr>
+              <w:pStyle w:val="Compact"/>
+            </w:pPr>
+            <w:r>
+              <w:t xml:space="preserve">Three NCs failed NZV filter</w:t>
+            </w:r>
+          </w:p>
+        </w:tc>
+        <w:tc>
+          <w:tcPr/>
+          <w:p>
+            <w:pPr>
+              <w:pStyle w:val="Compact"/>
+            </w:pPr>
+            <w:r>
+              <w:t xml:space="preserve">NZV check at lock-fingerprint covariate set</w:t>
+            </w:r>
+          </w:p>
+        </w:tc>
+        <w:tc>
+          <w:tcPr/>
+          <w:p>
+            <w:pPr>
+              <w:pStyle w:val="Compact"/>
+            </w:pPr>
+            <w:r>
+              <w:t xml:space="preserve">FLAG</w:t>
+            </w:r>
+          </w:p>
+        </w:tc>
+        <w:tc>
+          <w:tcPr/>
+          <w:p>
+            <w:pPr>
+              <w:pStyle w:val="Compact"/>
+            </w:pPr>
+            <w:r>
+              <w:t xml:space="preserve">Drop the three NCs; record narrower panel</w:t>
+            </w:r>
+          </w:p>
+        </w:tc>
+        <w:tc>
+          <w:tcPr/>
+          <w:p>
+            <w:pPr>
+              <w:pStyle w:val="Compact"/>
+            </w:pPr>
+            <w:r>
+              <w:t xml:space="preserve">Lead analyst</w:t>
+            </w:r>
+          </w:p>
+        </w:tc>
+        <w:tc>
+          <w:tcPr/>
+          <w:p>
+            <w:pPr>
+              <w:pStyle w:val="Compact"/>
+            </w:pPr>
+            <w:r>
+              <w:t xml:space="preserve">No</w:t>
+            </w:r>
+          </w:p>
+        </w:tc>
+        <w:tc>
+          <w:tcPr/>
+          <w:p>
+            <w:pPr>
+              <w:pStyle w:val="Compact"/>
+            </w:pPr>
+            <w:r>
+              <w:t xml:space="preserve">Continue with 2 surviving NCs; note as limitation</w:t>
+            </w:r>
+          </w:p>
+        </w:tc>
+        <w:tc>
+          <w:tcPr/>
+          <w:p>
+            <w:pPr>
+              <w:pStyle w:val="Compact"/>
+            </w:pPr>
+            <w:r>
+              <w:t xml:space="preserve">No</w:t>
+            </w:r>
+          </w:p>
+        </w:tc>
+      </w:tr>
+      <w:tr>
+        <w:tc>
+          <w:tcPr/>
+          <w:p>
+            <w:pPr>
+              <w:pStyle w:val="Compact"/>
+            </w:pPr>
+            <w:r>
+              <w:t xml:space="preserve">2026-01-12 11:02</w:t>
+            </w:r>
+          </w:p>
+        </w:tc>
+        <w:tc>
+          <w:tcPr/>
+          <w:p>
+            <w:pPr>
+              <w:pStyle w:val="Compact"/>
+            </w:pPr>
+            <w:r>
+              <w:t xml:space="preserve">Stage 2c</w:t>
+            </w:r>
+          </w:p>
+        </w:tc>
+        <w:tc>
+          <w:tcPr/>
+          <w:p>
+            <w:pPr>
+              <w:pStyle w:val="Compact"/>
+            </w:pPr>
+            <w:r>
+              <w:t xml:space="preserve">DQ stress run at</w:t>
+            </w:r>
+            <w:r>
+              <w:t xml:space="preserve"> </w:t>
+            </w:r>
+            <w:r>
+              <w:rPr>
+                <w:rStyle w:val="VerbatimChar"/>
+              </w:rPr>
+              <w:t xml:space="preserve">n_sims = 3</w:t>
+            </w:r>
+            <w:r>
+              <w:t xml:space="preserve"> </w:t>
+            </w:r>
+            <w:r>
+              <w:t xml:space="preserve">for fast reproducibility</w:t>
+            </w:r>
+          </w:p>
+        </w:tc>
+        <w:tc>
+          <w:tcPr/>
+          <w:p>
+            <w:pPr>
+              <w:pStyle w:val="Compact"/>
+            </w:pPr>
+            <w:r>
+              <w:rPr>
+                <w:rStyle w:val="VerbatimChar"/>
+              </w:rPr>
+              <w:t xml:space="preserve">n_sims</w:t>
+            </w:r>
+            <w:r>
+              <w:t xml:space="preserve"> </w:t>
+            </w:r>
+            <w:r>
+              <w:t xml:space="preserve">&gt;= 200 for inferential interpretation</w:t>
+            </w:r>
+          </w:p>
+        </w:tc>
+        <w:tc>
+          <w:tcPr/>
+          <w:p>
+            <w:pPr>
+              <w:pStyle w:val="Compact"/>
+            </w:pPr>
+            <w:r>
+              <w:t xml:space="preserve">FLAG</w:t>
+            </w:r>
+          </w:p>
+        </w:tc>
+        <w:tc>
+          <w:tcPr/>
+          <w:p>
+            <w:pPr>
+              <w:pStyle w:val="Compact"/>
+            </w:pPr>
+            <w:r>
+              <w:t xml:space="preserve">Bundle low-replicate run as workflow demo; companion</w:t>
+            </w:r>
+            <w:r>
+              <w:t xml:space="preserve"> </w:t>
+            </w:r>
+            <w:r>
+              <w:rPr>
+                <w:rStyle w:val="VerbatimChar"/>
+              </w:rPr>
+              <w:t xml:space="preserve">n_sims = 200</w:t>
+            </w:r>
+            <w:r>
+              <w:t xml:space="preserve"> </w:t>
+            </w:r>
+            <w:r>
+              <w:t xml:space="preserve">file confirms minimax winner</w:t>
+            </w:r>
+          </w:p>
+        </w:tc>
+        <w:tc>
+          <w:tcPr/>
+          <w:p>
+            <w:pPr>
+              <w:pStyle w:val="Compact"/>
+            </w:pPr>
+            <w:r>
+              <w:t xml:space="preserve">Lead analyst</w:t>
+            </w:r>
+          </w:p>
+        </w:tc>
+        <w:tc>
+          <w:tcPr/>
+          <w:p>
+            <w:pPr>
+              <w:pStyle w:val="Compact"/>
+            </w:pPr>
+            <w:r>
+              <w:t xml:space="preserve">No</w:t>
+            </w:r>
+          </w:p>
+        </w:tc>
+        <w:tc>
+          <w:tcPr/>
+          <w:p>
+            <w:pPr>
+              <w:pStyle w:val="Compact"/>
+            </w:pPr>
+            <w:r>
+              <w:t xml:space="preserve">Use</w:t>
+            </w:r>
+            <w:r>
+              <w:t xml:space="preserve"> </w:t>
+            </w:r>
+            <w:r>
+              <w:rPr>
+                <w:rStyle w:val="VerbatimChar"/>
+              </w:rPr>
+              <w:t xml:space="preserve">n_sims = 200</w:t>
+            </w:r>
+            <w:r>
+              <w:t xml:space="preserve"> </w:t>
+            </w:r>
+            <w:r>
+              <w:t xml:space="preserve">for inference; cite</w:t>
+            </w:r>
+            <w:r>
+              <w:t xml:space="preserve"> </w:t>
+            </w:r>
+            <w:r>
+              <w:rPr>
+                <w:rStyle w:val="VerbatimChar"/>
+              </w:rPr>
+              <w:t xml:space="preserve">n_sims = 3</w:t>
+            </w:r>
+            <w:r>
+              <w:t xml:space="preserve"> </w:t>
+            </w:r>
+            <w:r>
+              <w:t xml:space="preserve">only as smoke test</w:t>
+            </w:r>
+          </w:p>
+        </w:tc>
+        <w:tc>
+          <w:tcPr/>
+          <w:p>
+            <w:pPr>
+              <w:pStyle w:val="Compact"/>
+            </w:pPr>
+            <w:r>
+              <w:t xml:space="preserve">No</w:t>
+            </w:r>
+          </w:p>
+        </w:tc>
+      </w:tr>
+      <w:tr>
+        <w:tc>
+          <w:tcPr/>
+          <w:p>
+            <w:pPr>
+              <w:pStyle w:val="Compact"/>
+            </w:pPr>
+            <w:r>
+              <w:t xml:space="preserve">2026-01-12 14:45</w:t>
+            </w:r>
+          </w:p>
+        </w:tc>
+        <w:tc>
+          <w:tcPr/>
+          <w:p>
+            <w:pPr>
+              <w:pStyle w:val="Compact"/>
+            </w:pPr>
+            <w:r>
+              <w:t xml:space="preserve">Gate</w:t>
+            </w:r>
+          </w:p>
+        </w:tc>
+        <w:tc>
+          <w:tcPr/>
+          <w:p>
+            <w:pPr>
+              <w:pStyle w:val="Compact"/>
+            </w:pPr>
+            <w:r>
+              <w:t xml:space="preserve">All checkpoints GO or documented FLAG</w:t>
+            </w:r>
+          </w:p>
+        </w:tc>
+        <w:tc>
+          <w:tcPr/>
+          <w:p>
+            <w:pPr>
+              <w:pStyle w:val="Compact"/>
+            </w:pPr>
+            <w:r>
+              <w:t xml:space="preserve">All preceding stages recorded</w:t>
+            </w:r>
+          </w:p>
+        </w:tc>
+        <w:tc>
+          <w:tcPr/>
+          <w:p>
+            <w:pPr>
+              <w:pStyle w:val="Compact"/>
+            </w:pPr>
+            <w:r>
+              <w:t xml:space="preserve">GO</w:t>
+            </w:r>
+          </w:p>
+        </w:tc>
+        <w:tc>
+          <w:tcPr/>
+          <w:p>
+            <w:pPr>
+              <w:pStyle w:val="Compact"/>
+            </w:pPr>
+            <w:r>
+              <w:t xml:space="preserve">Authorise Stage 4</w:t>
+            </w:r>
+          </w:p>
+        </w:tc>
+        <w:tc>
+          <w:tcPr/>
+          <w:p>
+            <w:pPr>
+              <w:pStyle w:val="Compact"/>
+            </w:pPr>
+            <w:r>
+              <w:t xml:space="preserve">Reviewer</w:t>
+            </w:r>
+          </w:p>
+        </w:tc>
+        <w:tc>
+          <w:tcPr/>
+          <w:p>
+            <w:pPr>
+              <w:pStyle w:val="Compact"/>
+            </w:pPr>
+            <w:r>
+              <w:t xml:space="preserve">No</w:t>
+            </w:r>
+          </w:p>
+        </w:tc>
+        <w:tc>
+          <w:tcPr/>
+          <w:p>
+            <w:pPr>
+              <w:pStyle w:val="Compact"/>
+            </w:pPr>
+            <w:r>
+              <w:t xml:space="preserve">Run locked primary analysis</w:t>
+            </w:r>
+          </w:p>
+        </w:tc>
+        <w:tc>
+          <w:tcPr/>
+          <w:p>
+            <w:pPr>
+              <w:pStyle w:val="Compact"/>
+            </w:pPr>
+            <w:r>
+              <w:t xml:space="preserve">No</w:t>
+            </w:r>
+          </w:p>
+        </w:tc>
+      </w:tr>
+    </w:tbl>
     <w:bookmarkEnd w:id="103"/>
-    <w:bookmarkStart w:id="113" w:name="sec-casestudy-dq"/>
+    <w:bookmarkEnd w:id="104"/>
+    <w:bookmarkStart w:id="114" w:name="sec-casestudy-dq"/>
     <w:p>
       <w:pPr>
         <w:pStyle w:val="Heading2"/>
@@ -26684,18 +29296,18 @@
           <wp:inline>
             <wp:extent cx="5334000" cy="4267200"/>
             <wp:effectExtent b="0" l="0" r="0" t="0"/>
-            <wp:docPr descr="Rescue.Co Stage 2a balance. Standardised mean differences across 21 retained baseline covariates before and after PS matching. PS propensity scores stay inside [0.01, 0.99] (range 0.21 to 0.81), and SMDs after matching are within the prespecified 0.10 envelope for the matched-cohort target population." title="" id="105" name="Picture"/>
+            <wp:docPr descr="Rescue.Co Stage 2a balance. Standardised mean differences across 21 retained baseline covariates before and after PS matching. PS propensity scores stay inside [0.01, 0.99] (range 0.21 to 0.81), and SMDs after matching are within the prespecified 0.10 envelope for the matched-cohort target population." title="" id="106" name="Picture"/>
             <a:graphic>
               <a:graphicData uri="http://schemas.openxmlformats.org/drawingml/2006/picture">
                 <pic:pic>
                   <pic:nvPicPr>
-                    <pic:cNvPr descr="../rescueCo/results/love_plot.png" id="106" name="Picture"/>
+                    <pic:cNvPr descr="../rescueCo/results/love_plot.png" id="107" name="Picture"/>
                     <pic:cNvPicPr>
                       <a:picLocks noChangeArrowheads="1" noChangeAspect="1"/>
                     </pic:cNvPicPr>
                   </pic:nvPicPr>
                   <pic:blipFill>
-                    <a:blip r:embed="rId104"/>
+                    <a:blip r:embed="rId105"/>
                     <a:stretch>
                       <a:fillRect/>
                     </a:stretch>
@@ -26739,18 +29351,18 @@
           <wp:inline>
             <wp:extent cx="5334000" cy="4267200"/>
             <wp:effectExtent b="0" l="0" r="0" t="0"/>
-            <wp:docPr descr="Rescue.Co Stage 2a three-way Love plot: standardised mean differences before any adjustment (unweighted), after PS matching, and after stabilised IPTW. The three-way view documents which covariates remain imbalanced under each weighting strategy and clarifies that the matched-cohort target population is not the same as the full-cohort target population recovered by IPTW or full-cohort TMLE." title="" id="108" name="Picture"/>
+            <wp:docPr descr="Rescue.Co Stage 2a three-way Love plot: standardised mean differences before any adjustment (unweighted), after PS matching, and after stabilised IPTW. The three-way view documents which covariates remain imbalanced under each weighting strategy and clarifies that the matched-cohort target population is not the same as the full-cohort target population recovered by IPTW or full-cohort TMLE." title="" id="109" name="Picture"/>
             <a:graphic>
               <a:graphicData uri="http://schemas.openxmlformats.org/drawingml/2006/picture">
                 <pic:pic>
                   <pic:nvPicPr>
-                    <pic:cNvPr descr="../rescueCo/results/weighted_love_plot.png" id="109" name="Picture"/>
+                    <pic:cNvPr descr="../rescueCo/results/weighted_love_plot.png" id="110" name="Picture"/>
                     <pic:cNvPicPr>
                       <a:picLocks noChangeArrowheads="1" noChangeAspect="1"/>
                     </pic:cNvPicPr>
                   </pic:nvPicPr>
                   <pic:blipFill>
-                    <a:blip r:embed="rId107"/>
+                    <a:blip r:embed="rId108"/>
                     <a:stretch>
                       <a:fillRect/>
                     </a:stretch>
@@ -27172,18 +29784,18 @@
           <wp:inline>
             <wp:extent cx="5334000" cy="1253222"/>
             <wp:effectExtent b="0" l="0" r="0" t="0"/>
-            <wp:docPr descr="" title="" id="111" name="Picture"/>
+            <wp:docPr descr="" title="" id="112" name="Picture"/>
             <a:graphic>
               <a:graphicData uri="http://schemas.openxmlformats.org/drawingml/2006/picture">
                 <pic:pic>
                   <pic:nvPicPr>
-                    <pic:cNvPr descr="manuscript_outcome_blind_dq_files\figure-docx\mermaid-figure-2.png" id="112" name="Picture"/>
+                    <pic:cNvPr descr="manuscript_outcome_blind_dq_files\figure-docx\mermaid-figure-2.png" id="113" name="Picture"/>
                     <pic:cNvPicPr>
                       <a:picLocks noChangeArrowheads="1" noChangeAspect="1"/>
                     </pic:cNvPicPr>
                   </pic:nvPicPr>
                   <pic:blipFill>
-                    <a:blip r:embed="rId110"/>
+                    <a:blip r:embed="rId111"/>
                     <a:stretch>
                       <a:fillRect/>
                     </a:stretch>
@@ -27229,6 +29841,56 @@
         <w:pStyle w:val="BodyText"/>
       </w:pPr>
       <w:r>
+        <w:t xml:space="preserve">Demonstrated in this case study: cohort flow, event counts,</w:t>
+      </w:r>
+      <w:r>
+        <w:t xml:space="preserve"> </w:t>
+      </w:r>
+      <w:r>
+        <w:t xml:space="preserve">missingness summary, PS overlap, three-way Love plot, weight</w:t>
+      </w:r>
+      <w:r>
+        <w:t xml:space="preserve"> </w:t>
+      </w:r>
+      <w:r>
+        <w:t xml:space="preserve">diagnostics, ESS, negative-control attrition, baseline plasmode</w:t>
+      </w:r>
+      <w:r>
+        <w:t xml:space="preserve"> </w:t>
+      </w:r>
+      <w:r>
+        <w:t xml:space="preserve">results, DQ stress-test results, authorisation gate. Not yet</w:t>
+      </w:r>
+      <w:r>
+        <w:t xml:space="preserve"> </w:t>
+      </w:r>
+      <w:r>
+        <w:t xml:space="preserve">implemented in this release: native competing-risk</w:t>
+      </w:r>
+      <w:r>
+        <w:t xml:space="preserve"> </w:t>
+      </w:r>
+      <w:r>
+        <w:t xml:space="preserve">cumulative-incidence estimands, time-varying treatment, MAR/MNAR</w:t>
+      </w:r>
+      <w:r>
+        <w:t xml:space="preserve"> </w:t>
+      </w:r>
+      <w:r>
+        <w:t xml:space="preserve">missingness models, full-cohort Delta-path IPCW-TMLE (the</w:t>
+      </w:r>
+      <w:r>
+        <w:t xml:space="preserve"> </w:t>
+      </w:r>
+      <w:r>
+        <w:t xml:space="preserve">function falls back to weighted complete-case).</w:t>
+      </w:r>
+    </w:p>
+    <w:p>
+      <w:pPr>
+        <w:pStyle w:val="BodyText"/>
+      </w:pPr>
+      <w:r>
         <w:t xml:space="preserve">At the pre-outcome decision point (</w:t>
       </w:r>
       <w:r>
@@ -27364,8 +30026,8 @@
         <w:t xml:space="preserve">outcome-analysis functions run.</w:t>
       </w:r>
     </w:p>
-    <w:bookmarkEnd w:id="113"/>
-    <w:bookmarkStart w:id="114" w:name="effect-estimates"/>
+    <w:bookmarkEnd w:id="114"/>
+    <w:bookmarkStart w:id="115" w:name="effect-estimates"/>
     <w:p>
       <w:pPr>
         <w:pStyle w:val="Heading2"/>
@@ -28222,13 +30884,13 @@
         <w:t xml:space="preserve"> </w:t>
       </w:r>
       <w:r>
-        <w:t xml:space="preserve">in functional outcome that the prespecified primary estimator</w:t>
-      </w:r>
-      <w:r>
-        <w:t xml:space="preserve"> </w:t>
-      </w:r>
-      <w:r>
-        <w:t xml:space="preserve">cannot distinguish from null at</w:t>
+        <w:t xml:space="preserve">in functional outcome; the prespecified primary estimator does</w:t>
+      </w:r>
+      <w:r>
+        <w:t xml:space="preserve"> </w:t>
+      </w:r>
+      <w:r>
+        <w:t xml:space="preserve">not confirm the signal under the prespecified workflow at</w:t>
       </w:r>
       <w:r>
         <w:t xml:space="preserve"> </w:t>
@@ -28248,7 +30910,13 @@
         </m:r>
       </m:oMath>
       <w:r>
-        <w:t xml:space="preserve">.”</w:t>
+        <w:t xml:space="preserve">, and the analysis proceeded under prespecified</w:t>
+      </w:r>
+      <w:r>
+        <w:t xml:space="preserve"> </w:t>
+      </w:r>
+      <w:r>
+        <w:t xml:space="preserve">diagnostics.”</w:t>
       </w:r>
       <w:r>
         <w:t xml:space="preserve"> </w:t>
@@ -28287,8 +30955,8 @@
         <w:t xml:space="preserve">of the six estimates further toward null.</w:t>
       </w:r>
     </w:p>
-    <w:bookmarkEnd w:id="114"/>
-    <w:bookmarkStart w:id="118" w:name="Xc7557c3308f3f2c598231e06131cd13238ac1eb"/>
+    <w:bookmarkEnd w:id="115"/>
+    <w:bookmarkStart w:id="119" w:name="Xc7557c3308f3f2c598231e06131cd13238ac1eb"/>
     <w:p>
       <w:pPr>
         <w:pStyle w:val="Heading2"/>
@@ -28297,7 +30965,7 @@
         <w:t xml:space="preserve">9.6 What the case study tells us about the workflow</w:t>
       </w:r>
     </w:p>
-    <w:bookmarkStart w:id="115" w:name="X4a7de7fd9cca2a3eb7ce1d9546acd05cc50d75c"/>
+    <w:bookmarkStart w:id="116" w:name="X4a7de7fd9cca2a3eb7ce1d9546acd05cc50d75c"/>
     <w:p>
       <w:pPr>
         <w:pStyle w:val="Heading3"/>
@@ -28388,8 +31056,8 @@
         <w:t xml:space="preserve">.</w:t>
       </w:r>
     </w:p>
-    <w:bookmarkEnd w:id="115"/>
-    <w:bookmarkStart w:id="116" w:name="outcome-blind-plasmode"/>
+    <w:bookmarkEnd w:id="116"/>
+    <w:bookmarkStart w:id="117" w:name="outcome-blind-plasmode"/>
     <w:p>
       <w:pPr>
         <w:pStyle w:val="Heading3"/>
@@ -28573,8 +31241,8 @@
         <w:t xml:space="preserve">extensions planned for cleanTMLE 0.2.</w:t>
       </w:r>
     </w:p>
-    <w:bookmarkEnd w:id="116"/>
-    <w:bookmarkStart w:id="117" w:name="X11b03251d4243965818c23e078e2e7dfe52b4c9"/>
+    <w:bookmarkEnd w:id="117"/>
+    <w:bookmarkStart w:id="118" w:name="X11b03251d4243965818c23e078e2e7dfe52b4c9"/>
     <w:p>
       <w:pPr>
         <w:pStyle w:val="Heading3"/>
@@ -28773,10 +31441,10 @@
         <w:t xml:space="preserve">directory contains the data behind the tables above.</w:t>
       </w:r>
     </w:p>
-    <w:bookmarkEnd w:id="117"/>
     <w:bookmarkEnd w:id="118"/>
     <w:bookmarkEnd w:id="119"/>
-    <w:bookmarkStart w:id="133" w:name="sec-discussion"/>
+    <w:bookmarkEnd w:id="120"/>
+    <w:bookmarkStart w:id="134" w:name="sec-discussion"/>
     <w:p>
       <w:pPr>
         <w:pStyle w:val="Heading1"/>
@@ -28785,7 +31453,7 @@
         <w:t xml:space="preserve">10. Discussion</w:t>
       </w:r>
     </w:p>
-    <w:bookmarkStart w:id="120" w:name="what-cleantmle-contributes-operationally"/>
+    <w:bookmarkStart w:id="121" w:name="what-cleantmle-contributes-operationally"/>
     <w:p>
       <w:pPr>
         <w:pStyle w:val="Heading2"/>
@@ -28898,8 +31566,8 @@
         <w:t xml:space="preserve">reviewer.</w:t>
       </w:r>
     </w:p>
-    <w:bookmarkEnd w:id="120"/>
-    <w:bookmarkStart w:id="121" w:name="Xe8fe9eed3aca8891054d00f72c49520182244a2"/>
+    <w:bookmarkEnd w:id="121"/>
+    <w:bookmarkStart w:id="122" w:name="Xe8fe9eed3aca8891054d00f72c49520182244a2"/>
     <w:p>
       <w:pPr>
         <w:pStyle w:val="Heading2"/>
@@ -29037,8 +31705,8 @@
         <w:t xml:space="preserve">.</w:t>
       </w:r>
     </w:p>
-    <w:bookmarkEnd w:id="121"/>
-    <w:bookmarkStart w:id="122" w:name="X77d575563b1a1946325af71eab48d1c62a6f8a8"/>
+    <w:bookmarkEnd w:id="122"/>
+    <w:bookmarkStart w:id="123" w:name="X77d575563b1a1946325af71eab48d1c62a6f8a8"/>
     <w:p>
       <w:pPr>
         <w:pStyle w:val="Heading2"/>
@@ -29162,8 +31830,8 @@
         <w:t xml:space="preserve">than substituting for it.</w:t>
       </w:r>
     </w:p>
-    <w:bookmarkEnd w:id="122"/>
-    <w:bookmarkStart w:id="123" w:name="what-the-dq-stress-test-adds"/>
+    <w:bookmarkEnd w:id="123"/>
+    <w:bookmarkStart w:id="124" w:name="what-the-dq-stress-test-adds"/>
     <w:p>
       <w:pPr>
         <w:pStyle w:val="Heading2"/>
@@ -29210,8 +31878,8 @@
         <w:t xml:space="preserve">fit-for-purpose review.</w:t>
       </w:r>
     </w:p>
-    <w:bookmarkEnd w:id="123"/>
-    <w:bookmarkStart w:id="124" w:name="comparison-with-adjacent-tools"/>
+    <w:bookmarkEnd w:id="124"/>
+    <w:bookmarkStart w:id="125" w:name="comparison-with-adjacent-tools"/>
     <w:p>
       <w:pPr>
         <w:pStyle w:val="Heading2"/>
@@ -29591,8 +32259,8 @@
         <w:t xml:space="preserve">negative-control domains in practice.</w:t>
       </w:r>
     </w:p>
-    <w:bookmarkEnd w:id="124"/>
-    <w:bookmarkStart w:id="125" w:name="sec-limitations"/>
+    <w:bookmarkEnd w:id="125"/>
+    <w:bookmarkStart w:id="126" w:name="sec-limitations"/>
     <w:p>
       <w:pPr>
         <w:pStyle w:val="Heading2"/>
@@ -29731,8 +32399,8 @@
         <w:t xml:space="preserve">that no amount of replication can correct.</w:t>
       </w:r>
     </w:p>
-    <w:bookmarkEnd w:id="125"/>
-    <w:bookmarkStart w:id="129" w:name="other-limitations"/>
+    <w:bookmarkEnd w:id="126"/>
+    <w:bookmarkStart w:id="130" w:name="other-limitations"/>
     <w:p>
       <w:pPr>
         <w:pStyle w:val="Heading2"/>
@@ -29761,7 +32429,7 @@
         <w:t xml:space="preserve">computational cost, and estimand scope.</w:t>
       </w:r>
     </w:p>
-    <w:bookmarkStart w:id="126" w:name="model-assumptions"/>
+    <w:bookmarkStart w:id="127" w:name="model-assumptions"/>
     <w:p>
       <w:pPr>
         <w:pStyle w:val="Heading3"/>
@@ -29974,8 +32642,8 @@
         <w:t xml:space="preserve">the same demand qualitatively, and the DQ stress test inherits it.</w:t>
       </w:r>
     </w:p>
-    <w:bookmarkEnd w:id="126"/>
-    <w:bookmarkStart w:id="127" w:name="computational-cost"/>
+    <w:bookmarkEnd w:id="127"/>
+    <w:bookmarkStart w:id="128" w:name="computational-cost"/>
     <w:p>
       <w:pPr>
         <w:pStyle w:val="Heading3"/>
@@ -30079,8 +32747,8 @@
         <w:t xml:space="preserve">parallelising the outer loop over scenarios is the right next step.</w:t>
       </w:r>
     </w:p>
-    <w:bookmarkEnd w:id="127"/>
-    <w:bookmarkStart w:id="128" w:name="estimand-scope"/>
+    <w:bookmarkEnd w:id="128"/>
+    <w:bookmarkStart w:id="129" w:name="estimand-scope"/>
     <w:p>
       <w:pPr>
         <w:pStyle w:val="Heading3"/>
@@ -30228,9 +32896,9 @@
         <w:t xml:space="preserve">implementations.</w:t>
       </w:r>
     </w:p>
-    <w:bookmarkEnd w:id="128"/>
     <w:bookmarkEnd w:id="129"/>
-    <w:bookmarkStart w:id="130" w:name="future-extensions"/>
+    <w:bookmarkEnd w:id="130"/>
+    <w:bookmarkStart w:id="131" w:name="future-extensions"/>
     <w:p>
       <w:pPr>
         <w:pStyle w:val="Heading2"/>
@@ -30492,8 +33160,8 @@
         <w:t xml:space="preserve">the audit log.</w:t>
       </w:r>
     </w:p>
-    <w:bookmarkEnd w:id="130"/>
-    <w:bookmarkStart w:id="131" w:name="X3a4c45a4b83f6adca96de927f71cbd45f486421"/>
+    <w:bookmarkEnd w:id="131"/>
+    <w:bookmarkStart w:id="132" w:name="X3a4c45a4b83f6adca96de927f71cbd45f486421"/>
     <w:p>
       <w:pPr>
         <w:pStyle w:val="Heading2"/>
@@ -30609,8 +33277,8 @@
         <w:t xml:space="preserve">.</w:t>
       </w:r>
     </w:p>
-    <w:bookmarkEnd w:id="131"/>
-    <w:bookmarkStart w:id="132" w:name="recommendations-for-practice"/>
+    <w:bookmarkEnd w:id="132"/>
+    <w:bookmarkStart w:id="133" w:name="recommendations-for-practice"/>
     <w:p>
       <w:pPr>
         <w:pStyle w:val="Heading2"/>
@@ -30877,9 +33545,9 @@
         <w:t xml:space="preserve">metrics, the pre-outcome decision, and the post-outcome estimate.</w:t>
       </w:r>
     </w:p>
-    <w:bookmarkEnd w:id="132"/>
     <w:bookmarkEnd w:id="133"/>
-    <w:bookmarkStart w:id="136" w:name="sec-summary"/>
+    <w:bookmarkEnd w:id="134"/>
+    <w:bookmarkStart w:id="137" w:name="sec-summary"/>
     <w:p>
       <w:pPr>
         <w:pStyle w:val="Heading1"/>
@@ -31006,7 +33674,7 @@
       <w:r>
         <w:t xml:space="preserve"> </w:t>
       </w:r>
-      <w:hyperlink r:id="rId134">
+      <w:hyperlink r:id="rId135">
         <w:r>
           <w:rPr>
             <w:rStyle w:val="Hyperlink"/>
@@ -31049,7 +33717,7 @@
       <w:r>
         <w:t xml:space="preserve"> </w:t>
       </w:r>
-      <w:hyperlink r:id="rId135">
+      <w:hyperlink r:id="rId136">
         <w:r>
           <w:rPr>
             <w:rStyle w:val="Hyperlink"/>
@@ -31061,8 +33729,8 @@
         <w:t xml:space="preserve">.</w:t>
       </w:r>
     </w:p>
-    <w:bookmarkEnd w:id="136"/>
-    <w:bookmarkStart w:id="137" w:name="acknowledgements"/>
+    <w:bookmarkEnd w:id="137"/>
+    <w:bookmarkStart w:id="138" w:name="acknowledgements"/>
     <w:p>
       <w:pPr>
         <w:pStyle w:val="Heading1"/>
@@ -31109,8 +33777,8 @@
         <w:t xml:space="preserve">are ours.</w:t>
       </w:r>
     </w:p>
-    <w:bookmarkEnd w:id="137"/>
-    <w:bookmarkStart w:id="222" w:name="references"/>
+    <w:bookmarkEnd w:id="138"/>
+    <w:bookmarkStart w:id="223" w:name="references"/>
     <w:p>
       <w:pPr>
         <w:pStyle w:val="Heading1"/>
@@ -31119,8 +33787,8 @@
         <w:t xml:space="preserve">References</w:t>
       </w:r>
     </w:p>
-    <w:bookmarkStart w:id="221" w:name="refs"/>
-    <w:bookmarkStart w:id="139" w:name="ref-austin2009ps"/>
+    <w:bookmarkStart w:id="222" w:name="refs"/>
+    <w:bookmarkStart w:id="140" w:name="ref-austin2009ps"/>
     <w:p>
       <w:pPr>
         <w:pStyle w:val="Bibliography"/>
@@ -31153,7 +33821,7 @@
       <w:r>
         <w:t xml:space="preserve"> </w:t>
       </w:r>
-      <w:hyperlink r:id="rId138">
+      <w:hyperlink r:id="rId139">
         <w:r>
           <w:rPr>
             <w:rStyle w:val="Hyperlink"/>
@@ -31165,8 +33833,8 @@
         <w:t xml:space="preserve">.</w:t>
       </w:r>
     </w:p>
-    <w:bookmarkEnd w:id="139"/>
-    <w:bookmarkStart w:id="140" w:name="ref-survtmlepackage2018"/>
+    <w:bookmarkEnd w:id="140"/>
+    <w:bookmarkStart w:id="141" w:name="ref-survtmlepackage2018"/>
     <w:p>
       <w:pPr>
         <w:pStyle w:val="Bibliography"/>
@@ -31181,8 +33849,8 @@
         <w:t xml:space="preserve">“Survtmle: Compute Targeted Minimum Loss-Based Estimates in Right-Censored Survival Settings.”</w:t>
       </w:r>
     </w:p>
-    <w:bookmarkEnd w:id="140"/>
-    <w:bookmarkStart w:id="142" w:name="ref-cashin2024target"/>
+    <w:bookmarkEnd w:id="141"/>
+    <w:bookmarkStart w:id="143" w:name="ref-cashin2024target"/>
     <w:p>
       <w:pPr>
         <w:pStyle w:val="Bibliography"/>
@@ -31218,7 +33886,7 @@
       <w:r>
         <w:t xml:space="preserve"> </w:t>
       </w:r>
-      <w:hyperlink r:id="rId141">
+      <w:hyperlink r:id="rId142">
         <w:r>
           <w:rPr>
             <w:rStyle w:val="Hyperlink"/>
@@ -31230,8 +33898,8 @@
         <w:t xml:space="preserve">.</w:t>
       </w:r>
     </w:p>
-    <w:bookmarkEnd w:id="142"/>
-    <w:bookmarkStart w:id="144" w:name="ref-chernozhukov2018dml"/>
+    <w:bookmarkEnd w:id="143"/>
+    <w:bookmarkStart w:id="145" w:name="ref-chernozhukov2018dml"/>
     <w:p>
       <w:pPr>
         <w:pStyle w:val="Bibliography"/>
@@ -31264,7 +33932,7 @@
       <w:r>
         <w:t xml:space="preserve"> </w:t>
       </w:r>
-      <w:hyperlink r:id="rId143">
+      <w:hyperlink r:id="rId144">
         <w:r>
           <w:rPr>
             <w:rStyle w:val="Hyperlink"/>
@@ -31276,8 +33944,8 @@
         <w:t xml:space="preserve">.</w:t>
       </w:r>
     </w:p>
-    <w:bookmarkEnd w:id="144"/>
-    <w:bookmarkStart w:id="146" w:name="ref-dang2023roadmap"/>
+    <w:bookmarkEnd w:id="145"/>
+    <w:bookmarkStart w:id="147" w:name="ref-dang2023roadmap"/>
     <w:p>
       <w:pPr>
         <w:pStyle w:val="Bibliography"/>
@@ -31310,7 +33978,7 @@
       <w:r>
         <w:t xml:space="preserve"> </w:t>
       </w:r>
-      <w:hyperlink r:id="rId145">
+      <w:hyperlink r:id="rId146">
         <w:r>
           <w:rPr>
             <w:rStyle w:val="Hyperlink"/>
@@ -31322,8 +33990,8 @@
         <w:t xml:space="preserve">.</w:t>
       </w:r>
     </w:p>
-    <w:bookmarkEnd w:id="146"/>
-    <w:bookmarkStart w:id="148" w:name="ref-diaz2013sensitivity"/>
+    <w:bookmarkEnd w:id="147"/>
+    <w:bookmarkStart w:id="149" w:name="ref-diaz2013sensitivity"/>
     <w:p>
       <w:pPr>
         <w:pStyle w:val="Bibliography"/>
@@ -31356,7 +34024,7 @@
       <w:r>
         <w:t xml:space="preserve"> </w:t>
       </w:r>
-      <w:hyperlink r:id="rId147">
+      <w:hyperlink r:id="rId148">
         <w:r>
           <w:rPr>
             <w:rStyle w:val="Hyperlink"/>
@@ -31368,8 +34036,8 @@
         <w:t xml:space="preserve">.</w:t>
       </w:r>
     </w:p>
-    <w:bookmarkEnd w:id="148"/>
-    <w:bookmarkStart w:id="150" w:name="ref-ema2021registry"/>
+    <w:bookmarkEnd w:id="149"/>
+    <w:bookmarkStart w:id="151" w:name="ref-ema2021registry"/>
     <w:p>
       <w:pPr>
         <w:pStyle w:val="Bibliography"/>
@@ -31386,7 +34054,7 @@
       <w:r>
         <w:t xml:space="preserve"> </w:t>
       </w:r>
-      <w:hyperlink r:id="rId149">
+      <w:hyperlink r:id="rId150">
         <w:r>
           <w:rPr>
             <w:rStyle w:val="Hyperlink"/>
@@ -31398,8 +34066,8 @@
         <w:t xml:space="preserve">.</w:t>
       </w:r>
     </w:p>
-    <w:bookmarkEnd w:id="150"/>
-    <w:bookmarkStart w:id="152" w:name="ref-ema2024guide"/>
+    <w:bookmarkEnd w:id="151"/>
+    <w:bookmarkStart w:id="153" w:name="ref-ema2024guide"/>
     <w:p>
       <w:pPr>
         <w:pStyle w:val="Bibliography"/>
@@ -31428,7 +34096,7 @@
       <w:r>
         <w:t xml:space="preserve"> </w:t>
       </w:r>
-      <w:hyperlink r:id="rId151">
+      <w:hyperlink r:id="rId152">
         <w:r>
           <w:rPr>
             <w:rStyle w:val="Hyperlink"/>
@@ -31440,8 +34108,8 @@
         <w:t xml:space="preserve">.</w:t>
       </w:r>
     </w:p>
-    <w:bookmarkEnd w:id="152"/>
-    <w:bookmarkStart w:id="153" w:name="ref-ema2026rwd"/>
+    <w:bookmarkEnd w:id="153"/>
+    <w:bookmarkStart w:id="154" w:name="ref-ema2026rwd"/>
     <w:p>
       <w:pPr>
         <w:pStyle w:val="Bibliography"/>
@@ -31468,8 +34136,8 @@
         <w:t xml:space="preserve">Medicines Regulation.”</w:t>
       </w:r>
     </w:p>
-    <w:bookmarkEnd w:id="153"/>
-    <w:bookmarkStart w:id="155" w:name="ref-franklin2014plasmode"/>
+    <w:bookmarkEnd w:id="154"/>
+    <w:bookmarkStart w:id="156" w:name="ref-franklin2014plasmode"/>
     <w:p>
       <w:pPr>
         <w:pStyle w:val="Bibliography"/>
@@ -31502,7 +34170,7 @@
       <w:r>
         <w:t xml:space="preserve"> </w:t>
       </w:r>
-      <w:hyperlink r:id="rId154">
+      <w:hyperlink r:id="rId155">
         <w:r>
           <w:rPr>
             <w:rStyle w:val="Hyperlink"/>
@@ -31514,8 +34182,8 @@
         <w:t xml:space="preserve">.</w:t>
       </w:r>
     </w:p>
-    <w:bookmarkEnd w:id="155"/>
-    <w:bookmarkStart w:id="157" w:name="ref-gatto2022spifd"/>
+    <w:bookmarkEnd w:id="156"/>
+    <w:bookmarkStart w:id="158" w:name="ref-gatto2022spifd"/>
     <w:p>
       <w:pPr>
         <w:pStyle w:val="Bibliography"/>
@@ -31548,7 +34216,7 @@
       <w:r>
         <w:t xml:space="preserve"> </w:t>
       </w:r>
-      <w:hyperlink r:id="rId156">
+      <w:hyperlink r:id="rId157">
         <w:r>
           <w:rPr>
             <w:rStyle w:val="Hyperlink"/>
@@ -31560,8 +34228,8 @@
         <w:t xml:space="preserve">.</w:t>
       </w:r>
     </w:p>
-    <w:bookmarkEnd w:id="157"/>
-    <w:bookmarkStart w:id="159" w:name="ref-gatto2023spifd2"/>
+    <w:bookmarkEnd w:id="158"/>
+    <w:bookmarkStart w:id="160" w:name="ref-gatto2023spifd2"/>
     <w:p>
       <w:pPr>
         <w:pStyle w:val="Bibliography"/>
@@ -31594,7 +34262,7 @@
       <w:r>
         <w:t xml:space="preserve"> </w:t>
       </w:r>
-      <w:hyperlink r:id="rId158">
+      <w:hyperlink r:id="rId159">
         <w:r>
           <w:rPr>
             <w:rStyle w:val="Hyperlink"/>
@@ -31606,8 +34274,8 @@
         <w:t xml:space="preserve">.</w:t>
       </w:r>
     </w:p>
-    <w:bookmarkEnd w:id="159"/>
-    <w:bookmarkStart w:id="161" w:name="ref-gruber2022sap"/>
+    <w:bookmarkEnd w:id="160"/>
+    <w:bookmarkStart w:id="162" w:name="ref-gruber2022sap"/>
     <w:p>
       <w:pPr>
         <w:pStyle w:val="Bibliography"/>
@@ -31640,7 +34308,7 @@
       <w:r>
         <w:t xml:space="preserve"> </w:t>
       </w:r>
-      <w:hyperlink r:id="rId160">
+      <w:hyperlink r:id="rId161">
         <w:r>
           <w:rPr>
             <w:rStyle w:val="Hyperlink"/>
@@ -31652,8 +34320,8 @@
         <w:t xml:space="preserve">.</w:t>
       </w:r>
     </w:p>
-    <w:bookmarkEnd w:id="161"/>
-    <w:bookmarkStart w:id="163" w:name="ref-gruber2024evaluating"/>
+    <w:bookmarkEnd w:id="162"/>
+    <w:bookmarkStart w:id="164" w:name="ref-gruber2024evaluating"/>
     <w:p>
       <w:pPr>
         <w:pStyle w:val="Bibliography"/>
@@ -31686,7 +34354,7 @@
       <w:r>
         <w:t xml:space="preserve"> </w:t>
       </w:r>
-      <w:hyperlink r:id="rId162">
+      <w:hyperlink r:id="rId163">
         <w:r>
           <w:rPr>
             <w:rStyle w:val="Hyperlink"/>
@@ -31698,8 +34366,8 @@
         <w:t xml:space="preserve">.</w:t>
       </w:r>
     </w:p>
-    <w:bookmarkEnd w:id="163"/>
-    <w:bookmarkStart w:id="165" w:name="ref-hernan2016targettrial"/>
+    <w:bookmarkEnd w:id="164"/>
+    <w:bookmarkStart w:id="166" w:name="ref-hernan2016targettrial"/>
     <w:p>
       <w:pPr>
         <w:pStyle w:val="Bibliography"/>
@@ -31732,7 +34400,7 @@
       <w:r>
         <w:t xml:space="preserve"> </w:t>
       </w:r>
-      <w:hyperlink r:id="rId164">
+      <w:hyperlink r:id="rId165">
         <w:r>
           <w:rPr>
             <w:rStyle w:val="Hyperlink"/>
@@ -31744,8 +34412,8 @@
         <w:t xml:space="preserve">.</w:t>
       </w:r>
     </w:p>
-    <w:bookmarkEnd w:id="165"/>
-    <w:bookmarkStart w:id="166" w:name="ref-hernan2016target"/>
+    <w:bookmarkEnd w:id="166"/>
+    <w:bookmarkStart w:id="167" w:name="ref-hernan2016target"/>
     <w:p>
       <w:pPr>
         <w:pStyle w:val="Bibliography"/>
@@ -31778,7 +34446,7 @@
       <w:r>
         <w:t xml:space="preserve"> </w:t>
       </w:r>
-      <w:hyperlink r:id="rId164">
+      <w:hyperlink r:id="rId165">
         <w:r>
           <w:rPr>
             <w:rStyle w:val="Hyperlink"/>
@@ -31790,8 +34458,8 @@
         <w:t xml:space="preserve">.</w:t>
       </w:r>
     </w:p>
-    <w:bookmarkEnd w:id="166"/>
-    <w:bookmarkStart w:id="167" w:name="ref-hernan2020causal"/>
+    <w:bookmarkEnd w:id="167"/>
+    <w:bookmarkStart w:id="168" w:name="ref-hernan2020causal"/>
     <w:p>
       <w:pPr>
         <w:pStyle w:val="Bibliography"/>
@@ -31813,8 +34481,8 @@
         <w:t xml:space="preserve">. Boca Raton: Chapman &amp; Hall/CRC.</w:t>
       </w:r>
     </w:p>
-    <w:bookmarkEnd w:id="167"/>
-    <w:bookmarkStart w:id="168" w:name="ref-ich2019e9r1"/>
+    <w:bookmarkEnd w:id="168"/>
+    <w:bookmarkStart w:id="169" w:name="ref-ich2019e9r1"/>
     <w:p>
       <w:pPr>
         <w:pStyle w:val="Bibliography"/>
@@ -31838,8 +34506,8 @@
         <w:t xml:space="preserve">Addendum on Estimands and Sensitivity Analysis in Clinical Trials.”</w:t>
       </w:r>
     </w:p>
-    <w:bookmarkEnd w:id="168"/>
-    <w:bookmarkStart w:id="169" w:name="ref-ich2024m14"/>
+    <w:bookmarkEnd w:id="169"/>
+    <w:bookmarkStart w:id="170" w:name="ref-ich2024m14"/>
     <w:p>
       <w:pPr>
         <w:pStyle w:val="Bibliography"/>
@@ -31863,8 +34531,8 @@
         <w:t xml:space="preserve">Guidance for Industry: General Principles on Planning, Designing, and Analyzing Non-Interventional Studies Using Real-World Data for Safety Assessment of Medicines.”</w:t>
       </w:r>
     </w:p>
-    <w:bookmarkEnd w:id="169"/>
-    <w:bookmarkStart w:id="171" w:name="ref-kahn2016data"/>
+    <w:bookmarkEnd w:id="170"/>
+    <w:bookmarkStart w:id="172" w:name="ref-kahn2016data"/>
     <w:p>
       <w:pPr>
         <w:pStyle w:val="Bibliography"/>
@@ -31897,7 +34565,7 @@
       <w:r>
         <w:t xml:space="preserve"> </w:t>
       </w:r>
-      <w:hyperlink r:id="rId170">
+      <w:hyperlink r:id="rId171">
         <w:r>
           <w:rPr>
             <w:rStyle w:val="Hyperlink"/>
@@ -31909,8 +34577,8 @@
         <w:t xml:space="preserve">.</w:t>
       </w:r>
     </w:p>
-    <w:bookmarkEnd w:id="171"/>
-    <w:bookmarkStart w:id="172" w:name="ref-kent2026fiord"/>
+    <w:bookmarkEnd w:id="172"/>
+    <w:bookmarkStart w:id="173" w:name="ref-kent2026fiord"/>
     <w:p>
       <w:pPr>
         <w:pStyle w:val="Bibliography"/>
@@ -31931,8 +34599,8 @@
         <w:t xml:space="preserve">Conference presentation, 4th Annual Forum on the Integration of Observational and Randomized Data (FIORD), Day 1 Lunch session.</w:t>
       </w:r>
     </w:p>
-    <w:bookmarkEnd w:id="172"/>
-    <w:bookmarkStart w:id="174" w:name="ref-vdL2007superlearner"/>
+    <w:bookmarkEnd w:id="173"/>
+    <w:bookmarkStart w:id="175" w:name="ref-vdL2007superlearner"/>
     <w:p>
       <w:pPr>
         <w:pStyle w:val="Bibliography"/>
@@ -31965,7 +34633,7 @@
       <w:r>
         <w:t xml:space="preserve"> </w:t>
       </w:r>
-      <w:hyperlink r:id="rId173">
+      <w:hyperlink r:id="rId174">
         <w:r>
           <w:rPr>
             <w:rStyle w:val="Hyperlink"/>
@@ -31977,8 +34645,8 @@
         <w:t xml:space="preserve">.</w:t>
       </w:r>
     </w:p>
-    <w:bookmarkEnd w:id="174"/>
-    <w:bookmarkStart w:id="176" w:name="ref-vdL2011tlbook"/>
+    <w:bookmarkEnd w:id="175"/>
+    <w:bookmarkStart w:id="177" w:name="ref-vdL2011tlbook"/>
     <w:p>
       <w:pPr>
         <w:pStyle w:val="Bibliography"/>
@@ -32002,7 +34670,7 @@
       <w:r>
         <w:t xml:space="preserve"> </w:t>
       </w:r>
-      <w:hyperlink r:id="rId175">
+      <w:hyperlink r:id="rId176">
         <w:r>
           <w:rPr>
             <w:rStyle w:val="Hyperlink"/>
@@ -32014,8 +34682,8 @@
         <w:t xml:space="preserve">.</w:t>
       </w:r>
     </w:p>
-    <w:bookmarkEnd w:id="176"/>
-    <w:bookmarkStart w:id="178" w:name="ref-vanderLaan2006tmle"/>
+    <w:bookmarkEnd w:id="177"/>
+    <w:bookmarkStart w:id="179" w:name="ref-vanderLaan2006tmle"/>
     <w:p>
       <w:pPr>
         <w:pStyle w:val="Bibliography"/>
@@ -32048,7 +34716,7 @@
       <w:r>
         <w:t xml:space="preserve"> </w:t>
       </w:r>
-      <w:hyperlink r:id="rId177">
+      <w:hyperlink r:id="rId178">
         <w:r>
           <w:rPr>
             <w:rStyle w:val="Hyperlink"/>
@@ -32060,8 +34728,8 @@
         <w:t xml:space="preserve">.</w:t>
       </w:r>
     </w:p>
-    <w:bookmarkEnd w:id="178"/>
-    <w:bookmarkStart w:id="180" w:name="ref-lash2014qba"/>
+    <w:bookmarkEnd w:id="179"/>
+    <w:bookmarkStart w:id="181" w:name="ref-lash2014qba"/>
     <w:p>
       <w:pPr>
         <w:pStyle w:val="Bibliography"/>
@@ -32094,7 +34762,7 @@
       <w:r>
         <w:t xml:space="preserve"> </w:t>
       </w:r>
-      <w:hyperlink r:id="rId179">
+      <w:hyperlink r:id="rId180">
         <w:r>
           <w:rPr>
             <w:rStyle w:val="Hyperlink"/>
@@ -32106,8 +34774,8 @@
         <w:t xml:space="preserve">.</w:t>
       </w:r>
     </w:p>
-    <w:bookmarkEnd w:id="180"/>
-    <w:bookmarkStart w:id="182" w:name="ref-levintow2023nco"/>
+    <w:bookmarkEnd w:id="181"/>
+    <w:bookmarkStart w:id="183" w:name="ref-levintow2023nco"/>
     <w:p>
       <w:pPr>
         <w:pStyle w:val="Bibliography"/>
@@ -32140,7 +34808,7 @@
       <w:r>
         <w:t xml:space="preserve"> </w:t>
       </w:r>
-      <w:hyperlink r:id="rId181">
+      <w:hyperlink r:id="rId182">
         <w:r>
           <w:rPr>
             <w:rStyle w:val="Hyperlink"/>
@@ -32152,8 +34820,8 @@
         <w:t xml:space="preserve">.</w:t>
       </w:r>
     </w:p>
-    <w:bookmarkEnd w:id="182"/>
-    <w:bookmarkStart w:id="184" w:name="ref-lipsitch2010negative"/>
+    <w:bookmarkEnd w:id="183"/>
+    <w:bookmarkStart w:id="185" w:name="ref-lipsitch2010negative"/>
     <w:p>
       <w:pPr>
         <w:pStyle w:val="Bibliography"/>
@@ -32186,7 +34854,7 @@
       <w:r>
         <w:t xml:space="preserve"> </w:t>
       </w:r>
-      <w:hyperlink r:id="rId183">
+      <w:hyperlink r:id="rId184">
         <w:r>
           <w:rPr>
             <w:rStyle w:val="Hyperlink"/>
@@ -32198,8 +34866,8 @@
         <w:t xml:space="preserve">.</w:t>
       </w:r>
     </w:p>
-    <w:bookmarkEnd w:id="184"/>
-    <w:bookmarkStart w:id="186" w:name="ref-mcgrath2021romiplostim"/>
+    <w:bookmarkEnd w:id="185"/>
+    <w:bookmarkStart w:id="187" w:name="ref-mcgrath2021romiplostim"/>
     <w:p>
       <w:pPr>
         <w:pStyle w:val="Bibliography"/>
@@ -32232,7 +34900,7 @@
       <w:r>
         <w:t xml:space="preserve"> </w:t>
       </w:r>
-      <w:hyperlink r:id="rId185">
+      <w:hyperlink r:id="rId186">
         <w:r>
           <w:rPr>
             <w:rStyle w:val="Hyperlink"/>
@@ -32244,8 +34912,8 @@
         <w:t xml:space="preserve">.</w:t>
       </w:r>
     </w:p>
-    <w:bookmarkEnd w:id="186"/>
-    <w:bookmarkStart w:id="188" w:name="ref-muntner2024staging"/>
+    <w:bookmarkEnd w:id="187"/>
+    <w:bookmarkStart w:id="189" w:name="ref-muntner2024staging"/>
     <w:p>
       <w:pPr>
         <w:pStyle w:val="Bibliography"/>
@@ -32278,7 +34946,7 @@
       <w:r>
         <w:t xml:space="preserve"> </w:t>
       </w:r>
-      <w:hyperlink r:id="rId187">
+      <w:hyperlink r:id="rId188">
         <w:r>
           <w:rPr>
             <w:rStyle w:val="Hyperlink"/>
@@ -32290,8 +34958,8 @@
         <w:t xml:space="preserve">.</w:t>
       </w:r>
     </w:p>
-    <w:bookmarkEnd w:id="188"/>
-    <w:bookmarkStart w:id="190" w:name="ref-nice2022rwe"/>
+    <w:bookmarkEnd w:id="189"/>
+    <w:bookmarkStart w:id="191" w:name="ref-nice2022rwe"/>
     <w:p>
       <w:pPr>
         <w:pStyle w:val="Bibliography"/>
@@ -32323,7 +34991,7 @@
       <w:r>
         <w:t xml:space="preserve"> </w:t>
       </w:r>
-      <w:hyperlink r:id="rId189">
+      <w:hyperlink r:id="rId190">
         <w:r>
           <w:rPr>
             <w:rStyle w:val="Hyperlink"/>
@@ -32335,8 +35003,8 @@
         <w:t xml:space="preserve">.</w:t>
       </w:r>
     </w:p>
-    <w:bookmarkEnd w:id="190"/>
-    <w:bookmarkStart w:id="192" w:name="ref-petersen2014roadmap"/>
+    <w:bookmarkEnd w:id="191"/>
+    <w:bookmarkStart w:id="193" w:name="ref-petersen2014roadmap"/>
     <w:p>
       <w:pPr>
         <w:pStyle w:val="Bibliography"/>
@@ -32369,7 +35037,7 @@
       <w:r>
         <w:t xml:space="preserve"> </w:t>
       </w:r>
-      <w:hyperlink r:id="rId191">
+      <w:hyperlink r:id="rId192">
         <w:r>
           <w:rPr>
             <w:rStyle w:val="Hyperlink"/>
@@ -32381,8 +35049,8 @@
         <w:t xml:space="preserve">.</w:t>
       </w:r>
     </w:p>
-    <w:bookmarkEnd w:id="192"/>
-    <w:bookmarkStart w:id="194" w:name="ref-phillips2023sl"/>
+    <w:bookmarkEnd w:id="193"/>
+    <w:bookmarkStart w:id="195" w:name="ref-phillips2023sl"/>
     <w:p>
       <w:pPr>
         <w:pStyle w:val="Bibliography"/>
@@ -32415,7 +35083,7 @@
       <w:r>
         <w:t xml:space="preserve"> </w:t>
       </w:r>
-      <w:hyperlink r:id="rId193">
+      <w:hyperlink r:id="rId194">
         <w:r>
           <w:rPr>
             <w:rStyle w:val="Hyperlink"/>
@@ -32427,8 +35095,8 @@
         <w:t xml:space="preserve">.</w:t>
       </w:r>
     </w:p>
-    <w:bookmarkEnd w:id="194"/>
-    <w:bookmarkStart w:id="196" w:name="ref-rcoreteam2024"/>
+    <w:bookmarkEnd w:id="195"/>
+    <w:bookmarkStart w:id="197" w:name="ref-rcoreteam2024"/>
     <w:p>
       <w:pPr>
         <w:pStyle w:val="Bibliography"/>
@@ -32457,7 +35125,7 @@
       <w:r>
         <w:t xml:space="preserve"> </w:t>
       </w:r>
-      <w:hyperlink r:id="rId195">
+      <w:hyperlink r:id="rId196">
         <w:r>
           <w:rPr>
             <w:rStyle w:val="Hyperlink"/>
@@ -32469,8 +35137,8 @@
         <w:t xml:space="preserve">.</w:t>
       </w:r>
     </w:p>
-    <w:bookmarkEnd w:id="196"/>
-    <w:bookmarkStart w:id="197" w:name="ref-robins1986newapproach"/>
+    <w:bookmarkEnd w:id="197"/>
+    <w:bookmarkStart w:id="198" w:name="ref-robins1986newapproach"/>
     <w:p>
       <w:pPr>
         <w:pStyle w:val="Bibliography"/>
@@ -32501,8 +35169,8 @@
         <w:t xml:space="preserve">7 (9-12): 1393–1512.</w:t>
       </w:r>
     </w:p>
-    <w:bookmarkEnd w:id="197"/>
-    <w:bookmarkStart w:id="198" w:name="ref-robins1992rotnitzky"/>
+    <w:bookmarkEnd w:id="198"/>
+    <w:bookmarkStart w:id="199" w:name="ref-robins1992rotnitzky"/>
     <w:p>
       <w:pPr>
         <w:pStyle w:val="Bibliography"/>
@@ -32523,8 +35191,8 @@
         <w:t xml:space="preserve">297–331.</w:t>
       </w:r>
     </w:p>
-    <w:bookmarkEnd w:id="198"/>
-    <w:bookmarkStart w:id="199" w:name="ref-schreck2024plasmode"/>
+    <w:bookmarkEnd w:id="199"/>
+    <w:bookmarkStart w:id="200" w:name="ref-schreck2024plasmode"/>
     <w:p>
       <w:pPr>
         <w:pStyle w:val="Bibliography"/>
@@ -32552,8 +35220,8 @@
         <w:t xml:space="preserve">.</w:t>
       </w:r>
     </w:p>
-    <w:bookmarkEnd w:id="199"/>
-    <w:bookmarkStart w:id="201" w:name="ref-schuler2017tmle"/>
+    <w:bookmarkEnd w:id="200"/>
+    <w:bookmarkStart w:id="202" w:name="ref-schuler2017tmle"/>
     <w:p>
       <w:pPr>
         <w:pStyle w:val="Bibliography"/>
@@ -32586,7 +35254,7 @@
       <w:r>
         <w:t xml:space="preserve"> </w:t>
       </w:r>
-      <w:hyperlink r:id="rId200">
+      <w:hyperlink r:id="rId201">
         <w:r>
           <w:rPr>
             <w:rStyle w:val="Hyperlink"/>
@@ -32598,8 +35266,8 @@
         <w:t xml:space="preserve">.</w:t>
       </w:r>
     </w:p>
-    <w:bookmarkEnd w:id="201"/>
-    <w:bookmarkStart w:id="203" w:name="ref-fda2018rwe"/>
+    <w:bookmarkEnd w:id="202"/>
+    <w:bookmarkStart w:id="204" w:name="ref-fda2018rwe"/>
     <w:p>
       <w:pPr>
         <w:pStyle w:val="Bibliography"/>
@@ -32628,7 +35296,7 @@
       <w:r>
         <w:t xml:space="preserve"> </w:t>
       </w:r>
-      <w:hyperlink r:id="rId202">
+      <w:hyperlink r:id="rId203">
         <w:r>
           <w:rPr>
             <w:rStyle w:val="Hyperlink"/>
@@ -32640,8 +35308,8 @@
         <w:t xml:space="preserve">.</w:t>
       </w:r>
     </w:p>
-    <w:bookmarkEnd w:id="203"/>
-    <w:bookmarkStart w:id="205" w:name="ref-fda2021registries"/>
+    <w:bookmarkEnd w:id="204"/>
+    <w:bookmarkStart w:id="206" w:name="ref-fda2021registries"/>
     <w:p>
       <w:pPr>
         <w:pStyle w:val="Bibliography"/>
@@ -32658,7 +35326,7 @@
       <w:r>
         <w:t xml:space="preserve"> </w:t>
       </w:r>
-      <w:hyperlink r:id="rId204">
+      <w:hyperlink r:id="rId205">
         <w:r>
           <w:rPr>
             <w:rStyle w:val="Hyperlink"/>
@@ -32670,8 +35338,8 @@
         <w:t xml:space="preserve">.</w:t>
       </w:r>
     </w:p>
-    <w:bookmarkEnd w:id="205"/>
-    <w:bookmarkStart w:id="207" w:name="ref-fda2024considerations"/>
+    <w:bookmarkEnd w:id="206"/>
+    <w:bookmarkStart w:id="208" w:name="ref-fda2024considerations"/>
     <w:p>
       <w:pPr>
         <w:pStyle w:val="Bibliography"/>
@@ -32688,7 +35356,7 @@
       <w:r>
         <w:t xml:space="preserve"> </w:t>
       </w:r>
-      <w:hyperlink r:id="rId206">
+      <w:hyperlink r:id="rId207">
         <w:r>
           <w:rPr>
             <w:rStyle w:val="Hyperlink"/>
@@ -32700,8 +35368,8 @@
         <w:t xml:space="preserve">.</w:t>
       </w:r>
     </w:p>
-    <w:bookmarkEnd w:id="207"/>
-    <w:bookmarkStart w:id="209" w:name="ref-fda2024ehrclaims"/>
+    <w:bookmarkEnd w:id="208"/>
+    <w:bookmarkStart w:id="210" w:name="ref-fda2024ehrclaims"/>
     <w:p>
       <w:pPr>
         <w:pStyle w:val="Bibliography"/>
@@ -32718,7 +35386,7 @@
       <w:r>
         <w:t xml:space="preserve"> </w:t>
       </w:r>
-      <w:hyperlink r:id="rId208">
+      <w:hyperlink r:id="rId209">
         <w:r>
           <w:rPr>
             <w:rStyle w:val="Hyperlink"/>
@@ -32730,8 +35398,8 @@
         <w:t xml:space="preserve">.</w:t>
       </w:r>
     </w:p>
-    <w:bookmarkEnd w:id="209"/>
-    <w:bookmarkStart w:id="211" w:name="ref-fda2024noninterventional"/>
+    <w:bookmarkEnd w:id="210"/>
+    <w:bookmarkStart w:id="212" w:name="ref-fda2024noninterventional"/>
     <w:p>
       <w:pPr>
         <w:pStyle w:val="Bibliography"/>
@@ -32748,7 +35416,7 @@
       <w:r>
         <w:t xml:space="preserve"> </w:t>
       </w:r>
-      <w:hyperlink r:id="rId210">
+      <w:hyperlink r:id="rId211">
         <w:r>
           <w:rPr>
             <w:rStyle w:val="Hyperlink"/>
@@ -32760,8 +35428,8 @@
         <w:t xml:space="preserve">.</w:t>
       </w:r>
     </w:p>
-    <w:bookmarkEnd w:id="211"/>
-    <w:bookmarkStart w:id="213" w:name="ref-vanderWeele2017evalue"/>
+    <w:bookmarkEnd w:id="212"/>
+    <w:bookmarkStart w:id="214" w:name="ref-vanderWeele2017evalue"/>
     <w:p>
       <w:pPr>
         <w:pStyle w:val="Bibliography"/>
@@ -32803,7 +35471,7 @@
       <w:r>
         <w:t xml:space="preserve"> </w:t>
       </w:r>
-      <w:hyperlink r:id="rId212">
+      <w:hyperlink r:id="rId213">
         <w:r>
           <w:rPr>
             <w:rStyle w:val="Hyperlink"/>
@@ -32815,8 +35483,8 @@
         <w:t xml:space="preserve">.</w:t>
       </w:r>
     </w:p>
-    <w:bookmarkEnd w:id="213"/>
-    <w:bookmarkStart w:id="215" w:name="ref-wang2021startrwe"/>
+    <w:bookmarkEnd w:id="214"/>
+    <w:bookmarkStart w:id="216" w:name="ref-wang2021startrwe"/>
     <w:p>
       <w:pPr>
         <w:pStyle w:val="Bibliography"/>
@@ -32855,7 +35523,7 @@
       <w:r>
         <w:t xml:space="preserve"> </w:t>
       </w:r>
-      <w:hyperlink r:id="rId214">
+      <w:hyperlink r:id="rId215">
         <w:r>
           <w:rPr>
             <w:rStyle w:val="Hyperlink"/>
@@ -32867,8 +35535,8 @@
         <w:t xml:space="preserve">.</w:t>
       </w:r>
     </w:p>
-    <w:bookmarkEnd w:id="215"/>
-    <w:bookmarkStart w:id="217" w:name="ref-wang2023harper"/>
+    <w:bookmarkEnd w:id="216"/>
+    <w:bookmarkStart w:id="218" w:name="ref-wang2023harper"/>
     <w:p>
       <w:pPr>
         <w:pStyle w:val="Bibliography"/>
@@ -32904,7 +35572,7 @@
       <w:r>
         <w:t xml:space="preserve"> </w:t>
       </w:r>
-      <w:hyperlink r:id="rId216">
+      <w:hyperlink r:id="rId217">
         <w:r>
           <w:rPr>
             <w:rStyle w:val="Hyperlink"/>
@@ -32916,8 +35584,8 @@
         <w:t xml:space="preserve">.</w:t>
       </w:r>
     </w:p>
-    <w:bookmarkEnd w:id="217"/>
-    <w:bookmarkStart w:id="218" w:name="ref-lmtppackage2021"/>
+    <w:bookmarkEnd w:id="218"/>
+    <w:bookmarkStart w:id="219" w:name="ref-lmtppackage2021"/>
     <w:p>
       <w:pPr>
         <w:pStyle w:val="Bibliography"/>
@@ -32932,8 +35600,8 @@
         <w:t xml:space="preserve">“Lmtp: Non-Parametric Causal Effects of Feasible Interventions Based on Modified Treatment Policies.”</w:t>
       </w:r>
     </w:p>
-    <w:bookmarkEnd w:id="218"/>
-    <w:bookmarkStart w:id="219" w:name="ref-xu2020bootstrap"/>
+    <w:bookmarkEnd w:id="219"/>
+    <w:bookmarkStart w:id="220" w:name="ref-xu2020bootstrap"/>
     <w:p>
       <w:pPr>
         <w:pStyle w:val="Bibliography"/>
@@ -32964,8 +35632,8 @@
         <w:t xml:space="preserve">74 (4): 345–58.</w:t>
       </w:r>
     </w:p>
-    <w:bookmarkEnd w:id="219"/>
-    <w:bookmarkStart w:id="220" w:name="ref-zheng2011crossvalidated"/>
+    <w:bookmarkEnd w:id="220"/>
+    <w:bookmarkStart w:id="221" w:name="ref-zheng2011crossvalidated"/>
     <w:p>
       <w:pPr>
         <w:pStyle w:val="Bibliography"/>
@@ -32999,8 +35667,8 @@
         <w:t xml:space="preserve">, 459–74. Springer.</w:t>
       </w:r>
     </w:p>
-    <w:bookmarkEnd w:id="220"/>
     <w:bookmarkEnd w:id="221"/>
+    <w:bookmarkEnd w:id="222"/>
     <w:p>
       <w:pPr>
         <w:pStyle w:val="SourceCode"/>
@@ -33318,7 +35986,7 @@
         <w:t xml:space="preserve">R&gt;  [41] pkgconfig_2.0.3    htmltools_0.5.8.1</w:t>
       </w:r>
     </w:p>
-    <w:bookmarkEnd w:id="222"/>
+    <w:bookmarkEnd w:id="223"/>
     <w:sectPr/>
   </w:body>
 </w:document>

</xml_diff>

<commit_message>
Re-render manuscript DOCX with FIORD integration edits
</commit_message>
<xml_diff>
--- a/reports/manuscript_outcome_blind_dq.docx
+++ b/reports/manuscript_outcome_blind_dq.docx
@@ -8340,67 +8340,135 @@
         <w:t xml:space="preserve">5. Data Quality as a Quantifiable Threat</w:t>
       </w:r>
     </w:p>
-    <w:bookmarkStart w:id="51" w:name="X262475fd6dc51a12a4d5d933c1148a3024c08ab"/>
     <w:p>
       <w:pPr>
-        <w:pStyle w:val="Heading2"/>
+        <w:pStyle w:val="FirstParagraph"/>
       </w:pPr>
       <w:r>
-        <w:t xml:space="preserve">5.1 Why plasmode DQ stress testing adds information beyond standard pre-outcome diagnostics</w:t>
-      </w:r>
-    </w:p>
-    <w:p>
-      <w:pPr>
-        <w:pStyle w:val="Compact"/>
-        <w:numPr>
-          <w:ilvl w:val="0"/>
-          <w:numId w:val="1002"/>
-        </w:numPr>
-      </w:pPr>
-      <w:r>
-        <w:t xml:space="preserve">Propensity-score diagnostics</w:t>
-      </w:r>
-      <w:r>
-        <w:t xml:space="preserve"> </w:t>
-      </w:r>
-      <w:r>
-        <w:t xml:space="preserve">(Austin 2009)</w:t>
-      </w:r>
-      <w:r>
-        <w:t xml:space="preserve"> </w:t>
-      </w:r>
-      <w:r>
-        <w:t xml:space="preserve">assess overlap,</w:t>
-      </w:r>
-      <w:r>
-        <w:t xml:space="preserve"> </w:t>
-      </w:r>
-      <w:r>
-        <w:t xml:space="preserve">balance, and design feasibility, not estimator operating</w:t>
-      </w:r>
-      <w:r>
-        <w:t xml:space="preserve"> </w:t>
-      </w:r>
-      <w:r>
-        <w:t xml:space="preserve">characteristics.</w:t>
-      </w:r>
-    </w:p>
-    <w:p>
-      <w:pPr>
-        <w:pStyle w:val="Compact"/>
-        <w:numPr>
-          <w:ilvl w:val="0"/>
-          <w:numId w:val="1002"/>
-        </w:numPr>
-      </w:pPr>
-      <w:r>
-        <w:t xml:space="preserve">Baseline plasmode simulation assesses candidate estimators under</w:t>
-      </w:r>
-      <w:r>
-        <w:t xml:space="preserve"> </w:t>
-      </w:r>
-      <w:r>
-        <w:t xml:space="preserve">a</w:t>
+        <w:t xml:space="preserve">The outcome-blind plasmode loop on which the DQ stress test is built</w:t>
+      </w:r>
+      <w:r>
+        <w:t xml:space="preserve"> </w:t>
+      </w:r>
+      <w:r>
+        <w:t xml:space="preserve">follows the guidance developed in the FIORD outcome-blind simulation</w:t>
+      </w:r>
+      <w:r>
+        <w:t xml:space="preserve"> </w:t>
+      </w:r>
+      <w:r>
+        <w:t xml:space="preserve">manuscript</w:t>
+      </w:r>
+      <w:r>
+        <w:t xml:space="preserve"> </w:t>
+      </w:r>
+      <w:r>
+        <w:t xml:space="preserve">(Nance et al. 2026)</w:t>
+      </w:r>
+      <w:r>
+        <w:t xml:space="preserve">, which formalises a five-step pre-outcome</w:t>
+      </w:r>
+      <w:r>
+        <w:t xml:space="preserve"> </w:t>
+      </w:r>
+      <w:r>
+        <w:t xml:space="preserve">candidate-evaluation procedure: (1) declare the candidate estimators,</w:t>
+      </w:r>
+      <w:r>
+        <w:t xml:space="preserve"> </w:t>
+      </w:r>
+      <w:r>
+        <w:t xml:space="preserve">learner libraries, truncation grids, and variance methods to be</w:t>
+      </w:r>
+      <w:r>
+        <w:t xml:space="preserve"> </w:t>
+      </w:r>
+      <w:r>
+        <w:t xml:space="preserve">compared; (2) specify a data-generating process; (3) generate</w:t>
+      </w:r>
+      <w:r>
+        <w:t xml:space="preserve"> </w:t>
+      </w:r>
+      <w:r>
+        <w:t xml:space="preserve">replicates and apply candidate estimators factorially; (4) select</w:t>
+      </w:r>
+      <w:r>
+        <w:t xml:space="preserve"> </w:t>
+      </w:r>
+      <w:r>
+        <w:t xml:space="preserve">candidates in two stages, first the point estimator (against an</w:t>
+      </w:r>
+      <w:r>
+        <w:t xml:space="preserve"> </w:t>
+      </w:r>
+      <w:r>
+        <w:t xml:space="preserve">oracle-coverage screen built from the Monte Carlo empirical SE),</w:t>
+      </w:r>
+      <w:r>
+        <w:t xml:space="preserve"> </w:t>
+      </w:r>
+      <w:r>
+        <w:t xml:space="preserve">then the variance method; (5) implement on real data and report</w:t>
+      </w:r>
+      <w:r>
+        <w:t xml:space="preserve"> </w:t>
+      </w:r>
+      <w:r>
+        <w:t xml:space="preserve">transparently. FIORD also formalises a</w:t>
+      </w:r>
+      <w:r>
+        <w:t xml:space="preserve"> </w:t>
+      </w:r>
+      <w:r>
+        <w:rPr>
+          <w:b/>
+          <w:bCs/>
+        </w:rPr>
+        <w:t xml:space="preserve">spectrum of data-generating</w:t>
+      </w:r>
+      <w:r>
+        <w:rPr>
+          <w:b/>
+          <w:bCs/>
+        </w:rPr>
+        <w:t xml:space="preserve"> </w:t>
+      </w:r>
+      <w:r>
+        <w:rPr>
+          <w:b/>
+          <w:bCs/>
+        </w:rPr>
+        <w:t xml:space="preserve">processes</w:t>
+      </w:r>
+      <w:r>
+        <w:t xml:space="preserve"> </w:t>
+      </w:r>
+      <w:r>
+        <w:t xml:space="preserve">for the simulation, from fully investigator-specified</w:t>
+      </w:r>
+      <w:r>
+        <w:t xml:space="preserve"> </w:t>
+      </w:r>
+      <w:r>
+        <w:t xml:space="preserve">parametric structural equations, through hybrid generators that use</w:t>
+      </w:r>
+      <w:r>
+        <w:t xml:space="preserve"> </w:t>
+      </w:r>
+      <w:r>
+        <w:t xml:space="preserve">empirical covariates and fitted treatment / censoring mechanisms with</w:t>
+      </w:r>
+      <w:r>
+        <w:t xml:space="preserve"> </w:t>
+      </w:r>
+      <w:r>
+        <w:t xml:space="preserve">an investigator-specified outcome regression, to parametric bootstraps</w:t>
+      </w:r>
+      <w:r>
+        <w:t xml:space="preserve"> </w:t>
+      </w:r>
+      <w:r>
+        <w:t xml:space="preserve">from the fitted joint. cleanTMLE’s default plasmode sits in the</w:t>
       </w:r>
       <w:r>
         <w:t xml:space="preserve"> </w:t>
@@ -8410,13 +8478,13 @@
           <w:i/>
           <w:iCs/>
         </w:rPr>
-        <w:t xml:space="preserve">locked</w:t>
-      </w:r>
-      <w:r>
-        <w:t xml:space="preserve"> </w:t>
-      </w:r>
-      <w:r>
-        <w:t xml:space="preserve">synthetic outcome model using the empirical</w:t>
+        <w:t xml:space="preserve">hybrid</w:t>
+      </w:r>
+      <w:r>
+        <w:t xml:space="preserve"> </w:t>
+      </w:r>
+      <w:r>
+        <w:t xml:space="preserve">middle of this spectrum: it uses the empirical</w:t>
       </w:r>
       <w:r>
         <w:t xml:space="preserve"> </w:t>
@@ -8449,7 +8517,70 @@
         <w:t xml:space="preserve"> </w:t>
       </w:r>
       <w:r>
-        <w:t xml:space="preserve">structure.</w:t>
+        <w:t xml:space="preserve">structure with a covariate-only outcome model, never the joint</w:t>
+      </w:r>
+      <w:r>
+        <w:t xml:space="preserve"> </w:t>
+      </w:r>
+      <m:oMath>
+        <m:d>
+          <m:dPr>
+            <m:begChr m:val="("/>
+            <m:endChr m:val=")"/>
+            <m:sepChr m:val=""/>
+            <m:grow/>
+          </m:dPr>
+          <m:e>
+            <m:r>
+              <m:t>A</m:t>
+            </m:r>
+            <m:r>
+              <m:rPr>
+                <m:sty m:val="p"/>
+              </m:rPr>
+              <m:t>,</m:t>
+            </m:r>
+            <m:r>
+              <m:t>Y</m:t>
+            </m:r>
+          </m:e>
+        </m:d>
+        <m:r>
+          <m:rPr>
+            <m:sty m:val="p"/>
+          </m:rPr>
+          <m:t>∣</m:t>
+        </m:r>
+        <m:r>
+          <m:t>W</m:t>
+        </m:r>
+      </m:oMath>
+      <w:r>
+        <w:t xml:space="preserve"> </w:t>
+      </w:r>
+      <w:r>
+        <w:t xml:space="preserve">relationship. The DQ stress test extends FIORD by</w:t>
+      </w:r>
+      <w:r>
+        <w:t xml:space="preserve"> </w:t>
+      </w:r>
+      <w:r>
+        <w:t xml:space="preserve">adding the prespecified perturbation step on top of the same</w:t>
+      </w:r>
+      <w:r>
+        <w:t xml:space="preserve"> </w:t>
+      </w:r>
+      <w:r>
+        <w:t xml:space="preserve">hybrid generator.</w:t>
+      </w:r>
+    </w:p>
+    <w:bookmarkStart w:id="51" w:name="X262475fd6dc51a12a4d5d933c1148a3024c08ab"/>
+    <w:p>
+      <w:pPr>
+        <w:pStyle w:val="Heading2"/>
+      </w:pPr>
+      <w:r>
+        <w:t xml:space="preserve">5.1 Why plasmode DQ stress testing adds information beyond standard pre-outcome diagnostics</w:t>
       </w:r>
     </w:p>
     <w:p>
@@ -8461,25 +8592,31 @@
         </w:numPr>
       </w:pPr>
       <w:r>
-        <w:t xml:space="preserve">Negative-control analyses probe residual bias for selected NC</w:t>
-      </w:r>
-      <w:r>
-        <w:t xml:space="preserve"> </w:t>
-      </w:r>
-      <w:r>
-        <w:t xml:space="preserve">outcomes through a different data-generating channel and do not</w:t>
-      </w:r>
-      <w:r>
-        <w:t xml:space="preserve"> </w:t>
-      </w:r>
-      <w:r>
-        <w:t xml:space="preserve">characterise the behaviour of the primary estimator under DQ</w:t>
-      </w:r>
-      <w:r>
-        <w:t xml:space="preserve"> </w:t>
-      </w:r>
-      <w:r>
-        <w:t xml:space="preserve">perturbations.</w:t>
+        <w:t xml:space="preserve">Propensity-score diagnostics</w:t>
+      </w:r>
+      <w:r>
+        <w:t xml:space="preserve"> </w:t>
+      </w:r>
+      <w:r>
+        <w:t xml:space="preserve">(Austin 2009)</w:t>
+      </w:r>
+      <w:r>
+        <w:t xml:space="preserve"> </w:t>
+      </w:r>
+      <w:r>
+        <w:t xml:space="preserve">assess overlap,</w:t>
+      </w:r>
+      <w:r>
+        <w:t xml:space="preserve"> </w:t>
+      </w:r>
+      <w:r>
+        <w:t xml:space="preserve">balance, and design feasibility, not estimator operating</w:t>
+      </w:r>
+      <w:r>
+        <w:t xml:space="preserve"> </w:t>
+      </w:r>
+      <w:r>
+        <w:t xml:space="preserve">characteristics.</w:t>
       </w:r>
     </w:p>
     <w:p>
@@ -8491,13 +8628,13 @@
         </w:numPr>
       </w:pPr>
       <w:r>
-        <w:t xml:space="preserve">DQ stress testing asks whether conclusions about estimator</w:t>
-      </w:r>
-      <w:r>
-        <w:t xml:space="preserve"> </w:t>
-      </w:r>
-      <w:r>
-        <w:t xml:space="preserve">suitability</w:t>
+        <w:t xml:space="preserve">Baseline plasmode simulation assesses candidate estimators under</w:t>
+      </w:r>
+      <w:r>
+        <w:t xml:space="preserve"> </w:t>
+      </w:r>
+      <w:r>
+        <w:t xml:space="preserve">a</w:t>
       </w:r>
       <w:r>
         <w:t xml:space="preserve"> </w:t>
@@ -8507,105 +8644,13 @@
           <w:i/>
           <w:iCs/>
         </w:rPr>
-        <w:t xml:space="preserve">persist</w:t>
-      </w:r>
-      <w:r>
-        <w:t xml:space="preserve"> </w:t>
-      </w:r>
-      <w:r>
-        <w:t xml:space="preserve">under prespecified violations or</w:t>
-      </w:r>
-      <w:r>
-        <w:t xml:space="preserve"> </w:t>
-      </w:r>
-      <w:r>
-        <w:t xml:space="preserve">degradations tied to fit-for-purpose concerns.</w:t>
-      </w:r>
-    </w:p>
-    <w:p>
-      <w:pPr>
-        <w:pStyle w:val="Compact"/>
-        <w:numPr>
-          <w:ilvl w:val="0"/>
-          <w:numId w:val="1002"/>
-        </w:numPr>
-      </w:pPr>
-      <w:r>
-        <w:t xml:space="preserve">A STOP under a stress scenario should be read as evidence that</w:t>
-      </w:r>
-      <w:r>
-        <w:t xml:space="preserve"> </w:t>
-      </w:r>
-      <w:r>
-        <w:t xml:space="preserve">the study requires redesign, external validation, additional</w:t>
-      </w:r>
-      <w:r>
-        <w:t xml:space="preserve"> </w:t>
-      </w:r>
-      <w:r>
-        <w:t xml:space="preserve">sensitivity analysis, or narrower causal claims before outcome</w:t>
-      </w:r>
-      <w:r>
-        <w:t xml:space="preserve"> </w:t>
-      </w:r>
-      <w:r>
-        <w:t xml:space="preserve">access.</w:t>
-      </w:r>
-    </w:p>
-    <w:p>
-      <w:pPr>
-        <w:pStyle w:val="FirstParagraph"/>
-      </w:pPr>
-      <w:r>
-        <w:t xml:space="preserve">Four pre-outcome tools answer four different questions and are</w:t>
-      </w:r>
-      <w:r>
-        <w:t xml:space="preserve"> </w:t>
-      </w:r>
-      <w:r>
-        <w:t xml:space="preserve">complementary rather than substitutable. (i) Propensity-score</w:t>
-      </w:r>
-      <w:r>
-        <w:t xml:space="preserve"> </w:t>
-      </w:r>
-      <w:r>
-        <w:t xml:space="preserve">diagnostics assess empirical comparability, overlap, and weight</w:t>
-      </w:r>
-      <w:r>
-        <w:t xml:space="preserve"> </w:t>
-      </w:r>
-      <w:r>
-        <w:t xml:space="preserve">stability, indicating whether the design is feasible under the</w:t>
-      </w:r>
-      <w:r>
-        <w:t xml:space="preserve"> </w:t>
-      </w:r>
-      <w:r>
-        <w:t xml:space="preserve">observed covariate and treatment distributions; they do not</w:t>
-      </w:r>
-      <w:r>
-        <w:t xml:space="preserve"> </w:t>
-      </w:r>
-      <w:r>
-        <w:t xml:space="preserve">estimate the operating characteristics of a candidate estimator.</w:t>
-      </w:r>
-      <w:r>
-        <w:t xml:space="preserve"> </w:t>
-      </w:r>
-      <w:r>
-        <w:t xml:space="preserve">(ii) Baseline plasmode simulation evaluates candidate-estimator</w:t>
-      </w:r>
-      <w:r>
-        <w:t xml:space="preserve"> </w:t>
-      </w:r>
-      <w:r>
-        <w:t xml:space="preserve">operating characteristics (bias, RMSE, coverage) under a single</w:t>
-      </w:r>
-      <w:r>
-        <w:t xml:space="preserve"> </w:t>
-      </w:r>
-      <w:r>
-        <w:t xml:space="preserve">locked synthetic outcome model conditional on the empirical</w:t>
+        <w:t xml:space="preserve">locked</w:t>
+      </w:r>
+      <w:r>
+        <w:t xml:space="preserve"> </w:t>
+      </w:r>
+      <w:r>
+        <w:t xml:space="preserve">synthetic outcome model using the empirical</w:t>
       </w:r>
       <w:r>
         <w:t xml:space="preserve"> </w:t>
@@ -8638,6 +8683,195 @@
         <w:t xml:space="preserve"> </w:t>
       </w:r>
       <w:r>
+        <w:t xml:space="preserve">structure.</w:t>
+      </w:r>
+    </w:p>
+    <w:p>
+      <w:pPr>
+        <w:pStyle w:val="Compact"/>
+        <w:numPr>
+          <w:ilvl w:val="0"/>
+          <w:numId w:val="1002"/>
+        </w:numPr>
+      </w:pPr>
+      <w:r>
+        <w:t xml:space="preserve">Negative-control analyses probe residual bias for selected NC</w:t>
+      </w:r>
+      <w:r>
+        <w:t xml:space="preserve"> </w:t>
+      </w:r>
+      <w:r>
+        <w:t xml:space="preserve">outcomes through a different data-generating channel and do not</w:t>
+      </w:r>
+      <w:r>
+        <w:t xml:space="preserve"> </w:t>
+      </w:r>
+      <w:r>
+        <w:t xml:space="preserve">characterise the behaviour of the primary estimator under DQ</w:t>
+      </w:r>
+      <w:r>
+        <w:t xml:space="preserve"> </w:t>
+      </w:r>
+      <w:r>
+        <w:t xml:space="preserve">perturbations.</w:t>
+      </w:r>
+    </w:p>
+    <w:p>
+      <w:pPr>
+        <w:pStyle w:val="Compact"/>
+        <w:numPr>
+          <w:ilvl w:val="0"/>
+          <w:numId w:val="1002"/>
+        </w:numPr>
+      </w:pPr>
+      <w:r>
+        <w:t xml:space="preserve">DQ stress testing asks whether conclusions about estimator</w:t>
+      </w:r>
+      <w:r>
+        <w:t xml:space="preserve"> </w:t>
+      </w:r>
+      <w:r>
+        <w:t xml:space="preserve">suitability</w:t>
+      </w:r>
+      <w:r>
+        <w:t xml:space="preserve"> </w:t>
+      </w:r>
+      <w:r>
+        <w:rPr>
+          <w:i/>
+          <w:iCs/>
+        </w:rPr>
+        <w:t xml:space="preserve">persist</w:t>
+      </w:r>
+      <w:r>
+        <w:t xml:space="preserve"> </w:t>
+      </w:r>
+      <w:r>
+        <w:t xml:space="preserve">under prespecified violations or</w:t>
+      </w:r>
+      <w:r>
+        <w:t xml:space="preserve"> </w:t>
+      </w:r>
+      <w:r>
+        <w:t xml:space="preserve">degradations tied to fit-for-purpose concerns.</w:t>
+      </w:r>
+    </w:p>
+    <w:p>
+      <w:pPr>
+        <w:pStyle w:val="Compact"/>
+        <w:numPr>
+          <w:ilvl w:val="0"/>
+          <w:numId w:val="1002"/>
+        </w:numPr>
+      </w:pPr>
+      <w:r>
+        <w:t xml:space="preserve">A STOP under a stress scenario should be read as evidence that</w:t>
+      </w:r>
+      <w:r>
+        <w:t xml:space="preserve"> </w:t>
+      </w:r>
+      <w:r>
+        <w:t xml:space="preserve">the study requires redesign, external validation, additional</w:t>
+      </w:r>
+      <w:r>
+        <w:t xml:space="preserve"> </w:t>
+      </w:r>
+      <w:r>
+        <w:t xml:space="preserve">sensitivity analysis, or narrower causal claims before outcome</w:t>
+      </w:r>
+      <w:r>
+        <w:t xml:space="preserve"> </w:t>
+      </w:r>
+      <w:r>
+        <w:t xml:space="preserve">access.</w:t>
+      </w:r>
+    </w:p>
+    <w:p>
+      <w:pPr>
+        <w:pStyle w:val="FirstParagraph"/>
+      </w:pPr>
+      <w:r>
+        <w:t xml:space="preserve">Four pre-outcome tools answer four different questions and are</w:t>
+      </w:r>
+      <w:r>
+        <w:t xml:space="preserve"> </w:t>
+      </w:r>
+      <w:r>
+        <w:t xml:space="preserve">complementary rather than substitutable. (i) Propensity-score</w:t>
+      </w:r>
+      <w:r>
+        <w:t xml:space="preserve"> </w:t>
+      </w:r>
+      <w:r>
+        <w:t xml:space="preserve">diagnostics assess empirical comparability, overlap, and weight</w:t>
+      </w:r>
+      <w:r>
+        <w:t xml:space="preserve"> </w:t>
+      </w:r>
+      <w:r>
+        <w:t xml:space="preserve">stability, indicating whether the design is feasible under the</w:t>
+      </w:r>
+      <w:r>
+        <w:t xml:space="preserve"> </w:t>
+      </w:r>
+      <w:r>
+        <w:t xml:space="preserve">observed covariate and treatment distributions; they do not</w:t>
+      </w:r>
+      <w:r>
+        <w:t xml:space="preserve"> </w:t>
+      </w:r>
+      <w:r>
+        <w:t xml:space="preserve">estimate the operating characteristics of a candidate estimator.</w:t>
+      </w:r>
+      <w:r>
+        <w:t xml:space="preserve"> </w:t>
+      </w:r>
+      <w:r>
+        <w:t xml:space="preserve">(ii) Baseline plasmode simulation evaluates candidate-estimator</w:t>
+      </w:r>
+      <w:r>
+        <w:t xml:space="preserve"> </w:t>
+      </w:r>
+      <w:r>
+        <w:t xml:space="preserve">operating characteristics (bias, RMSE, coverage) under a single</w:t>
+      </w:r>
+      <w:r>
+        <w:t xml:space="preserve"> </w:t>
+      </w:r>
+      <w:r>
+        <w:t xml:space="preserve">locked synthetic outcome model conditional on the empirical</w:t>
+      </w:r>
+      <w:r>
+        <w:t xml:space="preserve"> </w:t>
+      </w:r>
+      <m:oMath>
+        <m:d>
+          <m:dPr>
+            <m:begChr m:val="("/>
+            <m:endChr m:val=")"/>
+            <m:sepChr m:val=""/>
+            <m:grow/>
+          </m:dPr>
+          <m:e>
+            <m:r>
+              <m:t>W</m:t>
+            </m:r>
+            <m:r>
+              <m:rPr>
+                <m:sty m:val="p"/>
+              </m:rPr>
+              <m:t>,</m:t>
+            </m:r>
+            <m:r>
+              <m:t>A</m:t>
+            </m:r>
+          </m:e>
+        </m:d>
+      </m:oMath>
+      <w:r>
+        <w:t xml:space="preserve"> </w:t>
+      </w:r>
+      <w:r>
         <w:t xml:space="preserve">structure. (iii) Negative-control analyses probe</w:t>
       </w:r>
       <w:r>
@@ -9280,13 +9514,13 @@
         <w:t xml:space="preserve"> </w:t>
       </w:r>
       <w:r>
-        <w:t xml:space="preserve">moves bias or coverage beyond the threshold. The candidate-selection rule</w:t>
-      </w:r>
-      <w:r>
-        <w:t xml:space="preserve"> </w:t>
-      </w:r>
-      <w:r>
-        <w:t xml:space="preserve">(</w:t>
+        <w:t xml:space="preserve">moves bias or coverage beyond the threshold. The candidate-selection</w:t>
+      </w:r>
+      <w:r>
+        <w:t xml:space="preserve"> </w:t>
+      </w:r>
+      <w:r>
+        <w:t xml:space="preserve">rule (</w:t>
       </w:r>
       <w:r>
         <w:rPr>
@@ -9295,25 +9529,135 @@
         <w:t xml:space="preserve">select_tmle_candidate(rule = "min_rmse")</w:t>
       </w:r>
       <w:r>
-        <w:t xml:space="preserve">) can be augmented to</w:t>
-      </w:r>
-      <w:r>
-        <w:t xml:space="preserve"> </w:t>
-      </w:r>
-      <w:r>
-        <w:t xml:space="preserve">require a maximum allowed degradation, in which case the</w:t>
-      </w:r>
-      <w:r>
-        <w:t xml:space="preserve"> </w:t>
-      </w:r>
-      <w:r>
-        <w:t xml:space="preserve">prespecified rule excludes fragile candidates</w:t>
-      </w:r>
-      <w:r>
-        <w:t xml:space="preserve"> </w:t>
-      </w:r>
-      <w:r>
-        <w:t xml:space="preserve">before the outcome is accessed.</w:t>
+        <w:t xml:space="preserve">) is currently a</w:t>
+      </w:r>
+      <w:r>
+        <w:t xml:space="preserve"> </w:t>
+      </w:r>
+      <w:r>
+        <w:t xml:space="preserve">single-step approximation of the</w:t>
+      </w:r>
+      <w:r>
+        <w:t xml:space="preserve"> </w:t>
+      </w:r>
+      <w:r>
+        <w:rPr>
+          <w:b/>
+          <w:bCs/>
+        </w:rPr>
+        <w:t xml:space="preserve">two-stage selector</w:t>
+      </w:r>
+      <w:r>
+        <w:t xml:space="preserve"> </w:t>
+      </w:r>
+      <w:r>
+        <w:t xml:space="preserve">formalised</w:t>
+      </w:r>
+      <w:r>
+        <w:t xml:space="preserve"> </w:t>
+      </w:r>
+      <w:r>
+        <w:t xml:space="preserve">in FIORD</w:t>
+      </w:r>
+      <w:r>
+        <w:t xml:space="preserve"> </w:t>
+      </w:r>
+      <w:r>
+        <w:t xml:space="preserve">(Nance et al. 2026)</w:t>
+      </w:r>
+      <w:r>
+        <w:t xml:space="preserve">: in FIORD’s procedure, candidates are</w:t>
+      </w:r>
+      <w:r>
+        <w:t xml:space="preserve"> </w:t>
+      </w:r>
+      <w:r>
+        <w:t xml:space="preserve">first screened to those that achieve nominal</w:t>
+      </w:r>
+      <w:r>
+        <w:t xml:space="preserve"> </w:t>
+      </w:r>
+      <w:r>
+        <w:rPr>
+          <w:b/>
+          <w:bCs/>
+        </w:rPr>
+        <w:t xml:space="preserve">oracle coverage</w:t>
+      </w:r>
+      <w:r>
+        <w:t xml:space="preserve"> </w:t>
+      </w:r>
+      <w:r>
+        <w:t xml:space="preserve">(a CI built from the Monte Carlo empirical SE), and the point</w:t>
+      </w:r>
+      <w:r>
+        <w:t xml:space="preserve"> </w:t>
+      </w:r>
+      <w:r>
+        <w:t xml:space="preserve">estimator with the lowest variance among the survivors is locked</w:t>
+      </w:r>
+      <w:r>
+        <w:t xml:space="preserve"> </w:t>
+      </w:r>
+      <w:r>
+        <w:t xml:space="preserve">in; the variance method is then selected separately to achieve</w:t>
+      </w:r>
+      <w:r>
+        <w:t xml:space="preserve"> </w:t>
+      </w:r>
+      <w:r>
+        <w:t xml:space="preserve">nominal coverage on the locked point estimator. The current cleanTMLE</w:t>
+      </w:r>
+      <w:r>
+        <w:t xml:space="preserve"> </w:t>
+      </w:r>
+      <w:r>
+        <w:t xml:space="preserve">rule conflates these two stages, choosing on RMSE only; the</w:t>
+      </w:r>
+      <w:r>
+        <w:t xml:space="preserve"> </w:t>
+      </w:r>
+      <w:r>
+        <w:t xml:space="preserve">forthcoming</w:t>
+      </w:r>
+      <w:r>
+        <w:t xml:space="preserve"> </w:t>
+      </w:r>
+      <w:r>
+        <w:rPr>
+          <w:rStyle w:val="VerbatimChar"/>
+        </w:rPr>
+        <w:t xml:space="preserve">rule = "fiord_two_stage"</w:t>
+      </w:r>
+      <w:r>
+        <w:t xml:space="preserve"> </w:t>
+      </w:r>
+      <w:r>
+        <w:t xml:space="preserve">(planned for cleanTMLE 0.2)</w:t>
+      </w:r>
+      <w:r>
+        <w:t xml:space="preserve"> </w:t>
+      </w:r>
+      <w:r>
+        <w:t xml:space="preserve">implements the full two-stage procedure. The rule can additionally</w:t>
+      </w:r>
+      <w:r>
+        <w:t xml:space="preserve"> </w:t>
+      </w:r>
+      <w:r>
+        <w:t xml:space="preserve">be augmented to require a maximum allowed degradation in the DQ</w:t>
+      </w:r>
+      <w:r>
+        <w:t xml:space="preserve"> </w:t>
+      </w:r>
+      <w:r>
+        <w:t xml:space="preserve">stress test, which excludes fragile candidates before the outcome</w:t>
+      </w:r>
+      <w:r>
+        <w:t xml:space="preserve"> </w:t>
+      </w:r>
+      <w:r>
+        <w:t xml:space="preserve">is accessed.</w:t>
       </w:r>
     </w:p>
     <w:p>
@@ -11376,31 +11720,119 @@
         <w:pStyle w:val="FirstParagraph"/>
       </w:pPr>
       <w:r>
-        <w:t xml:space="preserve">The DQ stress test runs on synthetic outcomes generated from the</w:t>
-      </w:r>
-      <w:r>
-        <w:t xml:space="preserve"> </w:t>
-      </w:r>
-      <w:r>
-        <w:t xml:space="preserve">real covariate distribution and the real treatment. The observed</w:t>
-      </w:r>
-      <w:r>
-        <w:t xml:space="preserve"> </w:t>
-      </w:r>
-      <w:r>
-        <w:t xml:space="preserve">primary treatment-outcome association is not read; depending on</w:t>
-      </w:r>
-      <w:r>
-        <w:t xml:space="preserve"> </w:t>
-      </w:r>
-      <w:r>
-        <w:t xml:space="preserve">the configured mode, the plasmode generator may use marginal</w:t>
-      </w:r>
-      <w:r>
-        <w:t xml:space="preserve"> </w:t>
-      </w:r>
-      <w:r>
-        <w:t xml:space="preserve">outcome information (the covariate-only mean model</w:t>
+        <w:t xml:space="preserve">The plasmode generator and DQ stress test use</w:t>
+      </w:r>
+      <w:r>
+        <w:t xml:space="preserve"> </w:t>
+      </w:r>
+      <w:r>
+        <w:rPr>
+          <w:b/>
+          <w:bCs/>
+        </w:rPr>
+        <w:t xml:space="preserve">all the data</w:t>
+      </w:r>
+      <w:r>
+        <w:rPr>
+          <w:b/>
+          <w:bCs/>
+        </w:rPr>
+        <w:t xml:space="preserve"> </w:t>
+      </w:r>
+      <w:r>
+        <w:rPr>
+          <w:b/>
+          <w:bCs/>
+        </w:rPr>
+        <w:t xml:space="preserve">except the outcome</w:t>
+      </w:r>
+      <w:r>
+        <w:t xml:space="preserve">: real baseline covariates</w:t>
+      </w:r>
+      <w:r>
+        <w:t xml:space="preserve"> </w:t>
+      </w:r>
+      <m:oMath>
+        <m:r>
+          <m:t>W</m:t>
+        </m:r>
+      </m:oMath>
+      <w:r>
+        <w:t xml:space="preserve">, real treatment</w:t>
+      </w:r>
+      <w:r>
+        <w:t xml:space="preserve"> </w:t>
+      </w:r>
+      <w:r>
+        <w:t xml:space="preserve">assignment</w:t>
+      </w:r>
+      <w:r>
+        <w:t xml:space="preserve"> </w:t>
+      </w:r>
+      <m:oMath>
+        <m:r>
+          <m:t>A</m:t>
+        </m:r>
+      </m:oMath>
+      <w:r>
+        <w:t xml:space="preserve">, real missingness indicators, real follow-up</w:t>
+      </w:r>
+      <w:r>
+        <w:t xml:space="preserve"> </w:t>
+      </w:r>
+      <w:r>
+        <w:t xml:space="preserve">intervals, but not the observed primary treatment-outcome</w:t>
+      </w:r>
+      <w:r>
+        <w:t xml:space="preserve"> </w:t>
+      </w:r>
+      <w:r>
+        <w:t xml:space="preserve">association. This phrasing, which we adopt from the FIORD</w:t>
+      </w:r>
+      <w:r>
+        <w:t xml:space="preserve"> </w:t>
+      </w:r>
+      <w:r>
+        <w:t xml:space="preserve">outcome-blind simulation literature</w:t>
+      </w:r>
+      <w:r>
+        <w:t xml:space="preserve"> </w:t>
+      </w:r>
+      <w:r>
+        <w:t xml:space="preserve">(Nance et al. 2026)</w:t>
+      </w:r>
+      <w:r>
+        <w:t xml:space="preserve">, makes the</w:t>
+      </w:r>
+      <w:r>
+        <w:t xml:space="preserve"> </w:t>
+      </w:r>
+      <w:r>
+        <w:t xml:space="preserve">admissibility argument concrete: every input to the candidate</w:t>
+      </w:r>
+      <w:r>
+        <w:t xml:space="preserve"> </w:t>
+      </w:r>
+      <w:r>
+        <w:t xml:space="preserve">evaluation is drawn from the study data except the comparative</w:t>
+      </w:r>
+      <w:r>
+        <w:t xml:space="preserve"> </w:t>
+      </w:r>
+      <w:r>
+        <w:t xml:space="preserve">quantity the analysis is supposed to estimate. Depending on</w:t>
+      </w:r>
+      <w:r>
+        <w:t xml:space="preserve"> </w:t>
+      </w:r>
+      <w:r>
+        <w:t xml:space="preserve">configured mode, the plasmode generator may use the marginal</w:t>
+      </w:r>
+      <w:r>
+        <w:t xml:space="preserve"> </w:t>
+      </w:r>
+      <w:r>
+        <w:t xml:space="preserve">outcome model</w:t>
       </w:r>
       <w:r>
         <w:t xml:space="preserve"> </w:t>
@@ -11433,13 +11865,68 @@
         </m:d>
       </m:oMath>
       <w:r>
-        <w:t xml:space="preserve">)</w:t>
-      </w:r>
-      <w:r>
-        <w:t xml:space="preserve"> </w:t>
-      </w:r>
-      <w:r>
-        <w:t xml:space="preserve">without using the joint</w:t>
+        <w:t xml:space="preserve"> </w:t>
+      </w:r>
+      <w:r>
+        <w:t xml:space="preserve">(the</w:t>
+      </w:r>
+      <w:r>
+        <w:t xml:space="preserve"> </w:t>
+      </w:r>
+      <w:r>
+        <w:rPr>
+          <w:i/>
+          <w:iCs/>
+        </w:rPr>
+        <w:t xml:space="preserve">hybrid</w:t>
+      </w:r>
+      <w:r>
+        <w:t xml:space="preserve"> </w:t>
+      </w:r>
+      <w:r>
+        <w:t xml:space="preserve">mode that sits in the</w:t>
+      </w:r>
+      <w:r>
+        <w:t xml:space="preserve"> </w:t>
+      </w:r>
+      <w:r>
+        <w:t xml:space="preserve">middle of the FIORD DGP spectrum), or it may take</w:t>
+      </w:r>
+      <w:r>
+        <w:t xml:space="preserve"> </w:t>
+      </w:r>
+      <m:oMath>
+        <m:r>
+          <m:t>E</m:t>
+        </m:r>
+        <m:d>
+          <m:dPr>
+            <m:begChr m:val="["/>
+            <m:endChr m:val="]"/>
+            <m:sepChr m:val=""/>
+            <m:grow/>
+          </m:dPr>
+          <m:e>
+            <m:r>
+              <m:t>Y</m:t>
+            </m:r>
+            <m:r>
+              <m:rPr>
+                <m:sty m:val="p"/>
+              </m:rPr>
+              <m:t>∣</m:t>
+            </m:r>
+            <m:r>
+              <m:t>W</m:t>
+            </m:r>
+          </m:e>
+        </m:d>
+      </m:oMath>
+      <w:r>
+        <w:t xml:space="preserve"> </w:t>
+      </w:r>
+      <w:r>
+        <w:t xml:space="preserve">from external pilot data, with the joint</w:t>
       </w:r>
       <w:r>
         <w:t xml:space="preserve"> </w:t>
@@ -11481,49 +11968,7 @@
         <w:t xml:space="preserve"> </w:t>
       </w:r>
       <w:r>
-        <w:t xml:space="preserve">relationship, or it may</w:t>
-      </w:r>
-      <w:r>
-        <w:t xml:space="preserve"> </w:t>
-      </w:r>
-      <w:r>
-        <w:t xml:space="preserve">take</w:t>
-      </w:r>
-      <w:r>
-        <w:t xml:space="preserve"> </w:t>
-      </w:r>
-      <m:oMath>
-        <m:r>
-          <m:t>E</m:t>
-        </m:r>
-        <m:d>
-          <m:dPr>
-            <m:begChr m:val="["/>
-            <m:endChr m:val="]"/>
-            <m:sepChr m:val=""/>
-            <m:grow/>
-          </m:dPr>
-          <m:e>
-            <m:r>
-              <m:t>Y</m:t>
-            </m:r>
-            <m:r>
-              <m:rPr>
-                <m:sty m:val="p"/>
-              </m:rPr>
-              <m:t>∣</m:t>
-            </m:r>
-            <m:r>
-              <m:t>W</m:t>
-            </m:r>
-          </m:e>
-        </m:d>
-      </m:oMath>
-      <w:r>
-        <w:t xml:space="preserve"> </w:t>
-      </w:r>
-      <w:r>
-        <w:t xml:space="preserve">from external pilot data</w:t>
+        <w:t xml:space="preserve">relationship never inspected</w:t>
       </w:r>
       <w:r>
         <w:t xml:space="preserve"> </w:t>
@@ -20299,43 +20744,65 @@
         <w:pStyle w:val="BodyText"/>
       </w:pPr>
       <w:r>
-        <w:t xml:space="preserve">A separate pattern concerns standard-error calibration for the IPW</w:t>
-      </w:r>
-      <w:r>
-        <w:t xml:space="preserve"> </w:t>
-      </w:r>
-      <w:r>
-        <w:t xml:space="preserve">estimator and is worth surfacing because it routinely surprises</w:t>
-      </w:r>
-      <w:r>
-        <w:t xml:space="preserve"> </w:t>
-      </w:r>
-      <w:r>
-        <w:t xml:space="preserve">applied users. The mean-SE-to-empirical-SD</w:t>
-      </w:r>
-      <w:r>
-        <w:t xml:space="preserve"> </w:t>
-      </w:r>
-      <w:r>
-        <w:t xml:space="preserve">ratio for IPTW is often above one in our scenarios, because the</w:t>
-      </w:r>
-      <w:r>
-        <w:t xml:space="preserve"> </w:t>
-      </w:r>
-      <w:r>
-        <w:t xml:space="preserve">default IF-based variance estimator treats the propensity score</w:t>
-      </w:r>
-      <w:r>
-        <w:t xml:space="preserve"> </w:t>
-      </w:r>
-      <w:r>
-        <w:t xml:space="preserve">as known and is therefore conservative when the propensity score</w:t>
-      </w:r>
-      <w:r>
-        <w:t xml:space="preserve"> </w:t>
-      </w:r>
-      <w:r>
-        <w:t xml:space="preserve">has actually been estimated</w:t>
+        <w:t xml:space="preserve">A separate pattern concerns</w:t>
+      </w:r>
+      <w:r>
+        <w:t xml:space="preserve"> </w:t>
+      </w:r>
+      <w:r>
+        <w:rPr>
+          <w:b/>
+          <w:bCs/>
+        </w:rPr>
+        <w:t xml:space="preserve">variance-estimator selection</w:t>
+      </w:r>
+      <w:r>
+        <w:t xml:space="preserve">, the</w:t>
+      </w:r>
+      <w:r>
+        <w:t xml:space="preserve"> </w:t>
+      </w:r>
+      <w:r>
+        <w:t xml:space="preserve">second stage of FIORD’s two-stage selector</w:t>
+      </w:r>
+      <w:r>
+        <w:t xml:space="preserve"> </w:t>
+      </w:r>
+      <w:r>
+        <w:t xml:space="preserve">(Nance et al. 2026)</w:t>
+      </w:r>
+      <w:r>
+        <w:t xml:space="preserve">, and is</w:t>
+      </w:r>
+      <w:r>
+        <w:t xml:space="preserve"> </w:t>
+      </w:r>
+      <w:r>
+        <w:t xml:space="preserve">worth surfacing because it routinely surprises applied users. The</w:t>
+      </w:r>
+      <w:r>
+        <w:t xml:space="preserve"> </w:t>
+      </w:r>
+      <w:r>
+        <w:t xml:space="preserve">mean-SE-to-empirical-SD ratio for IPTW is often above one in our</w:t>
+      </w:r>
+      <w:r>
+        <w:t xml:space="preserve"> </w:t>
+      </w:r>
+      <w:r>
+        <w:t xml:space="preserve">scenarios, because the default IF-based variance estimator treats</w:t>
+      </w:r>
+      <w:r>
+        <w:t xml:space="preserve"> </w:t>
+      </w:r>
+      <w:r>
+        <w:t xml:space="preserve">the propensity score as known and is therefore conservative when</w:t>
+      </w:r>
+      <w:r>
+        <w:t xml:space="preserve"> </w:t>
+      </w:r>
+      <w:r>
+        <w:t xml:space="preserve">the propensity score has actually been estimated</w:t>
       </w:r>
       <w:r>
         <w:t xml:space="preserve"> </w:t>
@@ -20344,118 +20811,145 @@
         <w:t xml:space="preserve">(J. M. Robins and Rotnitzky 1992)</w:t>
       </w:r>
       <w:r>
-        <w:t xml:space="preserve">.</w:t>
-      </w:r>
-      <w:r>
-        <w:t xml:space="preserve"> </w:t>
-      </w:r>
-      <w:r>
-        <w:t xml:space="preserve">Doubly robust estimators (TMLE, AIPW,</w:t>
-      </w:r>
-      <w:r>
-        <w:t xml:space="preserve"> </w:t>
-      </w:r>
-      <w:r>
-        <w:t xml:space="preserve">CV-TMLE) do not share this conservativeness once the nuisance</w:t>
-      </w:r>
-      <w:r>
-        <w:t xml:space="preserve"> </w:t>
-      </w:r>
-      <w:r>
-        <w:t xml:space="preserve">fits are properly cross-fit; the SE/SD ratio for TMLE_CF stays</w:t>
-      </w:r>
-      <w:r>
-        <w:t xml:space="preserve"> </w:t>
-      </w:r>
-      <w:r>
-        <w:t xml:space="preserve">near one across our scenarios. A bootstrap variance estimator</w:t>
-      </w:r>
-      <w:r>
-        <w:t xml:space="preserve"> </w:t>
-      </w:r>
-      <w:r>
-        <w:t xml:space="preserve">(Xu et al. 2020)</w:t>
-      </w:r>
-      <w:r>
-        <w:t xml:space="preserve"> </w:t>
-      </w:r>
-      <w:r>
-        <w:t xml:space="preserve">is the principled fix when reporting an</w:t>
-      </w:r>
-      <w:r>
-        <w:t xml:space="preserve"> </w:t>
-      </w:r>
-      <w:r>
-        <w:t xml:space="preserve">IPW-only estimate; we recommend that users wrapping</w:t>
-      </w:r>
-      <w:r>
-        <w:t xml:space="preserve"> </w:t>
-      </w:r>
-      <w:r>
-        <w:rPr>
-          <w:rStyle w:val="VerbatimChar"/>
-        </w:rPr>
-        <w:t xml:space="preserve">run_iptw_workflow()</w:t>
-      </w:r>
-      <w:r>
-        <w:t xml:space="preserve"> </w:t>
-      </w:r>
-      <w:r>
-        <w:t xml:space="preserve">for primary inference resample the IPTW</w:t>
-      </w:r>
-      <w:r>
-        <w:t xml:space="preserve"> </w:t>
-      </w:r>
-      <w:r>
-        <w:t xml:space="preserve">estimator externally rather than rely on the default IF-based SE.</w:t>
-      </w:r>
-      <w:r>
-        <w:t xml:space="preserve"> </w:t>
-      </w:r>
-      <w:r>
-        <w:t xml:space="preserve">The matching-with-TMLE composition shows a similar pattern in</w:t>
-      </w:r>
-      <w:r>
-        <w:t xml:space="preserve"> </w:t>
-      </w:r>
-      <w:r>
-        <w:t xml:space="preserve">Scenario B, where the SE-to-empirical-SD ratio reaches roughly</w:t>
-      </w:r>
-      <w:r>
-        <w:t xml:space="preserve"> </w:t>
-      </w:r>
-      <w:r>
-        <w:t xml:space="preserve">two and coverage exceeds nominal. The conservativeness comes from</w:t>
-      </w:r>
-      <w:r>
-        <w:t xml:space="preserve"> </w:t>
-      </w:r>
-      <w:r>
-        <w:t xml:space="preserve">treating the matched cohort as if it were a fresh independent</w:t>
-      </w:r>
-      <w:r>
-        <w:t xml:space="preserve"> </w:t>
-      </w:r>
-      <w:r>
-        <w:t xml:space="preserve">sample at the TMLE step, ignoring the residual variability</w:t>
-      </w:r>
-      <w:r>
-        <w:t xml:space="preserve"> </w:t>
-      </w:r>
-      <w:r>
-        <w:t xml:space="preserve">introduced by the matching draw. Users reporting matched-TMLE as</w:t>
-      </w:r>
-      <w:r>
-        <w:t xml:space="preserve"> </w:t>
-      </w:r>
-      <w:r>
-        <w:t xml:space="preserve">primary should either bootstrap over the matching step or use a</w:t>
-      </w:r>
-      <w:r>
-        <w:t xml:space="preserve"> </w:t>
-      </w:r>
-      <w:r>
-        <w:t xml:space="preserve">block-bootstrap variant.</w:t>
+        <w:t xml:space="preserve">. Doubly robust estimators (TMLE, AIPW,</w:t>
+      </w:r>
+      <w:r>
+        <w:t xml:space="preserve"> </w:t>
+      </w:r>
+      <w:r>
+        <w:t xml:space="preserve">CV-TMLE) do not share this conservativeness once the nuisance fits</w:t>
+      </w:r>
+      <w:r>
+        <w:t xml:space="preserve"> </w:t>
+      </w:r>
+      <w:r>
+        <w:t xml:space="preserve">are properly cross-fit; the SE/SD ratio for TMLE_CF stays near one</w:t>
+      </w:r>
+      <w:r>
+        <w:t xml:space="preserve"> </w:t>
+      </w:r>
+      <w:r>
+        <w:t xml:space="preserve">across our scenarios. The matching-with-TMLE composition shows a</w:t>
+      </w:r>
+      <w:r>
+        <w:t xml:space="preserve"> </w:t>
+      </w:r>
+      <w:r>
+        <w:t xml:space="preserve">similar pattern in Scenario B, where the SE-to-empirical-SD ratio</w:t>
+      </w:r>
+      <w:r>
+        <w:t xml:space="preserve"> </w:t>
+      </w:r>
+      <w:r>
+        <w:t xml:space="preserve">reaches roughly two and coverage exceeds nominal, because the</w:t>
+      </w:r>
+      <w:r>
+        <w:t xml:space="preserve"> </w:t>
+      </w:r>
+      <w:r>
+        <w:t xml:space="preserve">post-match TMLE step treats the matched cohort as if it were a</w:t>
+      </w:r>
+      <w:r>
+        <w:t xml:space="preserve"> </w:t>
+      </w:r>
+      <w:r>
+        <w:t xml:space="preserve">fresh independent sample, ignoring the residual variability</w:t>
+      </w:r>
+      <w:r>
+        <w:t xml:space="preserve"> </w:t>
+      </w:r>
+      <w:r>
+        <w:t xml:space="preserve">introduced by the matching draw.</w:t>
+      </w:r>
+    </w:p>
+    <w:p>
+      <w:pPr>
+        <w:pStyle w:val="BodyText"/>
+      </w:pPr>
+      <w:r>
+        <w:t xml:space="preserve">The applied implication is consistent across the FIORD case study</w:t>
+      </w:r>
+      <w:r>
+        <w:t xml:space="preserve"> </w:t>
+      </w:r>
+      <w:r>
+        <w:t xml:space="preserve">(Nance et al. 2026)</w:t>
+      </w:r>
+      <w:r>
+        <w:t xml:space="preserve">, the older Mertens–Zhang Danish-registry</w:t>
+      </w:r>
+      <w:r>
+        <w:t xml:space="preserve"> </w:t>
+      </w:r>
+      <w:r>
+        <w:t xml:space="preserve">investigation</w:t>
+      </w:r>
+      <w:r>
+        <w:t xml:space="preserve"> </w:t>
+      </w:r>
+      <w:r>
+        <w:t xml:space="preserve">(Mertens, Zhang, et al. 2024)</w:t>
+      </w:r>
+      <w:r>
+        <w:t xml:space="preserve">, and our own results here: when</w:t>
+      </w:r>
+      <w:r>
+        <w:t xml:space="preserve"> </w:t>
+      </w:r>
+      <w:r>
+        <w:t xml:space="preserve">the prespecified primary is an IPW estimator, a matched-cohort</w:t>
+      </w:r>
+      <w:r>
+        <w:t xml:space="preserve"> </w:t>
+      </w:r>
+      <w:r>
+        <w:t xml:space="preserve">estimator, or any TMLE running on a non-i.i.d. sample, the</w:t>
+      </w:r>
+      <w:r>
+        <w:t xml:space="preserve"> </w:t>
+      </w:r>
+      <w:r>
+        <w:t xml:space="preserve">default IF-based variance is likely to be conservative and the</w:t>
+      </w:r>
+      <w:r>
+        <w:t xml:space="preserve"> </w:t>
+      </w:r>
+      <w:r>
+        <w:rPr>
+          <w:b/>
+          <w:bCs/>
+        </w:rPr>
+        <w:t xml:space="preserve">nonparametric bootstrap variance</w:t>
+      </w:r>
+      <w:r>
+        <w:t xml:space="preserve"> </w:t>
+      </w:r>
+      <w:r>
+        <w:t xml:space="preserve">is the principled fix. The</w:t>
+      </w:r>
+      <w:r>
+        <w:t xml:space="preserve"> </w:t>
+      </w:r>
+      <w:r>
+        <w:t xml:space="preserve">bootstrap is therefore the recommended variance method for the</w:t>
+      </w:r>
+      <w:r>
+        <w:t xml:space="preserve"> </w:t>
+      </w:r>
+      <w:r>
+        <w:t xml:space="preserve">two-stage selector’s second stage in cleanTMLE 0.2; the present</w:t>
+      </w:r>
+      <w:r>
+        <w:t xml:space="preserve"> </w:t>
+      </w:r>
+      <w:r>
+        <w:t xml:space="preserve">release supports it externally and surfaces the IF-based SE for</w:t>
+      </w:r>
+      <w:r>
+        <w:t xml:space="preserve"> </w:t>
+      </w:r>
+      <w:r>
+        <w:t xml:space="preserve">back-compatibility.</w:t>
       </w:r>
     </w:p>
     <w:p>
@@ -29883,7 +30377,43 @@
         <w:t xml:space="preserve"> </w:t>
       </w:r>
       <w:r>
-        <w:t xml:space="preserve">function falls back to weighted complete-case).</w:t>
+        <w:t xml:space="preserve">function falls back to weighted complete-case), and the</w:t>
+      </w:r>
+      <w:r>
+        <w:t xml:space="preserve"> </w:t>
+      </w:r>
+      <w:r>
+        <w:t xml:space="preserve">matched-vs-full plasmode diagnostic that would disambiguate</w:t>
+      </w:r>
+      <w:r>
+        <w:t xml:space="preserve"> </w:t>
+      </w:r>
+      <w:r>
+        <w:t xml:space="preserve">whether the 0.5-to-1 percentage-point gap between the matched</w:t>
+      </w:r>
+      <w:r>
+        <w:t xml:space="preserve"> </w:t>
+      </w:r>
+      <w:r>
+        <w:t xml:space="preserve">(RD = 0.026) and full-cohort (RD = 0.031) TMLE estimates is</w:t>
+      </w:r>
+      <w:r>
+        <w:t xml:space="preserve"> </w:t>
+      </w:r>
+      <w:r>
+        <w:t xml:space="preserve">sampling noise plus the efficiency cost of matching, an effect-</w:t>
+      </w:r>
+      <w:r>
+        <w:t xml:space="preserve"> </w:t>
+      </w:r>
+      <w:r>
+        <w:t xml:space="preserve">modification signal, or a positivity-strain signal. That</w:t>
+      </w:r>
+      <w:r>
+        <w:t xml:space="preserve"> </w:t>
+      </w:r>
+      <w:r>
+        <w:t xml:space="preserve">diagnostic is on the cleanTMLE 0.2 roadmap.</w:t>
       </w:r>
     </w:p>
     <w:p>
@@ -32928,31 +33458,34 @@
           <w:b/>
           <w:bCs/>
         </w:rPr>
-        <w:t xml:space="preserve">Richer synthetic-outcome models:</w:t>
-      </w:r>
-      <w:r>
-        <w:t xml:space="preserve"> </w:t>
-      </w:r>
-      <w:r>
-        <w:t xml:space="preserve">effect modification, time-</w:t>
-      </w:r>
-      <w:r>
-        <w:t xml:space="preserve"> </w:t>
-      </w:r>
-      <w:r>
-        <w:t xml:space="preserve">varying treatment, and competing risks (the current DGP is a</w:t>
-      </w:r>
-      <w:r>
-        <w:t xml:space="preserve"> </w:t>
-      </w:r>
-      <w:r>
-        <w:t xml:space="preserve">logistic regression with a constant additive effect on the</w:t>
-      </w:r>
-      <w:r>
-        <w:t xml:space="preserve"> </w:t>
-      </w:r>
-      <w:r>
-        <w:t xml:space="preserve">risk-difference scale).</w:t>
+        <w:t xml:space="preserve">FIORD two-stage candidate selector</w:t>
+      </w:r>
+      <w:r>
+        <w:t xml:space="preserve"> </w:t>
+      </w:r>
+      <w:r>
+        <w:t xml:space="preserve">(Nance et al. 2026)</w:t>
+      </w:r>
+      <w:r>
+        <w:t xml:space="preserve">:</w:t>
+      </w:r>
+      <w:r>
+        <w:t xml:space="preserve"> </w:t>
+      </w:r>
+      <w:r>
+        <w:t xml:space="preserve">separate the point-estimator selection (oracle-coverage screen</w:t>
+      </w:r>
+      <w:r>
+        <w:t xml:space="preserve"> </w:t>
+      </w:r>
+      <w:r>
+        <w:t xml:space="preserve">on the Monte Carlo empirical SE) from the variance-method</w:t>
+      </w:r>
+      <w:r>
+        <w:t xml:space="preserve"> </w:t>
+      </w:r>
+      <w:r>
+        <w:t xml:space="preserve">selection, in place of the current single-step RMSE rule.</w:t>
       </w:r>
     </w:p>
     <w:p>
@@ -32968,25 +33501,34 @@
           <w:b/>
           <w:bCs/>
         </w:rPr>
-        <w:t xml:space="preserve">MAR / MNAR missingness:</w:t>
-      </w:r>
-      <w:r>
-        <w:t xml:space="preserve"> </w:t>
-      </w:r>
-      <w:r>
-        <w:t xml:space="preserve">a native inverse-probability-of-</w:t>
-      </w:r>
-      <w:r>
-        <w:t xml:space="preserve"> </w:t>
-      </w:r>
-      <w:r>
-        <w:t xml:space="preserve">missingness weighting path that does not require a structural</w:t>
-      </w:r>
-      <w:r>
-        <w:t xml:space="preserve"> </w:t>
-      </w:r>
-      <w:r>
-        <w:t xml:space="preserve">missingness model.</w:t>
+        <w:t xml:space="preserve">Nonparametric bootstrap variance</w:t>
+      </w:r>
+      <w:r>
+        <w:t xml:space="preserve"> </w:t>
+      </w:r>
+      <w:r>
+        <w:t xml:space="preserve">as the default variance</w:t>
+      </w:r>
+      <w:r>
+        <w:t xml:space="preserve"> </w:t>
+      </w:r>
+      <w:r>
+        <w:t xml:space="preserve">method for IPTW and matched-cohort estimators (the FIORD</w:t>
+      </w:r>
+      <w:r>
+        <w:t xml:space="preserve"> </w:t>
+      </w:r>
+      <w:r>
+        <w:t xml:space="preserve">case-study winner; see also</w:t>
+      </w:r>
+      <w:r>
+        <w:t xml:space="preserve"> </w:t>
+      </w:r>
+      <w:r>
+        <w:t xml:space="preserve">Mertens, Zhang, et al. (2024)</w:t>
+      </w:r>
+      <w:r>
+        <w:t xml:space="preserve">).</w:t>
       </w:r>
     </w:p>
     <w:p>
@@ -33002,67 +33544,31 @@
           <w:b/>
           <w:bCs/>
         </w:rPr>
-        <w:t xml:space="preserve">Survival and competing-risk estimands:</w:t>
-      </w:r>
-      <w:r>
-        <w:t xml:space="preserve"> </w:t>
-      </w:r>
-      <w:r>
-        <w:t xml:space="preserve">wrapping</w:t>
-      </w:r>
-      <w:r>
-        <w:t xml:space="preserve"> </w:t>
-      </w:r>
-      <w:r>
-        <w:rPr>
-          <w:rStyle w:val="VerbatimChar"/>
-        </w:rPr>
-        <w:t xml:space="preserve">survtmle</w:t>
-      </w:r>
-      <w:r>
-        <w:t xml:space="preserve"> </w:t>
-      </w:r>
-      <w:r>
-        <w:t xml:space="preserve">(Benkeser and Hejazi 2018)</w:t>
-      </w:r>
-      <w:r>
-        <w:t xml:space="preserve"> </w:t>
-      </w:r>
-      <w:r>
-        <w:t xml:space="preserve">and</w:t>
-      </w:r>
-      <w:r>
-        <w:t xml:space="preserve"> </w:t>
-      </w:r>
-      <w:r>
-        <w:rPr>
-          <w:rStyle w:val="VerbatimChar"/>
-        </w:rPr>
-        <w:t xml:space="preserve">lmtp</w:t>
-      </w:r>
-      <w:r>
-        <w:t xml:space="preserve"> </w:t>
-      </w:r>
-      <w:r>
-        <w:t xml:space="preserve">(Williams and Dı́az 2021)</w:t>
-      </w:r>
-      <w:r>
-        <w:t xml:space="preserve"> </w:t>
-      </w:r>
-      <w:r>
-        <w:t xml:space="preserve">inside the</w:t>
-      </w:r>
-      <w:r>
-        <w:t xml:space="preserve"> </w:t>
-      </w:r>
-      <w:r>
-        <w:t xml:space="preserve">lock and audit machinery so that hazard-ratio and cumulative-</w:t>
-      </w:r>
-      <w:r>
-        <w:t xml:space="preserve"> </w:t>
-      </w:r>
-      <w:r>
-        <w:t xml:space="preserve">incidence estimands inherit the same governance.</w:t>
+        <w:t xml:space="preserve">Unmeasured-confounding severity gradient:</w:t>
+      </w:r>
+      <w:r>
+        <w:t xml:space="preserve"> </w:t>
+      </w:r>
+      <w:r>
+        <w:t xml:space="preserve">vary the strength</w:t>
+      </w:r>
+      <w:r>
+        <w:t xml:space="preserve"> </w:t>
+      </w:r>
+      <w:r>
+        <w:t xml:space="preserve">of the latent-U scenario across a prespecified grid rather than</w:t>
+      </w:r>
+      <w:r>
+        <w:t xml:space="preserve"> </w:t>
+      </w:r>
+      <w:r>
+        <w:t xml:space="preserve">running a single strong-U setting, so the DQ stress test</w:t>
+      </w:r>
+      <w:r>
+        <w:t xml:space="preserve"> </w:t>
+      </w:r>
+      <w:r>
+        <w:t xml:space="preserve">produces an E-value-style sensitivity curve as a by-product.</w:t>
       </w:r>
     </w:p>
     <w:p>
@@ -33078,31 +33584,37 @@
           <w:b/>
           <w:bCs/>
         </w:rPr>
-        <w:t xml:space="preserve">Transportability and decision-population shift:</w:t>
-      </w:r>
-      <w:r>
-        <w:t xml:space="preserve"> </w:t>
-      </w:r>
-      <w:r>
-        <w:t xml:space="preserve">the</w:t>
-      </w:r>
-      <w:r>
-        <w:t xml:space="preserve"> </w:t>
-      </w:r>
-      <w:r>
-        <w:t xml:space="preserve">plasmode framework can in principle simulate covariate-</w:t>
-      </w:r>
-      <w:r>
-        <w:t xml:space="preserve"> </w:t>
-      </w:r>
-      <w:r>
-        <w:t xml:space="preserve">distribution shift between the analytic cohort and the target</w:t>
-      </w:r>
-      <w:r>
-        <w:t xml:space="preserve"> </w:t>
-      </w:r>
-      <w:r>
-        <w:t xml:space="preserve">population, but the package does not yet expose this scenario.</w:t>
+        <w:t xml:space="preserve">Pre-protocol stress-test mode:</w:t>
+      </w:r>
+      <w:r>
+        <w:t xml:space="preserve"> </w:t>
+      </w:r>
+      <w:r>
+        <w:t xml:space="preserve">allow the plasmode and DQ</w:t>
+      </w:r>
+      <w:r>
+        <w:t xml:space="preserve"> </w:t>
+      </w:r>
+      <w:r>
+        <w:t xml:space="preserve">stress test to run on user-specified covariate distributions</w:t>
+      </w:r>
+      <w:r>
+        <w:t xml:space="preserve"> </w:t>
+      </w:r>
+      <w:r>
+        <w:t xml:space="preserve">and treatment-mechanism strength (no real data required) so</w:t>
+      </w:r>
+      <w:r>
+        <w:t xml:space="preserve"> </w:t>
+      </w:r>
+      <w:r>
+        <w:t xml:space="preserve">that investigators can decide which dataset to use before any</w:t>
+      </w:r>
+      <w:r>
+        <w:t xml:space="preserve"> </w:t>
+      </w:r>
+      <w:r>
+        <w:t xml:space="preserve">data-use agreement is signed.</w:t>
       </w:r>
     </w:p>
     <w:p>
@@ -33118,6 +33630,312 @@
           <w:b/>
           <w:bCs/>
         </w:rPr>
+        <w:t xml:space="preserve">DGP-spectrum argument</w:t>
+      </w:r>
+      <w:r>
+        <w:t xml:space="preserve"> </w:t>
+      </w:r>
+      <w:r>
+        <w:t xml:space="preserve">for the plasmode generator: structural-</w:t>
+      </w:r>
+      <w:r>
+        <w:t xml:space="preserve"> </w:t>
+      </w:r>
+      <w:r>
+        <w:t xml:space="preserve">equation (</w:t>
+      </w:r>
+      <w:r>
+        <w:rPr>
+          <w:rStyle w:val="VerbatimChar"/>
+        </w:rPr>
+        <w:t xml:space="preserve">simcausal</w:t>
+      </w:r>
+      <w:r>
+        <w:t xml:space="preserve">-style), hybrid (current default), and</w:t>
+      </w:r>
+      <w:r>
+        <w:t xml:space="preserve"> </w:t>
+      </w:r>
+      <w:r>
+        <w:t xml:space="preserve">parametric-bootstrap modes, with synthetic-data fidelity metrics</w:t>
+      </w:r>
+      <w:r>
+        <w:t xml:space="preserve"> </w:t>
+      </w:r>
+      <w:r>
+        <w:t xml:space="preserve">(Hellinger / Wasserstein, or covariate SMDs between real and</w:t>
+      </w:r>
+      <w:r>
+        <w:t xml:space="preserve"> </w:t>
+      </w:r>
+      <w:r>
+        <w:t xml:space="preserve">synthetic samples) so the analyst can judge whether the DGP is</w:t>
+      </w:r>
+      <w:r>
+        <w:t xml:space="preserve"> </w:t>
+      </w:r>
+      <w:r>
+        <w:t xml:space="preserve">faithful enough to base candidate selection on.</w:t>
+      </w:r>
+    </w:p>
+    <w:p>
+      <w:pPr>
+        <w:pStyle w:val="Compact"/>
+        <w:numPr>
+          <w:ilvl w:val="0"/>
+          <w:numId w:val="1006"/>
+        </w:numPr>
+      </w:pPr>
+      <w:r>
+        <w:rPr>
+          <w:b/>
+          <w:bCs/>
+        </w:rPr>
+        <w:t xml:space="preserve">Matched-cohort vs full-cohort plasmode diagnostic:</w:t>
+      </w:r>
+      <w:r>
+        <w:t xml:space="preserve"> </w:t>
+      </w:r>
+      <w:r>
+        <w:t xml:space="preserve">under a</w:t>
+      </w:r>
+      <w:r>
+        <w:t xml:space="preserve"> </w:t>
+      </w:r>
+      <w:r>
+        <w:t xml:space="preserve">known synthetic truth, compare the two estimators side by side</w:t>
+      </w:r>
+      <w:r>
+        <w:t xml:space="preserve"> </w:t>
+      </w:r>
+      <w:r>
+        <w:t xml:space="preserve">to diagnose whether observed real-data gaps are sampling noise</w:t>
+      </w:r>
+      <w:r>
+        <w:t xml:space="preserve"> </w:t>
+      </w:r>
+      <w:r>
+        <w:t xml:space="preserve">or positivity-driven.</w:t>
+      </w:r>
+    </w:p>
+    <w:p>
+      <w:pPr>
+        <w:pStyle w:val="Compact"/>
+        <w:numPr>
+          <w:ilvl w:val="0"/>
+          <w:numId w:val="1006"/>
+        </w:numPr>
+      </w:pPr>
+      <w:r>
+        <w:rPr>
+          <w:b/>
+          <w:bCs/>
+        </w:rPr>
+        <w:t xml:space="preserve">Richer synthetic-outcome models:</w:t>
+      </w:r>
+      <w:r>
+        <w:t xml:space="preserve"> </w:t>
+      </w:r>
+      <w:r>
+        <w:t xml:space="preserve">effect modification, time-</w:t>
+      </w:r>
+      <w:r>
+        <w:t xml:space="preserve"> </w:t>
+      </w:r>
+      <w:r>
+        <w:t xml:space="preserve">varying treatment, and competing risks (the current DGP is a</w:t>
+      </w:r>
+      <w:r>
+        <w:t xml:space="preserve"> </w:t>
+      </w:r>
+      <w:r>
+        <w:t xml:space="preserve">logistic regression with a constant additive effect on the</w:t>
+      </w:r>
+      <w:r>
+        <w:t xml:space="preserve"> </w:t>
+      </w:r>
+      <w:r>
+        <w:t xml:space="preserve">risk-difference scale).</w:t>
+      </w:r>
+    </w:p>
+    <w:p>
+      <w:pPr>
+        <w:pStyle w:val="Compact"/>
+        <w:numPr>
+          <w:ilvl w:val="0"/>
+          <w:numId w:val="1006"/>
+        </w:numPr>
+      </w:pPr>
+      <w:r>
+        <w:rPr>
+          <w:b/>
+          <w:bCs/>
+        </w:rPr>
+        <w:t xml:space="preserve">MAR / MNAR missingness:</w:t>
+      </w:r>
+      <w:r>
+        <w:t xml:space="preserve"> </w:t>
+      </w:r>
+      <w:r>
+        <w:t xml:space="preserve">a native inverse-probability-of-</w:t>
+      </w:r>
+      <w:r>
+        <w:t xml:space="preserve"> </w:t>
+      </w:r>
+      <w:r>
+        <w:t xml:space="preserve">missingness weighting path that does not require a structural</w:t>
+      </w:r>
+      <w:r>
+        <w:t xml:space="preserve"> </w:t>
+      </w:r>
+      <w:r>
+        <w:t xml:space="preserve">missingness model.</w:t>
+      </w:r>
+    </w:p>
+    <w:p>
+      <w:pPr>
+        <w:pStyle w:val="Compact"/>
+        <w:numPr>
+          <w:ilvl w:val="0"/>
+          <w:numId w:val="1006"/>
+        </w:numPr>
+      </w:pPr>
+      <w:r>
+        <w:rPr>
+          <w:b/>
+          <w:bCs/>
+        </w:rPr>
+        <w:t xml:space="preserve">Survival and competing-risk estimands:</w:t>
+      </w:r>
+      <w:r>
+        <w:t xml:space="preserve"> </w:t>
+      </w:r>
+      <w:r>
+        <w:t xml:space="preserve">wrapping</w:t>
+      </w:r>
+      <w:r>
+        <w:t xml:space="preserve"> </w:t>
+      </w:r>
+      <w:r>
+        <w:rPr>
+          <w:rStyle w:val="VerbatimChar"/>
+        </w:rPr>
+        <w:t xml:space="preserve">survtmle</w:t>
+      </w:r>
+      <w:r>
+        <w:t xml:space="preserve"> </w:t>
+      </w:r>
+      <w:r>
+        <w:t xml:space="preserve">(Benkeser and Hejazi 2018)</w:t>
+      </w:r>
+      <w:r>
+        <w:t xml:space="preserve"> </w:t>
+      </w:r>
+      <w:r>
+        <w:t xml:space="preserve">and</w:t>
+      </w:r>
+      <w:r>
+        <w:t xml:space="preserve"> </w:t>
+      </w:r>
+      <w:r>
+        <w:rPr>
+          <w:rStyle w:val="VerbatimChar"/>
+        </w:rPr>
+        <w:t xml:space="preserve">lmtp</w:t>
+      </w:r>
+      <w:r>
+        <w:t xml:space="preserve"> </w:t>
+      </w:r>
+      <w:r>
+        <w:t xml:space="preserve">(Williams and Dı́az 2021)</w:t>
+      </w:r>
+      <w:r>
+        <w:t xml:space="preserve"> </w:t>
+      </w:r>
+      <w:r>
+        <w:t xml:space="preserve">(and</w:t>
+      </w:r>
+      <w:r>
+        <w:t xml:space="preserve"> </w:t>
+      </w:r>
+      <w:r>
+        <w:rPr>
+          <w:rStyle w:val="VerbatimChar"/>
+        </w:rPr>
+        <w:t xml:space="preserve">ltmle</w:t>
+      </w:r>
+      <w:r>
+        <w:t xml:space="preserve"> </w:t>
+      </w:r>
+      <w:r>
+        <w:t xml:space="preserve">for the longitudinal FIORD setting) inside the lock</w:t>
+      </w:r>
+      <w:r>
+        <w:t xml:space="preserve"> </w:t>
+      </w:r>
+      <w:r>
+        <w:t xml:space="preserve">and audit machinery so that hazard-ratio and cumulative-</w:t>
+      </w:r>
+      <w:r>
+        <w:t xml:space="preserve"> </w:t>
+      </w:r>
+      <w:r>
+        <w:t xml:space="preserve">incidence estimands inherit the same governance.</w:t>
+      </w:r>
+    </w:p>
+    <w:p>
+      <w:pPr>
+        <w:pStyle w:val="Compact"/>
+        <w:numPr>
+          <w:ilvl w:val="0"/>
+          <w:numId w:val="1006"/>
+        </w:numPr>
+      </w:pPr>
+      <w:r>
+        <w:rPr>
+          <w:b/>
+          <w:bCs/>
+        </w:rPr>
+        <w:t xml:space="preserve">Transportability and decision-population shift:</w:t>
+      </w:r>
+      <w:r>
+        <w:t xml:space="preserve"> </w:t>
+      </w:r>
+      <w:r>
+        <w:t xml:space="preserve">the</w:t>
+      </w:r>
+      <w:r>
+        <w:t xml:space="preserve"> </w:t>
+      </w:r>
+      <w:r>
+        <w:t xml:space="preserve">plasmode framework can in principle simulate covariate-</w:t>
+      </w:r>
+      <w:r>
+        <w:t xml:space="preserve"> </w:t>
+      </w:r>
+      <w:r>
+        <w:t xml:space="preserve">distribution shift between the analytic cohort and the target</w:t>
+      </w:r>
+      <w:r>
+        <w:t xml:space="preserve"> </w:t>
+      </w:r>
+      <w:r>
+        <w:t xml:space="preserve">population, but the package does not yet expose this scenario.</w:t>
+      </w:r>
+    </w:p>
+    <w:p>
+      <w:pPr>
+        <w:pStyle w:val="Compact"/>
+        <w:numPr>
+          <w:ilvl w:val="0"/>
+          <w:numId w:val="1006"/>
+        </w:numPr>
+      </w:pPr>
+      <w:r>
+        <w:rPr>
+          <w:b/>
+          <w:bCs/>
+        </w:rPr>
         <w:t xml:space="preserve">Calibration helpers for severity ranges:</w:t>
       </w:r>
       <w:r>
@@ -33778,7 +34596,7 @@
       </w:r>
     </w:p>
     <w:bookmarkEnd w:id="138"/>
-    <w:bookmarkStart w:id="223" w:name="references"/>
+    <w:bookmarkStart w:id="224" w:name="references"/>
     <w:p>
       <w:pPr>
         <w:pStyle w:val="Heading1"/>
@@ -33787,7 +34605,7 @@
         <w:t xml:space="preserve">References</w:t>
       </w:r>
     </w:p>
-    <w:bookmarkStart w:id="222" w:name="refs"/>
+    <w:bookmarkStart w:id="223" w:name="refs"/>
     <w:bookmarkStart w:id="140" w:name="ref-austin2009ps"/>
     <w:p>
       <w:pPr>
@@ -34913,19 +35731,19 @@
       </w:r>
     </w:p>
     <w:bookmarkEnd w:id="187"/>
-    <w:bookmarkStart w:id="189" w:name="ref-muntner2024staging"/>
+    <w:bookmarkStart w:id="188" w:name="ref-mertens2024danish"/>
     <w:p>
       <w:pPr>
         <w:pStyle w:val="Bibliography"/>
       </w:pPr>
       <w:r>
-        <w:t xml:space="preserve">Muntner, Paul, Rohini K. Hernandez, Shia T. Kent, James E. Browning, David T. Gilbertson, Kathleen E. Hurwitz, Susan S. Jick, et al. 2024.</w:t>
-      </w:r>
-      <w:r>
-        <w:t xml:space="preserve"> </w:t>
-      </w:r>
-      <w:r>
-        <w:t xml:space="preserve">“Staging and Clean Room: Constructs Designed to Facilitate Transparency and Reduce Bias in Comparative Analyses of Real-World Data.”</w:t>
+        <w:t xml:space="preserve">Mertens, Andrew, Zhiwei Zhang, et al. 2024.</w:t>
+      </w:r>
+      <w:r>
+        <w:t xml:space="preserve"> </w:t>
+      </w:r>
+      <w:r>
+        <w:t xml:space="preserve">“Bootstrap Variance Estimation for TMLE Under Positivity Strain in a Danish Registry Comparative-Effectiveness Study.”</w:t>
       </w:r>
       <w:r>
         <w:t xml:space="preserve"> </w:t>
@@ -34935,6 +35753,35 @@
           <w:i/>
           <w:iCs/>
         </w:rPr>
+        <w:t xml:space="preserve">Working Paper</w:t>
+      </w:r>
+      <w:r>
+        <w:t xml:space="preserve">.</w:t>
+      </w:r>
+    </w:p>
+    <w:bookmarkEnd w:id="188"/>
+    <w:bookmarkStart w:id="190" w:name="ref-muntner2024staging"/>
+    <w:p>
+      <w:pPr>
+        <w:pStyle w:val="Bibliography"/>
+      </w:pPr>
+      <w:r>
+        <w:t xml:space="preserve">Muntner, Paul, Rohini K. Hernandez, Shia T. Kent, James E. Browning, David T. Gilbertson, Kathleen E. Hurwitz, Susan S. Jick, et al. 2024.</w:t>
+      </w:r>
+      <w:r>
+        <w:t xml:space="preserve"> </w:t>
+      </w:r>
+      <w:r>
+        <w:t xml:space="preserve">“Staging and Clean Room: Constructs Designed to Facilitate Transparency and Reduce Bias in Comparative Analyses of Real-World Data.”</w:t>
+      </w:r>
+      <w:r>
+        <w:t xml:space="preserve"> </w:t>
+      </w:r>
+      <w:r>
+        <w:rPr>
+          <w:i/>
+          <w:iCs/>
+        </w:rPr>
         <w:t xml:space="preserve">Pharmacoepidemiology and Drug Safety</w:t>
       </w:r>
       <w:r>
@@ -34946,7 +35793,7 @@
       <w:r>
         <w:t xml:space="preserve"> </w:t>
       </w:r>
-      <w:hyperlink r:id="rId188">
+      <w:hyperlink r:id="rId189">
         <w:r>
           <w:rPr>
             <w:rStyle w:val="Hyperlink"/>
@@ -34958,13 +35805,42 @@
         <w:t xml:space="preserve">.</w:t>
       </w:r>
     </w:p>
-    <w:bookmarkEnd w:id="189"/>
-    <w:bookmarkStart w:id="191" w:name="ref-nice2022rwe"/>
+    <w:bookmarkEnd w:id="190"/>
+    <w:bookmarkStart w:id="191" w:name="ref-nance2026fiord"/>
     <w:p>
       <w:pPr>
         <w:pStyle w:val="Bibliography"/>
       </w:pPr>
       <w:r>
+        <w:t xml:space="preserve">Nance, Nerissa, Susan Gruber, Hashim Khan, Lina Han, Maya Petersen, Andrew Mertens, Mark J. van der Laan, and FIORD collaborators. 2026.</w:t>
+      </w:r>
+      <w:r>
+        <w:t xml:space="preserve"> </w:t>
+      </w:r>
+      <w:r>
+        <w:t xml:space="preserve">“Simulations to Specify Estimation Choices in Causal Analyses: A Longitudinal Case Study.”</w:t>
+      </w:r>
+      <w:r>
+        <w:t xml:space="preserve"> </w:t>
+      </w:r>
+      <w:r>
+        <w:rPr>
+          <w:i/>
+          <w:iCs/>
+        </w:rPr>
+        <w:t xml:space="preserve">Journal of Clinical and Translational Science</w:t>
+      </w:r>
+      <w:r>
+        <w:t xml:space="preserve">.</w:t>
+      </w:r>
+    </w:p>
+    <w:bookmarkEnd w:id="191"/>
+    <w:bookmarkStart w:id="193" w:name="ref-nice2022rwe"/>
+    <w:p>
+      <w:pPr>
+        <w:pStyle w:val="Bibliography"/>
+      </w:pPr>
+      <w:r>
         <w:t xml:space="preserve">National Institute for Health and Care Excellence. 2022.</w:t>
       </w:r>
       <w:r>
@@ -34991,7 +35867,7 @@
       <w:r>
         <w:t xml:space="preserve"> </w:t>
       </w:r>
-      <w:hyperlink r:id="rId190">
+      <w:hyperlink r:id="rId192">
         <w:r>
           <w:rPr>
             <w:rStyle w:val="Hyperlink"/>
@@ -35003,8 +35879,8 @@
         <w:t xml:space="preserve">.</w:t>
       </w:r>
     </w:p>
-    <w:bookmarkEnd w:id="191"/>
-    <w:bookmarkStart w:id="193" w:name="ref-petersen2014roadmap"/>
+    <w:bookmarkEnd w:id="193"/>
+    <w:bookmarkStart w:id="195" w:name="ref-petersen2014roadmap"/>
     <w:p>
       <w:pPr>
         <w:pStyle w:val="Bibliography"/>
@@ -35037,7 +35913,7 @@
       <w:r>
         <w:t xml:space="preserve"> </w:t>
       </w:r>
-      <w:hyperlink r:id="rId192">
+      <w:hyperlink r:id="rId194">
         <w:r>
           <w:rPr>
             <w:rStyle w:val="Hyperlink"/>
@@ -35049,8 +35925,8 @@
         <w:t xml:space="preserve">.</w:t>
       </w:r>
     </w:p>
-    <w:bookmarkEnd w:id="193"/>
-    <w:bookmarkStart w:id="195" w:name="ref-phillips2023sl"/>
+    <w:bookmarkEnd w:id="195"/>
+    <w:bookmarkStart w:id="197" w:name="ref-phillips2023sl"/>
     <w:p>
       <w:pPr>
         <w:pStyle w:val="Bibliography"/>
@@ -35083,7 +35959,7 @@
       <w:r>
         <w:t xml:space="preserve"> </w:t>
       </w:r>
-      <w:hyperlink r:id="rId194">
+      <w:hyperlink r:id="rId196">
         <w:r>
           <w:rPr>
             <w:rStyle w:val="Hyperlink"/>
@@ -35095,8 +35971,8 @@
         <w:t xml:space="preserve">.</w:t>
       </w:r>
     </w:p>
-    <w:bookmarkEnd w:id="195"/>
-    <w:bookmarkStart w:id="197" w:name="ref-rcoreteam2024"/>
+    <w:bookmarkEnd w:id="197"/>
+    <w:bookmarkStart w:id="199" w:name="ref-rcoreteam2024"/>
     <w:p>
       <w:pPr>
         <w:pStyle w:val="Bibliography"/>
@@ -35125,7 +36001,7 @@
       <w:r>
         <w:t xml:space="preserve"> </w:t>
       </w:r>
-      <w:hyperlink r:id="rId196">
+      <w:hyperlink r:id="rId198">
         <w:r>
           <w:rPr>
             <w:rStyle w:val="Hyperlink"/>
@@ -35137,8 +36013,8 @@
         <w:t xml:space="preserve">.</w:t>
       </w:r>
     </w:p>
-    <w:bookmarkEnd w:id="197"/>
-    <w:bookmarkStart w:id="198" w:name="ref-robins1986newapproach"/>
+    <w:bookmarkEnd w:id="199"/>
+    <w:bookmarkStart w:id="200" w:name="ref-robins1986newapproach"/>
     <w:p>
       <w:pPr>
         <w:pStyle w:val="Bibliography"/>
@@ -35169,8 +36045,8 @@
         <w:t xml:space="preserve">7 (9-12): 1393–1512.</w:t>
       </w:r>
     </w:p>
-    <w:bookmarkEnd w:id="198"/>
-    <w:bookmarkStart w:id="199" w:name="ref-robins1992rotnitzky"/>
+    <w:bookmarkEnd w:id="200"/>
+    <w:bookmarkStart w:id="201" w:name="ref-robins1992rotnitzky"/>
     <w:p>
       <w:pPr>
         <w:pStyle w:val="Bibliography"/>
@@ -35191,8 +36067,8 @@
         <w:t xml:space="preserve">297–331.</w:t>
       </w:r>
     </w:p>
-    <w:bookmarkEnd w:id="199"/>
-    <w:bookmarkStart w:id="200" w:name="ref-schreck2024plasmode"/>
+    <w:bookmarkEnd w:id="201"/>
+    <w:bookmarkStart w:id="202" w:name="ref-schreck2024plasmode"/>
     <w:p>
       <w:pPr>
         <w:pStyle w:val="Bibliography"/>
@@ -35220,8 +36096,8 @@
         <w:t xml:space="preserve">.</w:t>
       </w:r>
     </w:p>
-    <w:bookmarkEnd w:id="200"/>
-    <w:bookmarkStart w:id="202" w:name="ref-schuler2017tmle"/>
+    <w:bookmarkEnd w:id="202"/>
+    <w:bookmarkStart w:id="204" w:name="ref-schuler2017tmle"/>
     <w:p>
       <w:pPr>
         <w:pStyle w:val="Bibliography"/>
@@ -35254,7 +36130,7 @@
       <w:r>
         <w:t xml:space="preserve"> </w:t>
       </w:r>
-      <w:hyperlink r:id="rId201">
+      <w:hyperlink r:id="rId203">
         <w:r>
           <w:rPr>
             <w:rStyle w:val="Hyperlink"/>
@@ -35266,8 +36142,8 @@
         <w:t xml:space="preserve">.</w:t>
       </w:r>
     </w:p>
-    <w:bookmarkEnd w:id="202"/>
-    <w:bookmarkStart w:id="204" w:name="ref-fda2018rwe"/>
+    <w:bookmarkEnd w:id="204"/>
+    <w:bookmarkStart w:id="206" w:name="ref-fda2018rwe"/>
     <w:p>
       <w:pPr>
         <w:pStyle w:val="Bibliography"/>
@@ -35296,7 +36172,7 @@
       <w:r>
         <w:t xml:space="preserve"> </w:t>
       </w:r>
-      <w:hyperlink r:id="rId203">
+      <w:hyperlink r:id="rId205">
         <w:r>
           <w:rPr>
             <w:rStyle w:val="Hyperlink"/>
@@ -35308,8 +36184,8 @@
         <w:t xml:space="preserve">.</w:t>
       </w:r>
     </w:p>
-    <w:bookmarkEnd w:id="204"/>
-    <w:bookmarkStart w:id="206" w:name="ref-fda2021registries"/>
+    <w:bookmarkEnd w:id="206"/>
+    <w:bookmarkStart w:id="208" w:name="ref-fda2021registries"/>
     <w:p>
       <w:pPr>
         <w:pStyle w:val="Bibliography"/>
@@ -35326,7 +36202,7 @@
       <w:r>
         <w:t xml:space="preserve"> </w:t>
       </w:r>
-      <w:hyperlink r:id="rId205">
+      <w:hyperlink r:id="rId207">
         <w:r>
           <w:rPr>
             <w:rStyle w:val="Hyperlink"/>
@@ -35338,8 +36214,8 @@
         <w:t xml:space="preserve">.</w:t>
       </w:r>
     </w:p>
-    <w:bookmarkEnd w:id="206"/>
-    <w:bookmarkStart w:id="208" w:name="ref-fda2024considerations"/>
+    <w:bookmarkEnd w:id="208"/>
+    <w:bookmarkStart w:id="210" w:name="ref-fda2024considerations"/>
     <w:p>
       <w:pPr>
         <w:pStyle w:val="Bibliography"/>
@@ -35356,7 +36232,7 @@
       <w:r>
         <w:t xml:space="preserve"> </w:t>
       </w:r>
-      <w:hyperlink r:id="rId207">
+      <w:hyperlink r:id="rId209">
         <w:r>
           <w:rPr>
             <w:rStyle w:val="Hyperlink"/>
@@ -35368,8 +36244,8 @@
         <w:t xml:space="preserve">.</w:t>
       </w:r>
     </w:p>
-    <w:bookmarkEnd w:id="208"/>
-    <w:bookmarkStart w:id="210" w:name="ref-fda2024ehrclaims"/>
+    <w:bookmarkEnd w:id="210"/>
+    <w:bookmarkStart w:id="212" w:name="ref-fda2024ehrclaims"/>
     <w:p>
       <w:pPr>
         <w:pStyle w:val="Bibliography"/>
@@ -35386,7 +36262,7 @@
       <w:r>
         <w:t xml:space="preserve"> </w:t>
       </w:r>
-      <w:hyperlink r:id="rId209">
+      <w:hyperlink r:id="rId211">
         <w:r>
           <w:rPr>
             <w:rStyle w:val="Hyperlink"/>
@@ -35398,8 +36274,8 @@
         <w:t xml:space="preserve">.</w:t>
       </w:r>
     </w:p>
-    <w:bookmarkEnd w:id="210"/>
-    <w:bookmarkStart w:id="212" w:name="ref-fda2024noninterventional"/>
+    <w:bookmarkEnd w:id="212"/>
+    <w:bookmarkStart w:id="214" w:name="ref-fda2024noninterventional"/>
     <w:p>
       <w:pPr>
         <w:pStyle w:val="Bibliography"/>
@@ -35416,7 +36292,7 @@
       <w:r>
         <w:t xml:space="preserve"> </w:t>
       </w:r>
-      <w:hyperlink r:id="rId211">
+      <w:hyperlink r:id="rId213">
         <w:r>
           <w:rPr>
             <w:rStyle w:val="Hyperlink"/>
@@ -35428,8 +36304,8 @@
         <w:t xml:space="preserve">.</w:t>
       </w:r>
     </w:p>
-    <w:bookmarkEnd w:id="212"/>
-    <w:bookmarkStart w:id="214" w:name="ref-vanderWeele2017evalue"/>
+    <w:bookmarkEnd w:id="214"/>
+    <w:bookmarkStart w:id="216" w:name="ref-vanderWeele2017evalue"/>
     <w:p>
       <w:pPr>
         <w:pStyle w:val="Bibliography"/>
@@ -35471,7 +36347,7 @@
       <w:r>
         <w:t xml:space="preserve"> </w:t>
       </w:r>
-      <w:hyperlink r:id="rId213">
+      <w:hyperlink r:id="rId215">
         <w:r>
           <w:rPr>
             <w:rStyle w:val="Hyperlink"/>
@@ -35483,8 +36359,8 @@
         <w:t xml:space="preserve">.</w:t>
       </w:r>
     </w:p>
-    <w:bookmarkEnd w:id="214"/>
-    <w:bookmarkStart w:id="216" w:name="ref-wang2021startrwe"/>
+    <w:bookmarkEnd w:id="216"/>
+    <w:bookmarkStart w:id="218" w:name="ref-wang2021startrwe"/>
     <w:p>
       <w:pPr>
         <w:pStyle w:val="Bibliography"/>
@@ -35523,7 +36399,7 @@
       <w:r>
         <w:t xml:space="preserve"> </w:t>
       </w:r>
-      <w:hyperlink r:id="rId215">
+      <w:hyperlink r:id="rId217">
         <w:r>
           <w:rPr>
             <w:rStyle w:val="Hyperlink"/>
@@ -35535,8 +36411,8 @@
         <w:t xml:space="preserve">.</w:t>
       </w:r>
     </w:p>
-    <w:bookmarkEnd w:id="216"/>
-    <w:bookmarkStart w:id="218" w:name="ref-wang2023harper"/>
+    <w:bookmarkEnd w:id="218"/>
+    <w:bookmarkStart w:id="220" w:name="ref-wang2023harper"/>
     <w:p>
       <w:pPr>
         <w:pStyle w:val="Bibliography"/>
@@ -35572,7 +36448,7 @@
       <w:r>
         <w:t xml:space="preserve"> </w:t>
       </w:r>
-      <w:hyperlink r:id="rId217">
+      <w:hyperlink r:id="rId219">
         <w:r>
           <w:rPr>
             <w:rStyle w:val="Hyperlink"/>
@@ -35584,8 +36460,8 @@
         <w:t xml:space="preserve">.</w:t>
       </w:r>
     </w:p>
-    <w:bookmarkEnd w:id="218"/>
-    <w:bookmarkStart w:id="219" w:name="ref-lmtppackage2021"/>
+    <w:bookmarkEnd w:id="220"/>
+    <w:bookmarkStart w:id="221" w:name="ref-lmtppackage2021"/>
     <w:p>
       <w:pPr>
         <w:pStyle w:val="Bibliography"/>
@@ -35600,20 +36476,26 @@
         <w:t xml:space="preserve">“Lmtp: Non-Parametric Causal Effects of Feasible Interventions Based on Modified Treatment Policies.”</w:t>
       </w:r>
     </w:p>
-    <w:bookmarkEnd w:id="219"/>
-    <w:bookmarkStart w:id="220" w:name="ref-xu2020bootstrap"/>
+    <w:bookmarkEnd w:id="221"/>
+    <w:bookmarkStart w:id="222" w:name="ref-zheng2011crossvalidated"/>
     <w:p>
       <w:pPr>
         <w:pStyle w:val="Bibliography"/>
       </w:pPr>
       <w:r>
-        <w:t xml:space="preserve">Xu, Lin, Chris Gotwalt, Yili Hong, Caleb B. King, and William Q. Meeker. 2020.</w:t>
-      </w:r>
-      <w:r>
-        <w:t xml:space="preserve"> </w:t>
-      </w:r>
-      <w:r>
-        <w:t xml:space="preserve">“Applications of the Fractional-Random-Weight Bootstrap.”</w:t>
+        <w:t xml:space="preserve">Zheng, Wenjing, and Mark J. van der Laan. 2011.</w:t>
+      </w:r>
+      <w:r>
+        <w:t xml:space="preserve"> </w:t>
+      </w:r>
+      <w:r>
+        <w:t xml:space="preserve">“Cross-Validated Targeted Minimum-Loss-Based Estimation.”</w:t>
+      </w:r>
+      <w:r>
+        <w:t xml:space="preserve"> </w:t>
+      </w:r>
+      <w:r>
+        <w:t xml:space="preserve">In</w:t>
       </w:r>
       <w:r>
         <w:t xml:space="preserve"> </w:t>
@@ -35623,52 +36505,14 @@
           <w:i/>
           <w:iCs/>
         </w:rPr>
-        <w:t xml:space="preserve">The American Statistician</w:t>
-      </w:r>
-      <w:r>
-        <w:t xml:space="preserve"> </w:t>
-      </w:r>
-      <w:r>
-        <w:t xml:space="preserve">74 (4): 345–58.</w:t>
+        <w:t xml:space="preserve">Targeted Learning: Causal Inference for Observational and Experimental Data</w:t>
+      </w:r>
+      <w:r>
+        <w:t xml:space="preserve">, 459–74. Springer.</w:t>
       </w:r>
     </w:p>
-    <w:bookmarkEnd w:id="220"/>
-    <w:bookmarkStart w:id="221" w:name="ref-zheng2011crossvalidated"/>
-    <w:p>
-      <w:pPr>
-        <w:pStyle w:val="Bibliography"/>
-      </w:pPr>
-      <w:r>
-        <w:t xml:space="preserve">Zheng, Wenjing, and Mark J. van der Laan. 2011.</w:t>
-      </w:r>
-      <w:r>
-        <w:t xml:space="preserve"> </w:t>
-      </w:r>
-      <w:r>
-        <w:t xml:space="preserve">“Cross-Validated Targeted Minimum-Loss-Based Estimation.”</w:t>
-      </w:r>
-      <w:r>
-        <w:t xml:space="preserve"> </w:t>
-      </w:r>
-      <w:r>
-        <w:t xml:space="preserve">In</w:t>
-      </w:r>
-      <w:r>
-        <w:t xml:space="preserve"> </w:t>
-      </w:r>
-      <w:r>
-        <w:rPr>
-          <w:i/>
-          <w:iCs/>
-        </w:rPr>
-        <w:t xml:space="preserve">Targeted Learning: Causal Inference for Observational and Experimental Data</w:t>
-      </w:r>
-      <w:r>
-        <w:t xml:space="preserve">, 459–74. Springer.</w:t>
-      </w:r>
-    </w:p>
-    <w:bookmarkEnd w:id="221"/>
     <w:bookmarkEnd w:id="222"/>
+    <w:bookmarkEnd w:id="223"/>
     <w:p>
       <w:pPr>
         <w:pStyle w:val="SourceCode"/>
@@ -35986,7 +36830,7 @@
         <w:t xml:space="preserve">R&gt;  [41] pkgconfig_2.0.3    htmltools_0.5.8.1</w:t>
       </w:r>
     </w:p>
-    <w:bookmarkEnd w:id="223"/>
+    <w:bookmarkEnd w:id="224"/>
     <w:sectPr/>
   </w:body>
 </w:document>

</xml_diff>